<commit_message>
New theme styling and other fixes including color picker
</commit_message>
<xml_diff>
--- a/Room_Config_Builder_Guide.docx
+++ b/Room_Config_Builder_Guide.docx
@@ -116,11 +116,7 @@
           </w:pPr>
           <w:r>
             <w:fldChar w:fldCharType="begin"/>
-          </w:r>
-          <w:r>
             <w:instrText>TOC \h \o "1-2"</w:instrText>
-          </w:r>
-          <w:r>
             <w:fldChar w:fldCharType="separate"/>
           </w:r>
           <w:hyperlink w:anchor="_Toc234507103" w:history="1">
@@ -136,40 +132,10 @@
                 <w:noProof/>
               </w:rPr>
               <w:tab/>
-            </w:r>
-            <w:r>
-              <w:rPr>
-                <w:noProof/>
-              </w:rPr>
               <w:fldChar w:fldCharType="begin"/>
-            </w:r>
-            <w:r>
-              <w:rPr>
-                <w:noProof/>
-              </w:rPr>
               <w:instrText xml:space="preserve"> PAGEREF _Toc234507103 \h </w:instrText>
-            </w:r>
-            <w:r>
-              <w:rPr>
-                <w:noProof/>
-              </w:rPr>
-            </w:r>
-            <w:r>
-              <w:rPr>
-                <w:noProof/>
-              </w:rPr>
               <w:fldChar w:fldCharType="separate"/>
-            </w:r>
-            <w:r>
-              <w:rPr>
-                <w:noProof/>
-              </w:rPr>
               <w:t>1</w:t>
-            </w:r>
-            <w:r>
-              <w:rPr>
-                <w:noProof/>
-              </w:rPr>
               <w:fldChar w:fldCharType="end"/>
             </w:r>
           </w:hyperlink>
@@ -197,40 +163,10 @@
                 <w:noProof/>
               </w:rPr>
               <w:tab/>
-            </w:r>
-            <w:r>
-              <w:rPr>
-                <w:noProof/>
-              </w:rPr>
               <w:fldChar w:fldCharType="begin"/>
-            </w:r>
-            <w:r>
-              <w:rPr>
-                <w:noProof/>
-              </w:rPr>
               <w:instrText xml:space="preserve"> PAGEREF _Toc234507104 \h </w:instrText>
-            </w:r>
-            <w:r>
-              <w:rPr>
-                <w:noProof/>
-              </w:rPr>
-            </w:r>
-            <w:r>
-              <w:rPr>
-                <w:noProof/>
-              </w:rPr>
               <w:fldChar w:fldCharType="separate"/>
-            </w:r>
-            <w:r>
-              <w:rPr>
-                <w:noProof/>
-              </w:rPr>
               <w:t>1</w:t>
-            </w:r>
-            <w:r>
-              <w:rPr>
-                <w:noProof/>
-              </w:rPr>
               <w:fldChar w:fldCharType="end"/>
             </w:r>
           </w:hyperlink>
@@ -258,40 +194,10 @@
                 <w:noProof/>
               </w:rPr>
               <w:tab/>
-            </w:r>
-            <w:r>
-              <w:rPr>
-                <w:noProof/>
-              </w:rPr>
               <w:fldChar w:fldCharType="begin"/>
-            </w:r>
-            <w:r>
-              <w:rPr>
-                <w:noProof/>
-              </w:rPr>
               <w:instrText xml:space="preserve"> PAGEREF _Toc234507105 \h </w:instrText>
-            </w:r>
-            <w:r>
-              <w:rPr>
-                <w:noProof/>
-              </w:rPr>
-            </w:r>
-            <w:r>
-              <w:rPr>
-                <w:noProof/>
-              </w:rPr>
               <w:fldChar w:fldCharType="separate"/>
-            </w:r>
-            <w:r>
-              <w:rPr>
-                <w:noProof/>
-              </w:rPr>
               <w:t>1</w:t>
-            </w:r>
-            <w:r>
-              <w:rPr>
-                <w:noProof/>
-              </w:rPr>
               <w:fldChar w:fldCharType="end"/>
             </w:r>
           </w:hyperlink>
@@ -319,40 +225,10 @@
                 <w:noProof/>
               </w:rPr>
               <w:tab/>
-            </w:r>
-            <w:r>
-              <w:rPr>
-                <w:noProof/>
-              </w:rPr>
               <w:fldChar w:fldCharType="begin"/>
-            </w:r>
-            <w:r>
-              <w:rPr>
-                <w:noProof/>
-              </w:rPr>
               <w:instrText xml:space="preserve"> PAGEREF _Toc234507106 \h </w:instrText>
-            </w:r>
-            <w:r>
-              <w:rPr>
-                <w:noProof/>
-              </w:rPr>
-            </w:r>
-            <w:r>
-              <w:rPr>
-                <w:noProof/>
-              </w:rPr>
               <w:fldChar w:fldCharType="separate"/>
-            </w:r>
-            <w:r>
-              <w:rPr>
-                <w:noProof/>
-              </w:rPr>
               <w:t>1</w:t>
-            </w:r>
-            <w:r>
-              <w:rPr>
-                <w:noProof/>
-              </w:rPr>
               <w:fldChar w:fldCharType="end"/>
             </w:r>
           </w:hyperlink>
@@ -380,40 +256,10 @@
                 <w:noProof/>
               </w:rPr>
               <w:tab/>
-            </w:r>
-            <w:r>
-              <w:rPr>
-                <w:noProof/>
-              </w:rPr>
               <w:fldChar w:fldCharType="begin"/>
-            </w:r>
-            <w:r>
-              <w:rPr>
-                <w:noProof/>
-              </w:rPr>
               <w:instrText xml:space="preserve"> PAGEREF _Toc234507107 \h </w:instrText>
-            </w:r>
-            <w:r>
-              <w:rPr>
-                <w:noProof/>
-              </w:rPr>
-            </w:r>
-            <w:r>
-              <w:rPr>
-                <w:noProof/>
-              </w:rPr>
               <w:fldChar w:fldCharType="separate"/>
-            </w:r>
-            <w:r>
-              <w:rPr>
-                <w:noProof/>
-              </w:rPr>
               <w:t>1</w:t>
-            </w:r>
-            <w:r>
-              <w:rPr>
-                <w:noProof/>
-              </w:rPr>
               <w:fldChar w:fldCharType="end"/>
             </w:r>
           </w:hyperlink>
@@ -441,40 +287,10 @@
                 <w:noProof/>
               </w:rPr>
               <w:tab/>
-            </w:r>
-            <w:r>
-              <w:rPr>
-                <w:noProof/>
-              </w:rPr>
               <w:fldChar w:fldCharType="begin"/>
-            </w:r>
-            <w:r>
-              <w:rPr>
-                <w:noProof/>
-              </w:rPr>
               <w:instrText xml:space="preserve"> PAGEREF _Toc234507108 \h </w:instrText>
-            </w:r>
-            <w:r>
-              <w:rPr>
-                <w:noProof/>
-              </w:rPr>
-            </w:r>
-            <w:r>
-              <w:rPr>
-                <w:noProof/>
-              </w:rPr>
               <w:fldChar w:fldCharType="separate"/>
-            </w:r>
-            <w:r>
-              <w:rPr>
-                <w:noProof/>
-              </w:rPr>
               <w:t>1</w:t>
-            </w:r>
-            <w:r>
-              <w:rPr>
-                <w:noProof/>
-              </w:rPr>
               <w:fldChar w:fldCharType="end"/>
             </w:r>
           </w:hyperlink>
@@ -502,40 +318,10 @@
                 <w:noProof/>
               </w:rPr>
               <w:tab/>
-            </w:r>
-            <w:r>
-              <w:rPr>
-                <w:noProof/>
-              </w:rPr>
               <w:fldChar w:fldCharType="begin"/>
-            </w:r>
-            <w:r>
-              <w:rPr>
-                <w:noProof/>
-              </w:rPr>
               <w:instrText xml:space="preserve"> PAGEREF _Toc234507109 \h </w:instrText>
-            </w:r>
-            <w:r>
-              <w:rPr>
-                <w:noProof/>
-              </w:rPr>
-            </w:r>
-            <w:r>
-              <w:rPr>
-                <w:noProof/>
-              </w:rPr>
               <w:fldChar w:fldCharType="separate"/>
-            </w:r>
-            <w:r>
-              <w:rPr>
-                <w:noProof/>
-              </w:rPr>
               <w:t>1</w:t>
-            </w:r>
-            <w:r>
-              <w:rPr>
-                <w:noProof/>
-              </w:rPr>
               <w:fldChar w:fldCharType="end"/>
             </w:r>
           </w:hyperlink>
@@ -563,40 +349,10 @@
                 <w:noProof/>
               </w:rPr>
               <w:tab/>
-            </w:r>
-            <w:r>
-              <w:rPr>
-                <w:noProof/>
-              </w:rPr>
               <w:fldChar w:fldCharType="begin"/>
-            </w:r>
-            <w:r>
-              <w:rPr>
-                <w:noProof/>
-              </w:rPr>
               <w:instrText xml:space="preserve"> PAGEREF _Toc234507110 \h </w:instrText>
-            </w:r>
-            <w:r>
-              <w:rPr>
-                <w:noProof/>
-              </w:rPr>
-            </w:r>
-            <w:r>
-              <w:rPr>
-                <w:noProof/>
-              </w:rPr>
               <w:fldChar w:fldCharType="separate"/>
-            </w:r>
-            <w:r>
-              <w:rPr>
-                <w:noProof/>
-              </w:rPr>
               <w:t>1</w:t>
-            </w:r>
-            <w:r>
-              <w:rPr>
-                <w:noProof/>
-              </w:rPr>
               <w:fldChar w:fldCharType="end"/>
             </w:r>
           </w:hyperlink>
@@ -624,40 +380,10 @@
                 <w:noProof/>
               </w:rPr>
               <w:tab/>
-            </w:r>
-            <w:r>
-              <w:rPr>
-                <w:noProof/>
-              </w:rPr>
               <w:fldChar w:fldCharType="begin"/>
-            </w:r>
-            <w:r>
-              <w:rPr>
-                <w:noProof/>
-              </w:rPr>
               <w:instrText xml:space="preserve"> PAGEREF _Toc234507111 \h </w:instrText>
-            </w:r>
-            <w:r>
-              <w:rPr>
-                <w:noProof/>
-              </w:rPr>
-            </w:r>
-            <w:r>
-              <w:rPr>
-                <w:noProof/>
-              </w:rPr>
               <w:fldChar w:fldCharType="separate"/>
-            </w:r>
-            <w:r>
-              <w:rPr>
-                <w:noProof/>
-              </w:rPr>
               <w:t>1</w:t>
-            </w:r>
-            <w:r>
-              <w:rPr>
-                <w:noProof/>
-              </w:rPr>
               <w:fldChar w:fldCharType="end"/>
             </w:r>
           </w:hyperlink>
@@ -685,40 +411,10 @@
                 <w:noProof/>
               </w:rPr>
               <w:tab/>
-            </w:r>
-            <w:r>
-              <w:rPr>
-                <w:noProof/>
-              </w:rPr>
               <w:fldChar w:fldCharType="begin"/>
-            </w:r>
-            <w:r>
-              <w:rPr>
-                <w:noProof/>
-              </w:rPr>
               <w:instrText xml:space="preserve"> PAGEREF _Toc234507112 \h </w:instrText>
-            </w:r>
-            <w:r>
-              <w:rPr>
-                <w:noProof/>
-              </w:rPr>
-            </w:r>
-            <w:r>
-              <w:rPr>
-                <w:noProof/>
-              </w:rPr>
               <w:fldChar w:fldCharType="separate"/>
-            </w:r>
-            <w:r>
-              <w:rPr>
-                <w:noProof/>
-              </w:rPr>
               <w:t>1</w:t>
-            </w:r>
-            <w:r>
-              <w:rPr>
-                <w:noProof/>
-              </w:rPr>
               <w:fldChar w:fldCharType="end"/>
             </w:r>
           </w:hyperlink>
@@ -746,40 +442,10 @@
                 <w:noProof/>
               </w:rPr>
               <w:tab/>
-            </w:r>
-            <w:r>
-              <w:rPr>
-                <w:noProof/>
-              </w:rPr>
               <w:fldChar w:fldCharType="begin"/>
-            </w:r>
-            <w:r>
-              <w:rPr>
-                <w:noProof/>
-              </w:rPr>
               <w:instrText xml:space="preserve"> PAGEREF _Toc234507113 \h </w:instrText>
-            </w:r>
-            <w:r>
-              <w:rPr>
-                <w:noProof/>
-              </w:rPr>
-            </w:r>
-            <w:r>
-              <w:rPr>
-                <w:noProof/>
-              </w:rPr>
               <w:fldChar w:fldCharType="separate"/>
-            </w:r>
-            <w:r>
-              <w:rPr>
-                <w:noProof/>
-              </w:rPr>
               <w:t>1</w:t>
-            </w:r>
-            <w:r>
-              <w:rPr>
-                <w:noProof/>
-              </w:rPr>
               <w:fldChar w:fldCharType="end"/>
             </w:r>
           </w:hyperlink>
@@ -807,40 +473,10 @@
                 <w:noProof/>
               </w:rPr>
               <w:tab/>
-            </w:r>
-            <w:r>
-              <w:rPr>
-                <w:noProof/>
-              </w:rPr>
               <w:fldChar w:fldCharType="begin"/>
-            </w:r>
-            <w:r>
-              <w:rPr>
-                <w:noProof/>
-              </w:rPr>
               <w:instrText xml:space="preserve"> PAGEREF _Toc234507114 \h </w:instrText>
-            </w:r>
-            <w:r>
-              <w:rPr>
-                <w:noProof/>
-              </w:rPr>
-            </w:r>
-            <w:r>
-              <w:rPr>
-                <w:noProof/>
-              </w:rPr>
               <w:fldChar w:fldCharType="separate"/>
-            </w:r>
-            <w:r>
-              <w:rPr>
-                <w:noProof/>
-              </w:rPr>
               <w:t>1</w:t>
-            </w:r>
-            <w:r>
-              <w:rPr>
-                <w:noProof/>
-              </w:rPr>
               <w:fldChar w:fldCharType="end"/>
             </w:r>
           </w:hyperlink>
@@ -868,40 +504,10 @@
                 <w:noProof/>
               </w:rPr>
               <w:tab/>
-            </w:r>
-            <w:r>
-              <w:rPr>
-                <w:noProof/>
-              </w:rPr>
               <w:fldChar w:fldCharType="begin"/>
-            </w:r>
-            <w:r>
-              <w:rPr>
-                <w:noProof/>
-              </w:rPr>
               <w:instrText xml:space="preserve"> PAGEREF _Toc234507115 \h </w:instrText>
-            </w:r>
-            <w:r>
-              <w:rPr>
-                <w:noProof/>
-              </w:rPr>
-            </w:r>
-            <w:r>
-              <w:rPr>
-                <w:noProof/>
-              </w:rPr>
               <w:fldChar w:fldCharType="separate"/>
-            </w:r>
-            <w:r>
-              <w:rPr>
-                <w:noProof/>
-              </w:rPr>
               <w:t>1</w:t>
-            </w:r>
-            <w:r>
-              <w:rPr>
-                <w:noProof/>
-              </w:rPr>
               <w:fldChar w:fldCharType="end"/>
             </w:r>
           </w:hyperlink>
@@ -929,40 +535,10 @@
                 <w:noProof/>
               </w:rPr>
               <w:tab/>
-            </w:r>
-            <w:r>
-              <w:rPr>
-                <w:noProof/>
-              </w:rPr>
               <w:fldChar w:fldCharType="begin"/>
-            </w:r>
-            <w:r>
-              <w:rPr>
-                <w:noProof/>
-              </w:rPr>
               <w:instrText xml:space="preserve"> PAGEREF _Toc234507116 \h </w:instrText>
-            </w:r>
-            <w:r>
-              <w:rPr>
-                <w:noProof/>
-              </w:rPr>
-            </w:r>
-            <w:r>
-              <w:rPr>
-                <w:noProof/>
-              </w:rPr>
               <w:fldChar w:fldCharType="separate"/>
-            </w:r>
-            <w:r>
-              <w:rPr>
-                <w:noProof/>
-              </w:rPr>
               <w:t>1</w:t>
-            </w:r>
-            <w:r>
-              <w:rPr>
-                <w:noProof/>
-              </w:rPr>
               <w:fldChar w:fldCharType="end"/>
             </w:r>
           </w:hyperlink>
@@ -990,40 +566,10 @@
                 <w:noProof/>
               </w:rPr>
               <w:tab/>
-            </w:r>
-            <w:r>
-              <w:rPr>
-                <w:noProof/>
-              </w:rPr>
               <w:fldChar w:fldCharType="begin"/>
-            </w:r>
-            <w:r>
-              <w:rPr>
-                <w:noProof/>
-              </w:rPr>
               <w:instrText xml:space="preserve"> PAGEREF _Toc234507117 \h </w:instrText>
-            </w:r>
-            <w:r>
-              <w:rPr>
-                <w:noProof/>
-              </w:rPr>
-            </w:r>
-            <w:r>
-              <w:rPr>
-                <w:noProof/>
-              </w:rPr>
               <w:fldChar w:fldCharType="separate"/>
-            </w:r>
-            <w:r>
-              <w:rPr>
-                <w:noProof/>
-              </w:rPr>
               <w:t>1</w:t>
-            </w:r>
-            <w:r>
-              <w:rPr>
-                <w:noProof/>
-              </w:rPr>
               <w:fldChar w:fldCharType="end"/>
             </w:r>
           </w:hyperlink>
@@ -1051,40 +597,10 @@
                 <w:noProof/>
               </w:rPr>
               <w:tab/>
-            </w:r>
-            <w:r>
-              <w:rPr>
-                <w:noProof/>
-              </w:rPr>
               <w:fldChar w:fldCharType="begin"/>
-            </w:r>
-            <w:r>
-              <w:rPr>
-                <w:noProof/>
-              </w:rPr>
               <w:instrText xml:space="preserve"> PAGEREF _Toc234507118 \h </w:instrText>
-            </w:r>
-            <w:r>
-              <w:rPr>
-                <w:noProof/>
-              </w:rPr>
-            </w:r>
-            <w:r>
-              <w:rPr>
-                <w:noProof/>
-              </w:rPr>
               <w:fldChar w:fldCharType="separate"/>
-            </w:r>
-            <w:r>
-              <w:rPr>
-                <w:noProof/>
-              </w:rPr>
               <w:t>1</w:t>
-            </w:r>
-            <w:r>
-              <w:rPr>
-                <w:noProof/>
-              </w:rPr>
               <w:fldChar w:fldCharType="end"/>
             </w:r>
           </w:hyperlink>
@@ -1112,40 +628,41 @@
                 <w:noProof/>
               </w:rPr>
               <w:tab/>
-            </w:r>
-            <w:r>
-              <w:rPr>
+              <w:fldChar w:fldCharType="begin"/>
+              <w:instrText xml:space="preserve"> PAGEREF _Toc234507119 \h </w:instrText>
+              <w:fldChar w:fldCharType="separate"/>
+              <w:t>1</w:t>
+              <w:fldChar w:fldCharType="end"/>
+            </w:r>
+          </w:hyperlink>
+        </w:p>
+        <w:p>
+          <w:pPr>
+            <w:pStyle w:val="TOC2"/>
+            <w:tabs>
+              <w:tab w:val="right" w:leader="dot" w:pos="9350"/>
+            </w:tabs>
+            <w:rPr>
+              <w:noProof/>
+            </w:rPr>
+          </w:pPr>
+          <w:hyperlink w:anchor="_Toc234507999" w:history="1">
+            <w:r>
+              <w:rPr>
+                <w:rStyle w:val="Hyperlink"/>
                 <w:noProof/>
               </w:rPr>
+              <w:t>3.9 Device-type fields (device_fields)</w:t>
+            </w:r>
+            <w:r>
+              <w:rPr>
+                <w:noProof/>
+              </w:rPr>
+              <w:tab/>
               <w:fldChar w:fldCharType="begin"/>
-            </w:r>
-            <w:r>
-              <w:rPr>
-                <w:noProof/>
-              </w:rPr>
-              <w:instrText xml:space="preserve"> PAGEREF _Toc234507119 \h </w:instrText>
-            </w:r>
-            <w:r>
-              <w:rPr>
-                <w:noProof/>
-              </w:rPr>
-            </w:r>
-            <w:r>
-              <w:rPr>
-                <w:noProof/>
-              </w:rPr>
+              <w:instrText xml:space="preserve"> PAGEREF _Toc234507999 \h </w:instrText>
               <w:fldChar w:fldCharType="separate"/>
-            </w:r>
-            <w:r>
-              <w:rPr>
-                <w:noProof/>
-              </w:rPr>
               <w:t>1</w:t>
-            </w:r>
-            <w:r>
-              <w:rPr>
-                <w:noProof/>
-              </w:rPr>
               <w:fldChar w:fldCharType="end"/>
             </w:r>
           </w:hyperlink>
@@ -1173,40 +690,10 @@
                 <w:noProof/>
               </w:rPr>
               <w:tab/>
-            </w:r>
-            <w:r>
-              <w:rPr>
-                <w:noProof/>
-              </w:rPr>
               <w:fldChar w:fldCharType="begin"/>
-            </w:r>
-            <w:r>
-              <w:rPr>
-                <w:noProof/>
-              </w:rPr>
               <w:instrText xml:space="preserve"> PAGEREF _Toc234507120 \h </w:instrText>
-            </w:r>
-            <w:r>
-              <w:rPr>
-                <w:noProof/>
-              </w:rPr>
-            </w:r>
-            <w:r>
-              <w:rPr>
-                <w:noProof/>
-              </w:rPr>
               <w:fldChar w:fldCharType="separate"/>
-            </w:r>
-            <w:r>
-              <w:rPr>
-                <w:noProof/>
-              </w:rPr>
               <w:t>1</w:t>
-            </w:r>
-            <w:r>
-              <w:rPr>
-                <w:noProof/>
-              </w:rPr>
               <w:fldChar w:fldCharType="end"/>
             </w:r>
           </w:hyperlink>
@@ -1234,40 +721,10 @@
                 <w:noProof/>
               </w:rPr>
               <w:tab/>
-            </w:r>
-            <w:r>
-              <w:rPr>
-                <w:noProof/>
-              </w:rPr>
               <w:fldChar w:fldCharType="begin"/>
-            </w:r>
-            <w:r>
-              <w:rPr>
-                <w:noProof/>
-              </w:rPr>
               <w:instrText xml:space="preserve"> PAGEREF _Toc234507121 \h </w:instrText>
-            </w:r>
-            <w:r>
-              <w:rPr>
-                <w:noProof/>
-              </w:rPr>
-            </w:r>
-            <w:r>
-              <w:rPr>
-                <w:noProof/>
-              </w:rPr>
               <w:fldChar w:fldCharType="separate"/>
-            </w:r>
-            <w:r>
-              <w:rPr>
-                <w:noProof/>
-              </w:rPr>
               <w:t>1</w:t>
-            </w:r>
-            <w:r>
-              <w:rPr>
-                <w:noProof/>
-              </w:rPr>
               <w:fldChar w:fldCharType="end"/>
             </w:r>
           </w:hyperlink>
@@ -1295,40 +752,10 @@
                 <w:noProof/>
               </w:rPr>
               <w:tab/>
-            </w:r>
-            <w:r>
-              <w:rPr>
-                <w:noProof/>
-              </w:rPr>
               <w:fldChar w:fldCharType="begin"/>
-            </w:r>
-            <w:r>
-              <w:rPr>
-                <w:noProof/>
-              </w:rPr>
               <w:instrText xml:space="preserve"> PAGEREF _Toc234507122 \h </w:instrText>
-            </w:r>
-            <w:r>
-              <w:rPr>
-                <w:noProof/>
-              </w:rPr>
-            </w:r>
-            <w:r>
-              <w:rPr>
-                <w:noProof/>
-              </w:rPr>
               <w:fldChar w:fldCharType="separate"/>
-            </w:r>
-            <w:r>
-              <w:rPr>
-                <w:noProof/>
-              </w:rPr>
               <w:t>1</w:t>
-            </w:r>
-            <w:r>
-              <w:rPr>
-                <w:noProof/>
-              </w:rPr>
               <w:fldChar w:fldCharType="end"/>
             </w:r>
           </w:hyperlink>
@@ -1356,40 +783,10 @@
                 <w:noProof/>
               </w:rPr>
               <w:tab/>
-            </w:r>
-            <w:r>
-              <w:rPr>
-                <w:noProof/>
-              </w:rPr>
               <w:fldChar w:fldCharType="begin"/>
-            </w:r>
-            <w:r>
-              <w:rPr>
-                <w:noProof/>
-              </w:rPr>
               <w:instrText xml:space="preserve"> PAGEREF _Toc234507123 \h </w:instrText>
-            </w:r>
-            <w:r>
-              <w:rPr>
-                <w:noProof/>
-              </w:rPr>
-            </w:r>
-            <w:r>
-              <w:rPr>
-                <w:noProof/>
-              </w:rPr>
               <w:fldChar w:fldCharType="separate"/>
-            </w:r>
-            <w:r>
-              <w:rPr>
-                <w:noProof/>
-              </w:rPr>
               <w:t>1</w:t>
-            </w:r>
-            <w:r>
-              <w:rPr>
-                <w:noProof/>
-              </w:rPr>
               <w:fldChar w:fldCharType="end"/>
             </w:r>
           </w:hyperlink>
@@ -1417,40 +814,10 @@
                 <w:noProof/>
               </w:rPr>
               <w:tab/>
-            </w:r>
-            <w:r>
-              <w:rPr>
-                <w:noProof/>
-              </w:rPr>
               <w:fldChar w:fldCharType="begin"/>
-            </w:r>
-            <w:r>
-              <w:rPr>
-                <w:noProof/>
-              </w:rPr>
               <w:instrText xml:space="preserve"> PAGEREF _Toc234507124 \h </w:instrText>
-            </w:r>
-            <w:r>
-              <w:rPr>
-                <w:noProof/>
-              </w:rPr>
-            </w:r>
-            <w:r>
-              <w:rPr>
-                <w:noProof/>
-              </w:rPr>
               <w:fldChar w:fldCharType="separate"/>
-            </w:r>
-            <w:r>
-              <w:rPr>
-                <w:noProof/>
-              </w:rPr>
               <w:t>1</w:t>
-            </w:r>
-            <w:r>
-              <w:rPr>
-                <w:noProof/>
-              </w:rPr>
               <w:fldChar w:fldCharType="end"/>
             </w:r>
           </w:hyperlink>
@@ -1478,40 +845,10 @@
                 <w:noProof/>
               </w:rPr>
               <w:tab/>
-            </w:r>
-            <w:r>
-              <w:rPr>
-                <w:noProof/>
-              </w:rPr>
               <w:fldChar w:fldCharType="begin"/>
-            </w:r>
-            <w:r>
-              <w:rPr>
-                <w:noProof/>
-              </w:rPr>
               <w:instrText xml:space="preserve"> PAGEREF _Toc234507125 \h </w:instrText>
-            </w:r>
-            <w:r>
-              <w:rPr>
-                <w:noProof/>
-              </w:rPr>
-            </w:r>
-            <w:r>
-              <w:rPr>
-                <w:noProof/>
-              </w:rPr>
               <w:fldChar w:fldCharType="separate"/>
-            </w:r>
-            <w:r>
-              <w:rPr>
-                <w:noProof/>
-              </w:rPr>
               <w:t>1</w:t>
-            </w:r>
-            <w:r>
-              <w:rPr>
-                <w:noProof/>
-              </w:rPr>
               <w:fldChar w:fldCharType="end"/>
             </w:r>
           </w:hyperlink>
@@ -1539,40 +876,10 @@
                 <w:noProof/>
               </w:rPr>
               <w:tab/>
-            </w:r>
-            <w:r>
-              <w:rPr>
-                <w:noProof/>
-              </w:rPr>
               <w:fldChar w:fldCharType="begin"/>
-            </w:r>
-            <w:r>
-              <w:rPr>
-                <w:noProof/>
-              </w:rPr>
               <w:instrText xml:space="preserve"> PAGEREF _Toc234507126 \h </w:instrText>
-            </w:r>
-            <w:r>
-              <w:rPr>
-                <w:noProof/>
-              </w:rPr>
-            </w:r>
-            <w:r>
-              <w:rPr>
-                <w:noProof/>
-              </w:rPr>
               <w:fldChar w:fldCharType="separate"/>
-            </w:r>
-            <w:r>
-              <w:rPr>
-                <w:noProof/>
-              </w:rPr>
               <w:t>1</w:t>
-            </w:r>
-            <w:r>
-              <w:rPr>
-                <w:noProof/>
-              </w:rPr>
               <w:fldChar w:fldCharType="end"/>
             </w:r>
           </w:hyperlink>
@@ -1600,40 +907,10 @@
                 <w:noProof/>
               </w:rPr>
               <w:tab/>
-            </w:r>
-            <w:r>
-              <w:rPr>
-                <w:noProof/>
-              </w:rPr>
               <w:fldChar w:fldCharType="begin"/>
-            </w:r>
-            <w:r>
-              <w:rPr>
-                <w:noProof/>
-              </w:rPr>
               <w:instrText xml:space="preserve"> PAGEREF _Toc234507127 \h </w:instrText>
-            </w:r>
-            <w:r>
-              <w:rPr>
-                <w:noProof/>
-              </w:rPr>
-            </w:r>
-            <w:r>
-              <w:rPr>
-                <w:noProof/>
-              </w:rPr>
               <w:fldChar w:fldCharType="separate"/>
-            </w:r>
-            <w:r>
-              <w:rPr>
-                <w:noProof/>
-              </w:rPr>
               <w:t>1</w:t>
-            </w:r>
-            <w:r>
-              <w:rPr>
-                <w:noProof/>
-              </w:rPr>
               <w:fldChar w:fldCharType="end"/>
             </w:r>
           </w:hyperlink>
@@ -1661,40 +938,10 @@
                 <w:noProof/>
               </w:rPr>
               <w:tab/>
-            </w:r>
-            <w:r>
-              <w:rPr>
-                <w:noProof/>
-              </w:rPr>
               <w:fldChar w:fldCharType="begin"/>
-            </w:r>
-            <w:r>
-              <w:rPr>
-                <w:noProof/>
-              </w:rPr>
               <w:instrText xml:space="preserve"> PAGEREF _Toc234507128 \h </w:instrText>
-            </w:r>
-            <w:r>
-              <w:rPr>
-                <w:noProof/>
-              </w:rPr>
-            </w:r>
-            <w:r>
-              <w:rPr>
-                <w:noProof/>
-              </w:rPr>
               <w:fldChar w:fldCharType="separate"/>
-            </w:r>
-            <w:r>
-              <w:rPr>
-                <w:noProof/>
-              </w:rPr>
               <w:t>1</w:t>
-            </w:r>
-            <w:r>
-              <w:rPr>
-                <w:noProof/>
-              </w:rPr>
               <w:fldChar w:fldCharType="end"/>
             </w:r>
           </w:hyperlink>
@@ -1722,40 +969,10 @@
                 <w:noProof/>
               </w:rPr>
               <w:tab/>
-            </w:r>
-            <w:r>
-              <w:rPr>
-                <w:noProof/>
-              </w:rPr>
               <w:fldChar w:fldCharType="begin"/>
-            </w:r>
-            <w:r>
-              <w:rPr>
-                <w:noProof/>
-              </w:rPr>
               <w:instrText xml:space="preserve"> PAGEREF _Toc234507129 \h </w:instrText>
-            </w:r>
-            <w:r>
-              <w:rPr>
-                <w:noProof/>
-              </w:rPr>
-            </w:r>
-            <w:r>
-              <w:rPr>
-                <w:noProof/>
-              </w:rPr>
               <w:fldChar w:fldCharType="separate"/>
-            </w:r>
-            <w:r>
-              <w:rPr>
-                <w:noProof/>
-              </w:rPr>
               <w:t>1</w:t>
-            </w:r>
-            <w:r>
-              <w:rPr>
-                <w:noProof/>
-              </w:rPr>
               <w:fldChar w:fldCharType="end"/>
             </w:r>
           </w:hyperlink>
@@ -1783,40 +1000,10 @@
                 <w:noProof/>
               </w:rPr>
               <w:tab/>
-            </w:r>
-            <w:r>
-              <w:rPr>
-                <w:noProof/>
-              </w:rPr>
               <w:fldChar w:fldCharType="begin"/>
-            </w:r>
-            <w:r>
-              <w:rPr>
-                <w:noProof/>
-              </w:rPr>
               <w:instrText xml:space="preserve"> PAGEREF _Toc234507130 \h </w:instrText>
-            </w:r>
-            <w:r>
-              <w:rPr>
-                <w:noProof/>
-              </w:rPr>
-            </w:r>
-            <w:r>
-              <w:rPr>
-                <w:noProof/>
-              </w:rPr>
               <w:fldChar w:fldCharType="separate"/>
-            </w:r>
-            <w:r>
-              <w:rPr>
-                <w:noProof/>
-              </w:rPr>
               <w:t>1</w:t>
-            </w:r>
-            <w:r>
-              <w:rPr>
-                <w:noProof/>
-              </w:rPr>
               <w:fldChar w:fldCharType="end"/>
             </w:r>
           </w:hyperlink>
@@ -2101,7 +1288,7 @@
                 <w:sz w:val="19"/>
                 <w:szCs w:val="19"/>
               </w:rPr>
-              <w:t>Room identity (building, room number, full room name) and hardware quantities. Setting a device count here generates or removes that device’s blocks and its detail tabs.</w:t>
+              <w:t>Room identity (building, room number, full room name) and hardware quantities. Setting a device count here generates or removes that device’s blocks and its detail tabs. Picking a building stores its building code in gve_bldg (e.g. "BSS"), and gui_full_room_name is auto-generated from the full building name in Title Case plus the room number.</w:t>
             </w:r>
           </w:p>
         </w:tc>
@@ -2341,12 +1528,27 @@
                 <w:sz w:val="19"/>
                 <w:szCs w:val="19"/>
               </w:rPr>
-              <w:t>Application paths (modules folder, buildings.json, processors.json, template config, ui_schema.json, key_map.json), theme, and the active deployment target. Reload buttons for the schema and key map live here.</w:t>
+              <w:t>Application paths (modules folder, buildings.json, processors.json, template config, ui_schema.json, key_map.json), the Theme Style, and the active deployment target. Reload buttons for the schema and key map live here.</w:t>
             </w:r>
           </w:p>
         </w:tc>
       </w:tr>
     </w:tbl>
+    <w:p>
+      <w:pPr>
+        <w:spacing w:after="120" w:line="276" w:lineRule="auto"/>
+      </w:pPr>
+      <w:r>
+        <w:rPr>
+          <w:b/>
+          <w:bCs/>
+        </w:rPr>
+        <w:t xml:space="preserve">Theme Style. </w:t>
+      </w:r>
+      <w:r>
+        <w:t xml:space="preserve">The App Config tab includes a Theme Style dropdown. Classic — the default — builds a Material theme around an accent color picked from the swatch grid shown beneath the dropdown, and three Auris sci-fi HUD variants (Amber, Teal, and Magenta) are also available. The sun/moon button on the toolbar still toggles dark and light within whichever style is selected, and every choice is saved and restored on the next launch.</w:t>
+      </w:r>
+    </w:p>
     <w:p>
       <w:pPr>
         <w:pStyle w:val="Heading2"/>
@@ -3473,7 +2675,7 @@
           <w:b/>
           <w:bCs/>
         </w:rPr>
-        <w:t>Auto room name</w:t>
+        <w:t xml:space="preserve">Building code normalization</w:t>
       </w:r>
       <w:r>
         <w:t xml:space="preserve"> — if </w:t>
@@ -3485,10 +2687,10 @@
           <w:sz w:val="19"/>
           <w:szCs w:val="19"/>
         </w:rPr>
-        <w:t>gve_bldg</w:t>
-      </w:r>
-      <w:r>
-        <w:t xml:space="preserve"> resolves against </w:t>
+        <w:t xml:space="preserve">gve_bldg</w:t>
+      </w:r>
+      <w:r>
+        <w:t xml:space="preserve"> holds a full building name found in </w:t>
       </w:r>
       <w:r>
         <w:rPr>
@@ -3497,10 +2699,10 @@
           <w:sz w:val="19"/>
           <w:szCs w:val="19"/>
         </w:rPr>
-        <w:t>buildings.json</w:t>
-      </w:r>
-      <w:r>
-        <w:t xml:space="preserve">, </w:t>
+        <w:t xml:space="preserve">buildings.json</w:t>
+      </w:r>
+      <w:r>
+        <w:t xml:space="preserve">, it is converted to the building code (e.g. </w:t>
       </w:r>
       <w:r>
         <w:rPr>
@@ -3509,10 +2711,10 @@
           <w:sz w:val="19"/>
           <w:szCs w:val="19"/>
         </w:rPr>
-        <w:t>gui_full_room_name</w:t>
-      </w:r>
-      <w:r>
-        <w:t xml:space="preserve"> is regenerated in Title Case.</w:t>
+        <w:t xml:space="preserve">BSS</w:t>
+      </w:r>
+      <w:r>
+        <w:t xml:space="preserve">) and logged as a BUILDING CODE entry in the acknowledgement dialog and the backup log.</w:t>
       </w:r>
     </w:p>
     <w:p>
@@ -3529,10 +2731,10 @@
           <w:b/>
           <w:bCs/>
         </w:rPr>
-        <w:t>Device-count audit</w:t>
-      </w:r>
-      <w:r>
-        <w:t xml:space="preserve"> — warns (never changes) when more device blocks exist than the </w:t>
+        <w:t>Auto room name</w:t>
+      </w:r>
+      <w:r>
+        <w:t xml:space="preserve"> — if </w:t>
       </w:r>
       <w:r>
         <w:rPr>
@@ -3541,10 +2743,34 @@
           <w:sz w:val="19"/>
           <w:szCs w:val="19"/>
         </w:rPr>
-        <w:t>dev_</w:t>
-      </w:r>
-      <w:r>
-        <w:t xml:space="preserve"> count allows; extra blocks are hidden and pruned on export.</w:t>
+        <w:t>gve_bldg</w:t>
+      </w:r>
+      <w:r>
+        <w:t xml:space="preserve"> resolves against </w:t>
+      </w:r>
+      <w:r>
+        <w:rPr>
+          <w:rFonts w:ascii="Consolas" w:eastAsia="Consolas" w:hAnsi="Consolas" w:cs="Consolas"/>
+          <w:color w:val="A31515"/>
+          <w:sz w:val="19"/>
+          <w:szCs w:val="19"/>
+        </w:rPr>
+        <w:t>buildings.json</w:t>
+      </w:r>
+      <w:r>
+        <w:t xml:space="preserve">, </w:t>
+      </w:r>
+      <w:r>
+        <w:rPr>
+          <w:rFonts w:ascii="Consolas" w:eastAsia="Consolas" w:hAnsi="Consolas" w:cs="Consolas"/>
+          <w:color w:val="A31515"/>
+          <w:sz w:val="19"/>
+          <w:szCs w:val="19"/>
+        </w:rPr>
+        <w:t>gui_full_room_name</w:t>
+      </w:r>
+      <w:r>
+        <w:t xml:space="preserve"> is regenerated in Title Case.</w:t>
       </w:r>
     </w:p>
     <w:p>
@@ -3561,10 +2787,22 @@
           <w:b/>
           <w:bCs/>
         </w:rPr>
-        <w:t>Template audit</w:t>
-      </w:r>
-      <w:r>
-        <w:t xml:space="preserve"> — flags any section or property that is not in the template config, so leftovers and custom keys are visible.</w:t>
+        <w:t>Device-count audit</w:t>
+      </w:r>
+      <w:r>
+        <w:t xml:space="preserve"> — warns (never changes) when more device blocks exist than the </w:t>
+      </w:r>
+      <w:r>
+        <w:rPr>
+          <w:rFonts w:ascii="Consolas" w:eastAsia="Consolas" w:hAnsi="Consolas" w:cs="Consolas"/>
+          <w:color w:val="A31515"/>
+          <w:sz w:val="19"/>
+          <w:szCs w:val="19"/>
+        </w:rPr>
+        <w:t>dev_</w:t>
+      </w:r>
+      <w:r>
+        <w:t xml:space="preserve"> count allows; extra blocks are hidden and pruned on export.</w:t>
       </w:r>
     </w:p>
     <w:p>
@@ -3581,6 +2819,26 @@
           <w:b/>
           <w:bCs/>
         </w:rPr>
+        <w:t>Template audit</w:t>
+      </w:r>
+      <w:r>
+        <w:t xml:space="preserve"> — flags any section or property that is not in the template config, so leftovers and custom keys are visible.</w:t>
+      </w:r>
+    </w:p>
+    <w:p>
+      <w:pPr>
+        <w:pStyle w:val="ListParagraph"/>
+        <w:numPr>
+          <w:ilvl w:val="0"/>
+          <w:numId w:val="3"/>
+        </w:numPr>
+        <w:spacing w:after="70" w:line="268" w:lineRule="auto"/>
+      </w:pPr>
+      <w:r>
+        <w:rPr>
+          <w:b/>
+          <w:bCs/>
+        </w:rPr>
         <w:t>Logs</w:t>
       </w:r>
       <w:r>
@@ -3657,7 +2915,6 @@
         <w:spacing w:before="60"/>
         <w:ind w:left="120"/>
       </w:pPr>
-      <w:proofErr w:type="spellStart"/>
       <w:r>
         <w:rPr>
           <w:rFonts w:ascii="Consolas" w:eastAsia="Consolas" w:hAnsi="Consolas" w:cs="Consolas"/>
@@ -3665,66 +2922,7 @@
           <w:sz w:val="19"/>
           <w:szCs w:val="19"/>
         </w:rPr>
-        <w:t>gve_bldg</w:t>
-      </w:r>
-      <w:proofErr w:type="spellEnd"/>
-      <w:r>
-        <w:rPr>
-          <w:rFonts w:ascii="Consolas" w:eastAsia="Consolas" w:hAnsi="Consolas" w:cs="Consolas"/>
-          <w:color w:val="1F1F1F"/>
-          <w:sz w:val="19"/>
-          <w:szCs w:val="19"/>
-        </w:rPr>
-        <w:t xml:space="preserve">: "UNKNOWN"          </w:t>
-      </w:r>
-      <w:proofErr w:type="spellStart"/>
-      <w:r>
-        <w:rPr>
-          <w:rFonts w:ascii="Consolas" w:eastAsia="Consolas" w:hAnsi="Consolas" w:cs="Consolas"/>
-          <w:color w:val="1F1F1F"/>
-          <w:sz w:val="19"/>
-          <w:szCs w:val="19"/>
-        </w:rPr>
-        <w:t>dev_projectors</w:t>
-      </w:r>
-      <w:proofErr w:type="spellEnd"/>
-      <w:r>
-        <w:rPr>
-          <w:rFonts w:ascii="Consolas" w:eastAsia="Consolas" w:hAnsi="Consolas" w:cs="Consolas"/>
-          <w:color w:val="1F1F1F"/>
-          <w:sz w:val="19"/>
-          <w:szCs w:val="19"/>
-        </w:rPr>
-        <w:t xml:space="preserve">: "0"    </w:t>
-      </w:r>
-      <w:r>
-        <w:rPr>
-          <w:rFonts w:ascii="Consolas" w:eastAsia="Consolas" w:hAnsi="Consolas" w:cs="Consolas"/>
-          <w:color w:val="1F1F1F"/>
-          <w:sz w:val="19"/>
-          <w:szCs w:val="19"/>
-        </w:rPr>
-        <w:t xml:space="preserve">  </w:t>
-      </w:r>
-      <w:proofErr w:type="spellStart"/>
-      <w:r>
-        <w:rPr>
-          <w:rFonts w:ascii="Consolas" w:eastAsia="Consolas" w:hAnsi="Consolas" w:cs="Consolas"/>
-          <w:color w:val="1F1F1F"/>
-          <w:sz w:val="19"/>
-          <w:szCs w:val="19"/>
-        </w:rPr>
-        <w:t>gui_mic_mix</w:t>
-      </w:r>
-      <w:proofErr w:type="spellEnd"/>
-      <w:r>
-        <w:rPr>
-          <w:rFonts w:ascii="Consolas" w:eastAsia="Consolas" w:hAnsi="Consolas" w:cs="Consolas"/>
-          <w:color w:val="1F1F1F"/>
-          <w:sz w:val="19"/>
-          <w:szCs w:val="19"/>
-        </w:rPr>
-        <w:t>: "No"</w:t>
+        <w:t xml:space="preserve">gve_bldg: "UNKNOWN"          dev_projectors: "0"      gui_mic_mix: "No"</w:t>
       </w:r>
     </w:p>
     <w:p>
@@ -3735,7 +2933,6 @@
         <w:shd w:val="clear" w:color="auto" w:fill="F2F2F2"/>
         <w:ind w:left="120"/>
       </w:pPr>
-      <w:proofErr w:type="spellStart"/>
       <w:r>
         <w:rPr>
           <w:rFonts w:ascii="Consolas" w:eastAsia="Consolas" w:hAnsi="Consolas" w:cs="Consolas"/>
@@ -3743,66 +2940,7 @@
           <w:sz w:val="19"/>
           <w:szCs w:val="19"/>
         </w:rPr>
-        <w:t>gve_room</w:t>
-      </w:r>
-      <w:proofErr w:type="spellEnd"/>
-      <w:r>
-        <w:rPr>
-          <w:rFonts w:ascii="Consolas" w:eastAsia="Consolas" w:hAnsi="Consolas" w:cs="Consolas"/>
-          <w:color w:val="1F1F1F"/>
-          <w:sz w:val="19"/>
-          <w:szCs w:val="19"/>
-        </w:rPr>
-        <w:t xml:space="preserve">: "000"              </w:t>
-      </w:r>
-      <w:proofErr w:type="spellStart"/>
-      <w:r>
-        <w:rPr>
-          <w:rFonts w:ascii="Consolas" w:eastAsia="Consolas" w:hAnsi="Consolas" w:cs="Consolas"/>
-          <w:color w:val="1F1F1F"/>
-          <w:sz w:val="19"/>
-          <w:szCs w:val="19"/>
-        </w:rPr>
-        <w:t>dev_cameras</w:t>
-      </w:r>
-      <w:proofErr w:type="spellEnd"/>
-      <w:r>
-        <w:rPr>
-          <w:rFonts w:ascii="Consolas" w:eastAsia="Consolas" w:hAnsi="Consolas" w:cs="Consolas"/>
-          <w:color w:val="1F1F1F"/>
-          <w:sz w:val="19"/>
-          <w:szCs w:val="19"/>
-        </w:rPr>
-        <w:t xml:space="preserve">: "0"       </w:t>
-      </w:r>
-      <w:r>
-        <w:rPr>
-          <w:rFonts w:ascii="Consolas" w:eastAsia="Consolas" w:hAnsi="Consolas" w:cs="Consolas"/>
-          <w:color w:val="1F1F1F"/>
-          <w:sz w:val="19"/>
-          <w:szCs w:val="19"/>
-        </w:rPr>
-        <w:t xml:space="preserve">  </w:t>
-      </w:r>
-      <w:proofErr w:type="spellStart"/>
-      <w:r>
-        <w:rPr>
-          <w:rFonts w:ascii="Consolas" w:eastAsia="Consolas" w:hAnsi="Consolas" w:cs="Consolas"/>
-          <w:color w:val="1F1F1F"/>
-          <w:sz w:val="19"/>
-          <w:szCs w:val="19"/>
-        </w:rPr>
-        <w:t>gui_routing_available</w:t>
-      </w:r>
-      <w:proofErr w:type="spellEnd"/>
-      <w:r>
-        <w:rPr>
-          <w:rFonts w:ascii="Consolas" w:eastAsia="Consolas" w:hAnsi="Consolas" w:cs="Consolas"/>
-          <w:color w:val="1F1F1F"/>
-          <w:sz w:val="19"/>
-          <w:szCs w:val="19"/>
-        </w:rPr>
-        <w:t>: "No"</w:t>
+        <w:t xml:space="preserve">gve_room: "000"              dev_cameras: "0"         gui_routing_available: "No"</w:t>
       </w:r>
     </w:p>
     <w:p>
@@ -3813,7 +2951,6 @@
         <w:shd w:val="clear" w:color="auto" w:fill="F2F2F2"/>
         <w:ind w:left="120"/>
       </w:pPr>
-      <w:proofErr w:type="spellStart"/>
       <w:r>
         <w:rPr>
           <w:rFonts w:ascii="Consolas" w:eastAsia="Consolas" w:hAnsi="Consolas" w:cs="Consolas"/>
@@ -3821,66 +2958,7 @@
           <w:sz w:val="19"/>
           <w:szCs w:val="19"/>
         </w:rPr>
-        <w:t>gui_full_room_name</w:t>
-      </w:r>
-      <w:proofErr w:type="spellEnd"/>
-      <w:r>
-        <w:rPr>
-          <w:rFonts w:ascii="Consolas" w:eastAsia="Consolas" w:hAnsi="Consolas" w:cs="Consolas"/>
-          <w:color w:val="1F1F1F"/>
-          <w:sz w:val="19"/>
-          <w:szCs w:val="19"/>
-        </w:rPr>
-        <w:t xml:space="preserve">:          </w:t>
-      </w:r>
-      <w:proofErr w:type="spellStart"/>
-      <w:r>
-        <w:rPr>
-          <w:rFonts w:ascii="Consolas" w:eastAsia="Consolas" w:hAnsi="Consolas" w:cs="Consolas"/>
-          <w:color w:val="1F1F1F"/>
-          <w:sz w:val="19"/>
-          <w:szCs w:val="19"/>
-        </w:rPr>
-        <w:t>dev_switchers</w:t>
-      </w:r>
-      <w:proofErr w:type="spellEnd"/>
-      <w:r>
-        <w:rPr>
-          <w:rFonts w:ascii="Consolas" w:eastAsia="Consolas" w:hAnsi="Consolas" w:cs="Consolas"/>
-          <w:color w:val="1F1F1F"/>
-          <w:sz w:val="19"/>
-          <w:szCs w:val="19"/>
-        </w:rPr>
-        <w:t xml:space="preserve">: "0"     </w:t>
-      </w:r>
-      <w:r>
-        <w:rPr>
-          <w:rFonts w:ascii="Consolas" w:eastAsia="Consolas" w:hAnsi="Consolas" w:cs="Consolas"/>
-          <w:color w:val="1F1F1F"/>
-          <w:sz w:val="19"/>
-          <w:szCs w:val="19"/>
-        </w:rPr>
-        <w:t xml:space="preserve">  </w:t>
-      </w:r>
-      <w:proofErr w:type="spellStart"/>
-      <w:r>
-        <w:rPr>
-          <w:rFonts w:ascii="Consolas" w:eastAsia="Consolas" w:hAnsi="Consolas" w:cs="Consolas"/>
-          <w:color w:val="1F1F1F"/>
-          <w:sz w:val="19"/>
-          <w:szCs w:val="19"/>
-        </w:rPr>
-        <w:t>gui_routing_mode</w:t>
-      </w:r>
-      <w:proofErr w:type="spellEnd"/>
-      <w:r>
-        <w:rPr>
-          <w:rFonts w:ascii="Consolas" w:eastAsia="Consolas" w:hAnsi="Consolas" w:cs="Consolas"/>
-          <w:color w:val="1F1F1F"/>
-          <w:sz w:val="19"/>
-          <w:szCs w:val="19"/>
-        </w:rPr>
-        <w:t>: "Normal"</w:t>
+        <w:t xml:space="preserve">gui_full_room_name:          dev_switchers: "0"       gui_routing_mode: "Normal"</w:t>
       </w:r>
     </w:p>
     <w:p>
@@ -3898,56 +2976,7 @@
           <w:sz w:val="19"/>
           <w:szCs w:val="19"/>
         </w:rPr>
-        <w:t xml:space="preserve">  "Legacy Room Update"       </w:t>
-      </w:r>
-      <w:proofErr w:type="spellStart"/>
-      <w:r>
-        <w:rPr>
-          <w:rFonts w:ascii="Consolas" w:eastAsia="Consolas" w:hAnsi="Consolas" w:cs="Consolas"/>
-          <w:color w:val="1F1F1F"/>
-          <w:sz w:val="19"/>
-          <w:szCs w:val="19"/>
-        </w:rPr>
-        <w:t>dev_dsps</w:t>
-      </w:r>
-      <w:proofErr w:type="spellEnd"/>
-      <w:r>
-        <w:rPr>
-          <w:rFonts w:ascii="Consolas" w:eastAsia="Consolas" w:hAnsi="Consolas" w:cs="Consolas"/>
-          <w:color w:val="1F1F1F"/>
-          <w:sz w:val="19"/>
-          <w:szCs w:val="19"/>
-        </w:rPr>
-        <w:t xml:space="preserve">: "0"          </w:t>
-      </w:r>
-      <w:r>
-        <w:rPr>
-          <w:rFonts w:ascii="Consolas" w:eastAsia="Consolas" w:hAnsi="Consolas" w:cs="Consolas"/>
-          <w:color w:val="1F1F1F"/>
-          <w:sz w:val="19"/>
-          <w:szCs w:val="19"/>
-        </w:rPr>
-        <w:t xml:space="preserve">  </w:t>
-      </w:r>
-      <w:proofErr w:type="spellStart"/>
-      <w:r>
-        <w:rPr>
-          <w:rFonts w:ascii="Consolas" w:eastAsia="Consolas" w:hAnsi="Consolas" w:cs="Consolas"/>
-          <w:color w:val="1F1F1F"/>
-          <w:sz w:val="19"/>
-          <w:szCs w:val="19"/>
-        </w:rPr>
-        <w:t>gui_tab</w:t>
-      </w:r>
-      <w:proofErr w:type="spellEnd"/>
-      <w:r>
-        <w:rPr>
-          <w:rFonts w:ascii="Consolas" w:eastAsia="Consolas" w:hAnsi="Consolas" w:cs="Consolas"/>
-          <w:color w:val="1F1F1F"/>
-          <w:sz w:val="19"/>
-          <w:szCs w:val="19"/>
-        </w:rPr>
-        <w:t>: "2_Cam_Dev"</w:t>
+        <w:t xml:space="preserve">  "Legacy Room Update"       dev_dsps: "0"            gui_tab: "2_Cam_Dev"</w:t>
       </w:r>
     </w:p>
     <w:p>
@@ -3965,56 +2994,7 @@
           <w:sz w:val="19"/>
           <w:szCs w:val="19"/>
         </w:rPr>
-        <w:t xml:space="preserve">                             </w:t>
-      </w:r>
-      <w:proofErr w:type="spellStart"/>
-      <w:r>
-        <w:rPr>
-          <w:rFonts w:ascii="Consolas" w:eastAsia="Consolas" w:hAnsi="Consolas" w:cs="Consolas"/>
-          <w:color w:val="1F1F1F"/>
-          <w:sz w:val="19"/>
-          <w:szCs w:val="19"/>
-        </w:rPr>
-        <w:t>dev_usb_switchers</w:t>
-      </w:r>
-      <w:proofErr w:type="spellEnd"/>
-      <w:r>
-        <w:rPr>
-          <w:rFonts w:ascii="Consolas" w:eastAsia="Consolas" w:hAnsi="Consolas" w:cs="Consolas"/>
-          <w:color w:val="1F1F1F"/>
-          <w:sz w:val="19"/>
-          <w:szCs w:val="19"/>
-        </w:rPr>
-        <w:t xml:space="preserve">: "0" </w:t>
-      </w:r>
-      <w:r>
-        <w:rPr>
-          <w:rFonts w:ascii="Consolas" w:eastAsia="Consolas" w:hAnsi="Consolas" w:cs="Consolas"/>
-          <w:color w:val="1F1F1F"/>
-          <w:sz w:val="19"/>
-          <w:szCs w:val="19"/>
-        </w:rPr>
-        <w:t xml:space="preserve">  </w:t>
-      </w:r>
-      <w:proofErr w:type="spellStart"/>
-      <w:r>
-        <w:rPr>
-          <w:rFonts w:ascii="Consolas" w:eastAsia="Consolas" w:hAnsi="Consolas" w:cs="Consolas"/>
-          <w:color w:val="1F1F1F"/>
-          <w:sz w:val="19"/>
-          <w:szCs w:val="19"/>
-        </w:rPr>
-        <w:t>gui_capture_source_available</w:t>
-      </w:r>
-      <w:proofErr w:type="spellEnd"/>
-      <w:r>
-        <w:rPr>
-          <w:rFonts w:ascii="Consolas" w:eastAsia="Consolas" w:hAnsi="Consolas" w:cs="Consolas"/>
-          <w:color w:val="1F1F1F"/>
-          <w:sz w:val="19"/>
-          <w:szCs w:val="19"/>
-        </w:rPr>
-        <w:t>: "No"</w:t>
+        <w:t xml:space="preserve">                             dev_usb_switchers: "0"   gui_capture_source_available: "No"</w:t>
       </w:r>
     </w:p>
     <w:p>
@@ -4032,56 +3012,7 @@
           <w:sz w:val="19"/>
           <w:szCs w:val="19"/>
         </w:rPr>
-        <w:t xml:space="preserve">                             </w:t>
-      </w:r>
-      <w:proofErr w:type="spellStart"/>
-      <w:r>
-        <w:rPr>
-          <w:rFonts w:ascii="Consolas" w:eastAsia="Consolas" w:hAnsi="Consolas" w:cs="Consolas"/>
-          <w:color w:val="1F1F1F"/>
-          <w:sz w:val="19"/>
-          <w:szCs w:val="19"/>
-        </w:rPr>
-        <w:t>dev_media_ports</w:t>
-      </w:r>
-      <w:proofErr w:type="spellEnd"/>
-      <w:r>
-        <w:rPr>
-          <w:rFonts w:ascii="Consolas" w:eastAsia="Consolas" w:hAnsi="Consolas" w:cs="Consolas"/>
-          <w:color w:val="1F1F1F"/>
-          <w:sz w:val="19"/>
-          <w:szCs w:val="19"/>
-        </w:rPr>
-        <w:t xml:space="preserve">: "0"   </w:t>
-      </w:r>
-      <w:r>
-        <w:rPr>
-          <w:rFonts w:ascii="Consolas" w:eastAsia="Consolas" w:hAnsi="Consolas" w:cs="Consolas"/>
-          <w:color w:val="1F1F1F"/>
-          <w:sz w:val="19"/>
-          <w:szCs w:val="19"/>
-        </w:rPr>
-        <w:t xml:space="preserve">  </w:t>
-      </w:r>
-      <w:proofErr w:type="spellStart"/>
-      <w:r>
-        <w:rPr>
-          <w:rFonts w:ascii="Consolas" w:eastAsia="Consolas" w:hAnsi="Consolas" w:cs="Consolas"/>
-          <w:color w:val="1F1F1F"/>
-          <w:sz w:val="19"/>
-          <w:szCs w:val="19"/>
-        </w:rPr>
-        <w:t>gui_usb_or_vga</w:t>
-      </w:r>
-      <w:proofErr w:type="spellEnd"/>
-      <w:r>
-        <w:rPr>
-          <w:rFonts w:ascii="Consolas" w:eastAsia="Consolas" w:hAnsi="Consolas" w:cs="Consolas"/>
-          <w:color w:val="1F1F1F"/>
-          <w:sz w:val="19"/>
-          <w:szCs w:val="19"/>
-        </w:rPr>
-        <w:t>: "USB"</w:t>
+        <w:t xml:space="preserve">                             dev_media_ports: "0"     gui_usb_or_vga: "USB"</w:t>
       </w:r>
     </w:p>
     <w:p>
@@ -4099,27 +3030,7 @@
           <w:sz w:val="19"/>
           <w:szCs w:val="19"/>
         </w:rPr>
-        <w:t xml:space="preserve">                             </w:t>
-      </w:r>
-      <w:proofErr w:type="spellStart"/>
-      <w:r>
-        <w:rPr>
-          <w:rFonts w:ascii="Consolas" w:eastAsia="Consolas" w:hAnsi="Consolas" w:cs="Consolas"/>
-          <w:color w:val="1F1F1F"/>
-          <w:sz w:val="19"/>
-          <w:szCs w:val="19"/>
-        </w:rPr>
-        <w:t>dev_wireless</w:t>
-      </w:r>
-      <w:proofErr w:type="spellEnd"/>
-      <w:r>
-        <w:rPr>
-          <w:rFonts w:ascii="Consolas" w:eastAsia="Consolas" w:hAnsi="Consolas" w:cs="Consolas"/>
-          <w:color w:val="1F1F1F"/>
-          <w:sz w:val="19"/>
-          <w:szCs w:val="19"/>
-        </w:rPr>
-        <w:t>: "0"</w:t>
+        <w:t xml:space="preserve">                             dev_wireless: "0"</w:t>
       </w:r>
     </w:p>
     <w:p>
@@ -4137,27 +3048,7 @@
           <w:sz w:val="19"/>
           <w:szCs w:val="19"/>
         </w:rPr>
-        <w:t xml:space="preserve">                             </w:t>
-      </w:r>
-      <w:proofErr w:type="spellStart"/>
-      <w:r>
-        <w:rPr>
-          <w:rFonts w:ascii="Consolas" w:eastAsia="Consolas" w:hAnsi="Consolas" w:cs="Consolas"/>
-          <w:color w:val="1F1F1F"/>
-          <w:sz w:val="19"/>
-          <w:szCs w:val="19"/>
-        </w:rPr>
-        <w:t>dev_recorders</w:t>
-      </w:r>
-      <w:proofErr w:type="spellEnd"/>
-      <w:r>
-        <w:rPr>
-          <w:rFonts w:ascii="Consolas" w:eastAsia="Consolas" w:hAnsi="Consolas" w:cs="Consolas"/>
-          <w:color w:val="1F1F1F"/>
-          <w:sz w:val="19"/>
-          <w:szCs w:val="19"/>
-        </w:rPr>
-        <w:t>: "0"</w:t>
+        <w:t xml:space="preserve">                             dev_recorders: "0"</w:t>
       </w:r>
     </w:p>
     <w:p>
@@ -4175,27 +3066,7 @@
           <w:sz w:val="19"/>
           <w:szCs w:val="19"/>
         </w:rPr>
-        <w:t xml:space="preserve">                             </w:t>
-      </w:r>
-      <w:proofErr w:type="spellStart"/>
-      <w:r>
-        <w:rPr>
-          <w:rFonts w:ascii="Consolas" w:eastAsia="Consolas" w:hAnsi="Consolas" w:cs="Consolas"/>
-          <w:color w:val="1F1F1F"/>
-          <w:sz w:val="19"/>
-          <w:szCs w:val="19"/>
-        </w:rPr>
-        <w:t>dev_screens</w:t>
-      </w:r>
-      <w:proofErr w:type="spellEnd"/>
-      <w:r>
-        <w:rPr>
-          <w:rFonts w:ascii="Consolas" w:eastAsia="Consolas" w:hAnsi="Consolas" w:cs="Consolas"/>
-          <w:color w:val="1F1F1F"/>
-          <w:sz w:val="19"/>
-          <w:szCs w:val="19"/>
-        </w:rPr>
-        <w:t>: "0"</w:t>
+        <w:t xml:space="preserve">                             dev_screens: "0"</w:t>
       </w:r>
     </w:p>
     <w:p>
@@ -4219,27 +3090,7 @@
           <w:sz w:val="19"/>
           <w:szCs w:val="19"/>
         </w:rPr>
-        <w:t xml:space="preserve">                             </w:t>
-      </w:r>
-      <w:proofErr w:type="spellStart"/>
-      <w:r>
-        <w:rPr>
-          <w:rFonts w:ascii="Consolas" w:eastAsia="Consolas" w:hAnsi="Consolas" w:cs="Consolas"/>
-          <w:color w:val="1F1F1F"/>
-          <w:sz w:val="19"/>
-          <w:szCs w:val="19"/>
-        </w:rPr>
-        <w:t>dev_power_controllers</w:t>
-      </w:r>
-      <w:proofErr w:type="spellEnd"/>
-      <w:r>
-        <w:rPr>
-          <w:rFonts w:ascii="Consolas" w:eastAsia="Consolas" w:hAnsi="Consolas" w:cs="Consolas"/>
-          <w:color w:val="1F1F1F"/>
-          <w:sz w:val="19"/>
-          <w:szCs w:val="19"/>
-        </w:rPr>
-        <w:t>: "0"</w:t>
+        <w:t xml:space="preserve">                             dev_power_controllers: "0"</w:t>
       </w:r>
     </w:p>
     <w:p>
@@ -4355,6 +3206,50 @@
       </w:r>
       <w:r>
         <w:t>.</w:t>
+      </w:r>
+    </w:p>
+    <w:p>
+      <w:pPr>
+        <w:pStyle w:val="ListParagraph"/>
+        <w:numPr>
+          <w:ilvl w:val="0"/>
+          <w:numId w:val="2"/>
+        </w:numPr>
+        <w:spacing w:after="70" w:line="268" w:lineRule="auto"/>
+      </w:pPr>
+      <w:r>
+        <w:rPr>
+          <w:b/>
+          <w:bCs/>
+        </w:rPr>
+        <w:t xml:space="preserve">Sorted keys</w:t>
+      </w:r>
+      <w:r>
+        <w:t xml:space="preserve"> — every output path (Apply Changes in the Raw JSON tab, Export, and SFTP upload) writes the config with keys sorted alphabetically in natural order, so </w:t>
+      </w:r>
+      <w:r>
+        <w:rPr>
+          <w:rFonts w:ascii="Consolas" w:eastAsia="Consolas" w:hAnsi="Consolas" w:cs="Consolas"/>
+          <w:color w:val="A31515"/>
+          <w:sz w:val="19"/>
+          <w:szCs w:val="19"/>
+        </w:rPr>
+        <w:t xml:space="preserve">PROJECTORDEVICE_2</w:t>
+      </w:r>
+      <w:r>
+        <w:t xml:space="preserve"> comes before </w:t>
+      </w:r>
+      <w:r>
+        <w:rPr>
+          <w:rFonts w:ascii="Consolas" w:eastAsia="Consolas" w:hAnsi="Consolas" w:cs="Consolas"/>
+          <w:color w:val="A31515"/>
+          <w:sz w:val="19"/>
+          <w:szCs w:val="19"/>
+        </w:rPr>
+        <w:t xml:space="preserve">PROJECTORDEVICE_10</w:t>
+      </w:r>
+      <w:r>
+        <w:t xml:space="preserve">. The Raw JSON view always displays this same sorted form.</w:t>
       </w:r>
     </w:p>
     <w:p>
@@ -5206,6 +4101,124 @@
                 <w:szCs w:val="19"/>
               </w:rPr>
               <w:t>For combo only — the list of config keys the single dropdown writes to.</w:t>
+            </w:r>
+          </w:p>
+        </w:tc>
+      </w:tr>
+      <w:tr>
+        <w:tblPrEx>
+          <w:tblCellMar>
+            <w:top w:w="0" w:type="dxa"/>
+            <w:bottom w:w="0" w:type="dxa"/>
+          </w:tblCellMar>
+        </w:tblPrEx>
+        <w:tc>
+          <w:tcPr>
+            <w:tcW w:w="2100" w:type="dxa"/>
+            <w:shd w:val="clear" w:color="auto" w:fill="FFFFFF"/>
+            <w:tcMar>
+              <w:top w:w="60" w:type="dxa"/>
+              <w:left w:w="100" w:type="dxa"/>
+              <w:bottom w:w="60" w:type="dxa"/>
+              <w:right w:w="100" w:type="dxa"/>
+            </w:tcMar>
+          </w:tcPr>
+          <w:p>
+            <w:pPr>
+              <w:spacing w:line="252" w:lineRule="auto"/>
+            </w:pPr>
+            <w:r>
+              <w:rPr>
+                <w:rFonts w:ascii="Consolas" w:eastAsia="Consolas" w:hAnsi="Consolas" w:cs="Consolas"/>
+                <w:sz w:val="19"/>
+                <w:szCs w:val="19"/>
+              </w:rPr>
+              <w:t>moduleCommand</w:t>
+            </w:r>
+          </w:p>
+        </w:tc>
+        <w:tc>
+          <w:tcPr>
+            <w:tcW w:w="7260" w:type="dxa"/>
+            <w:shd w:val="clear" w:color="auto" w:fill="FFFFFF"/>
+            <w:tcMar>
+              <w:top w:w="60" w:type="dxa"/>
+              <w:left w:w="100" w:type="dxa"/>
+              <w:bottom w:w="60" w:type="dxa"/>
+              <w:right w:w="100" w:type="dxa"/>
+            </w:tcMar>
+          </w:tcPr>
+          <w:p>
+            <w:pPr>
+              <w:spacing w:line="252" w:lineRule="auto"/>
+            </w:pPr>
+            <w:r>
+              <w:rPr>
+                <w:b/>
+                <w:bCs/>
+                <w:sz w:val="19"/>
+                <w:szCs w:val="19"/>
+              </w:rPr>
+              <w:t>For module_states only — the command in the device’s Python module whose states become the options (e.g. "Input").</w:t>
+            </w:r>
+          </w:p>
+        </w:tc>
+      </w:tr>
+      <w:tr>
+        <w:tblPrEx>
+          <w:tblCellMar>
+            <w:top w:w="0" w:type="dxa"/>
+            <w:bottom w:w="0" w:type="dxa"/>
+          </w:tblCellMar>
+        </w:tblPrEx>
+        <w:tc>
+          <w:tcPr>
+            <w:tcW w:w="2100" w:type="dxa"/>
+            <w:shd w:val="clear" w:color="auto" w:fill="FFFFFF"/>
+            <w:tcMar>
+              <w:top w:w="60" w:type="dxa"/>
+              <w:left w:w="100" w:type="dxa"/>
+              <w:bottom w:w="60" w:type="dxa"/>
+              <w:right w:w="100" w:type="dxa"/>
+            </w:tcMar>
+          </w:tcPr>
+          <w:p>
+            <w:pPr>
+              <w:spacing w:line="252" w:lineRule="auto"/>
+            </w:pPr>
+            <w:r>
+              <w:rPr>
+                <w:rFonts w:ascii="Consolas" w:eastAsia="Consolas" w:hAnsi="Consolas" w:cs="Consolas"/>
+                <w:sz w:val="19"/>
+                <w:szCs w:val="19"/>
+              </w:rPr>
+              <w:t>addIfMissing</w:t>
+            </w:r>
+          </w:p>
+        </w:tc>
+        <w:tc>
+          <w:tcPr>
+            <w:tcW w:w="7260" w:type="dxa"/>
+            <w:shd w:val="clear" w:color="auto" w:fill="FFFFFF"/>
+            <w:tcMar>
+              <w:top w:w="60" w:type="dxa"/>
+              <w:left w:w="100" w:type="dxa"/>
+              <w:bottom w:w="60" w:type="dxa"/>
+              <w:right w:w="100" w:type="dxa"/>
+            </w:tcMar>
+          </w:tcPr>
+          <w:p>
+            <w:pPr>
+              <w:spacing w:line="252" w:lineRule="auto"/>
+            </w:pPr>
+            <w:r>
+              <w:rPr>
+                <w:b/>
+                <w:bCs/>
+                <w:sz w:val="19"/>
+                <w:szCs w:val="19"/>
+              </w:rPr>
+              <w:t>device_fields only — render the field on matching device tabs even when the key does not exist in that device block yet; the first edit writes it into config.json.</w:t>
             </w:r>
           </w:p>
         </w:tc>
@@ -6016,6 +5029,91 @@
           </w:p>
         </w:tc>
       </w:tr>
+      <w:tr>
+        <w:tblPrEx>
+          <w:tblCellMar>
+            <w:top w:w="0" w:type="dxa"/>
+            <w:bottom w:w="0" w:type="dxa"/>
+          </w:tblCellMar>
+        </w:tblPrEx>
+        <w:tc>
+          <w:tcPr>
+            <w:tcW w:w="1500" w:type="dxa"/>
+            <w:shd w:val="clear" w:color="auto" w:fill="EEF3F8"/>
+            <w:tcMar>
+              <w:top w:w="60" w:type="dxa"/>
+              <w:left w:w="100" w:type="dxa"/>
+              <w:bottom w:w="60" w:type="dxa"/>
+              <w:right w:w="100" w:type="dxa"/>
+            </w:tcMar>
+          </w:tcPr>
+          <w:p>
+            <w:pPr>
+              <w:spacing w:line="252" w:lineRule="auto"/>
+            </w:pPr>
+            <w:r>
+              <w:rPr>
+                <w:rFonts w:ascii="Consolas" w:eastAsia="Consolas" w:hAnsi="Consolas" w:cs="Consolas"/>
+                <w:sz w:val="19"/>
+                <w:szCs w:val="19"/>
+              </w:rPr>
+              <w:t>module_states</w:t>
+            </w:r>
+          </w:p>
+        </w:tc>
+        <w:tc>
+          <w:tcPr>
+            <w:tcW w:w="2500" w:type="dxa"/>
+            <w:shd w:val="clear" w:color="auto" w:fill="EEF3F8"/>
+            <w:tcMar>
+              <w:top w:w="60" w:type="dxa"/>
+              <w:left w:w="100" w:type="dxa"/>
+              <w:bottom w:w="60" w:type="dxa"/>
+              <w:right w:w="100" w:type="dxa"/>
+            </w:tcMar>
+          </w:tcPr>
+          <w:p>
+            <w:pPr>
+              <w:spacing w:line="252" w:lineRule="auto"/>
+            </w:pPr>
+            <w:r>
+              <w:rPr>
+                <w:b/>
+                <w:bCs/>
+                <w:sz w:val="19"/>
+                <w:szCs w:val="19"/>
+              </w:rPr>
+              <w:t>Autocomplete (module-driven)</w:t>
+            </w:r>
+          </w:p>
+        </w:tc>
+        <w:tc>
+          <w:tcPr>
+            <w:tcW w:w="5360" w:type="dxa"/>
+            <w:shd w:val="clear" w:color="auto" w:fill="EEF3F8"/>
+            <w:tcMar>
+              <w:top w:w="60" w:type="dxa"/>
+              <w:left w:w="100" w:type="dxa"/>
+              <w:bottom w:w="60" w:type="dxa"/>
+              <w:right w:w="100" w:type="dxa"/>
+            </w:tcMar>
+          </w:tcPr>
+          <w:p>
+            <w:pPr>
+              <w:spacing w:line="252" w:lineRule="auto"/>
+            </w:pPr>
+            <w:r>
+              <w:rPr>
+                <w:b/>
+                <w:bCs/>
+                <w:sz w:val="19"/>
+                <w:szCs w:val="19"/>
+              </w:rPr>
+              <w:t>Options parsed live from the device’s selected Python module: the states of the command named by moduleCommand (AllowedValues, falling back to the Set/Match state dictionaries). Manual typing is always allowed; unresolved modules fall back to free text.</w:t>
+            </w:r>
+          </w:p>
+        </w:tc>
+      </w:tr>
     </w:tbl>
     <w:p>
       <w:pPr>
@@ -6924,6 +6022,297 @@
       </w:pPr>
     </w:p>
     <w:p>
+      <w:pPr>
+        <w:pStyle w:val="Heading2"/>
+        <w:spacing w:before="240" w:after="100"/>
+      </w:pPr>
+      <w:bookmarkStart w:id="900" w:name="_Toc234507999"/>
+      <w:r>
+        <w:t>3.9 Device-type fields (device_fields)</w:t>
+      </w:r>
+      <w:bookmarkEnd w:id="900"/>
+    </w:p>
+    <w:p>
+      <w:pPr>
+        <w:spacing w:after="120" w:line="276" w:lineRule="auto"/>
+      </w:pPr>
+      <w:r>
+        <w:t xml:space="preserve">Next to </w:t>
+      </w:r>
+      <w:r>
+        <w:rPr>
+          <w:rFonts w:ascii="Consolas" w:eastAsia="Consolas" w:hAnsi="Consolas" w:cs="Consolas"/>
+          <w:color w:val="A31515"/>
+          <w:sz w:val="19"/>
+          <w:szCs w:val="19"/>
+        </w:rPr>
+        <w:t xml:space="preserve">"fields"</w:t>
+      </w:r>
+      <w:r>
+        <w:t xml:space="preserve">, the schema supports a top-level </w:t>
+      </w:r>
+      <w:r>
+        <w:rPr>
+          <w:rFonts w:ascii="Consolas" w:eastAsia="Consolas" w:hAnsi="Consolas" w:cs="Consolas"/>
+          <w:color w:val="A31515"/>
+          <w:sz w:val="19"/>
+          <w:szCs w:val="19"/>
+        </w:rPr>
+        <w:t xml:space="preserve">"device_fields"</w:t>
+      </w:r>
+      <w:r>
+        <w:t xml:space="preserve"> object holding entries that apply only to matching device sections, keyed by a section pattern such as </w:t>
+      </w:r>
+      <w:r>
+        <w:rPr>
+          <w:rFonts w:ascii="Consolas" w:eastAsia="Consolas" w:hAnsi="Consolas" w:cs="Consolas"/>
+          <w:color w:val="A31515"/>
+          <w:sz w:val="19"/>
+          <w:szCs w:val="19"/>
+        </w:rPr>
+        <w:t xml:space="preserve">"PROJECTORDEVICE_*"</w:t>
+      </w:r>
+      <w:r>
+        <w:t xml:space="preserve">. Scoped entries use exactly the same properties as </w:t>
+      </w:r>
+      <w:r>
+        <w:rPr>
+          <w:rFonts w:ascii="Consolas" w:eastAsia="Consolas" w:hAnsi="Consolas" w:cs="Consolas"/>
+          <w:color w:val="A31515"/>
+          <w:sz w:val="19"/>
+          <w:szCs w:val="19"/>
+        </w:rPr>
+        <w:t xml:space="preserve">"fields"</w:t>
+      </w:r>
+      <w:r>
+        <w:t xml:space="preserve"> and win over the global entries on those tabs. Combined with </w:t>
+      </w:r>
+      <w:r>
+        <w:rPr>
+          <w:rFonts w:ascii="Consolas" w:eastAsia="Consolas" w:hAnsi="Consolas" w:cs="Consolas"/>
+          <w:color w:val="A31515"/>
+          <w:sz w:val="19"/>
+          <w:szCs w:val="19"/>
+        </w:rPr>
+        <w:t xml:space="preserve">addIfMissing</w:t>
+      </w:r>
+      <w:r>
+        <w:t xml:space="preserve">, this lets a device-type-only setting ship purely by editing </w:t>
+      </w:r>
+      <w:r>
+        <w:rPr>
+          <w:rFonts w:ascii="Consolas" w:eastAsia="Consolas" w:hAnsi="Consolas" w:cs="Consolas"/>
+          <w:color w:val="A31515"/>
+          <w:sz w:val="19"/>
+          <w:szCs w:val="19"/>
+        </w:rPr>
+        <w:t xml:space="preserve">ui_schema.json</w:t>
+      </w:r>
+      <w:r>
+        <w:t xml:space="preserve">. Example — projector input options read from each module’s own Input command dictionary:</w:t>
+      </w:r>
+    </w:p>
+    <w:p>
+      <w:pPr>
+        <w:pBdr>
+          <w:left w:val="single" w:sz="18" w:space="6" w:color="2E75B6"/>
+        </w:pBdr>
+        <w:shd w:val="clear" w:color="auto" w:fill="F2F2F2"/>
+        <w:ind w:left="120"/>
+      </w:pPr>
+      <w:r>
+        <w:rPr>
+          <w:rFonts w:ascii="Consolas" w:eastAsia="Consolas" w:hAnsi="Consolas" w:cs="Consolas"/>
+          <w:color w:val="1F1F1F"/>
+          <w:sz w:val="19"/>
+          <w:szCs w:val="19"/>
+        </w:rPr>
+        <w:t xml:space="preserve">"device_fields": {</w:t>
+      </w:r>
+    </w:p>
+    <w:p>
+      <w:pPr>
+        <w:pBdr>
+          <w:left w:val="single" w:sz="18" w:space="6" w:color="2E75B6"/>
+        </w:pBdr>
+        <w:shd w:val="clear" w:color="auto" w:fill="F2F2F2"/>
+        <w:ind w:left="120"/>
+      </w:pPr>
+      <w:r>
+        <w:rPr>
+          <w:rFonts w:ascii="Consolas" w:eastAsia="Consolas" w:hAnsi="Consolas" w:cs="Consolas"/>
+          <w:color w:val="1F1F1F"/>
+          <w:sz w:val="19"/>
+          <w:szCs w:val="19"/>
+        </w:rPr>
+        <w:t xml:space="preserve">  "PROJECTORDEVICE_*": {</w:t>
+      </w:r>
+    </w:p>
+    <w:p>
+      <w:pPr>
+        <w:pBdr>
+          <w:left w:val="single" w:sz="18" w:space="6" w:color="2E75B6"/>
+        </w:pBdr>
+        <w:shd w:val="clear" w:color="auto" w:fill="F2F2F2"/>
+        <w:ind w:left="120"/>
+      </w:pPr>
+      <w:r>
+        <w:rPr>
+          <w:rFonts w:ascii="Consolas" w:eastAsia="Consolas" w:hAnsi="Consolas" w:cs="Consolas"/>
+          <w:color w:val="1F1F1F"/>
+          <w:sz w:val="19"/>
+          <w:szCs w:val="19"/>
+        </w:rPr>
+        <w:t xml:space="preserve">    "input": {</w:t>
+      </w:r>
+    </w:p>
+    <w:p>
+      <w:pPr>
+        <w:pBdr>
+          <w:left w:val="single" w:sz="18" w:space="6" w:color="2E75B6"/>
+        </w:pBdr>
+        <w:shd w:val="clear" w:color="auto" w:fill="F2F2F2"/>
+        <w:ind w:left="120"/>
+      </w:pPr>
+      <w:r>
+        <w:rPr>
+          <w:rFonts w:ascii="Consolas" w:eastAsia="Consolas" w:hAnsi="Consolas" w:cs="Consolas"/>
+          <w:color w:val="1F1F1F"/>
+          <w:sz w:val="19"/>
+          <w:szCs w:val="19"/>
+        </w:rPr>
+        <w:t xml:space="preserve">      "type": "module_states",</w:t>
+      </w:r>
+    </w:p>
+    <w:p>
+      <w:pPr>
+        <w:pBdr>
+          <w:left w:val="single" w:sz="18" w:space="6" w:color="2E75B6"/>
+        </w:pBdr>
+        <w:shd w:val="clear" w:color="auto" w:fill="F2F2F2"/>
+        <w:ind w:left="120"/>
+      </w:pPr>
+      <w:r>
+        <w:rPr>
+          <w:rFonts w:ascii="Consolas" w:eastAsia="Consolas" w:hAnsi="Consolas" w:cs="Consolas"/>
+          <w:color w:val="1F1F1F"/>
+          <w:sz w:val="19"/>
+          <w:szCs w:val="19"/>
+        </w:rPr>
+        <w:t xml:space="preserve">      "moduleCommand": "Input",</w:t>
+      </w:r>
+    </w:p>
+    <w:p>
+      <w:pPr>
+        <w:pBdr>
+          <w:left w:val="single" w:sz="18" w:space="6" w:color="2E75B6"/>
+        </w:pBdr>
+        <w:shd w:val="clear" w:color="auto" w:fill="F2F2F2"/>
+        <w:ind w:left="120"/>
+      </w:pPr>
+      <w:r>
+        <w:rPr>
+          <w:rFonts w:ascii="Consolas" w:eastAsia="Consolas" w:hAnsi="Consolas" w:cs="Consolas"/>
+          <w:color w:val="1F1F1F"/>
+          <w:sz w:val="19"/>
+          <w:szCs w:val="19"/>
+        </w:rPr>
+        <w:t xml:space="preserve">      "addIfMissing": true,</w:t>
+      </w:r>
+    </w:p>
+    <w:p>
+      <w:pPr>
+        <w:pBdr>
+          <w:left w:val="single" w:sz="18" w:space="6" w:color="2E75B6"/>
+        </w:pBdr>
+        <w:shd w:val="clear" w:color="auto" w:fill="F2F2F2"/>
+        <w:ind w:left="120"/>
+      </w:pPr>
+      <w:r>
+        <w:rPr>
+          <w:rFonts w:ascii="Consolas" w:eastAsia="Consolas" w:hAnsi="Consolas" w:cs="Consolas"/>
+          <w:color w:val="1F1F1F"/>
+          <w:sz w:val="19"/>
+          <w:szCs w:val="19"/>
+        </w:rPr>
+        <w:t xml:space="preserve">      "description": "Options come from the module's Input command."</w:t>
+      </w:r>
+    </w:p>
+    <w:p>
+      <w:pPr>
+        <w:pBdr>
+          <w:left w:val="single" w:sz="18" w:space="6" w:color="2E75B6"/>
+        </w:pBdr>
+        <w:shd w:val="clear" w:color="auto" w:fill="F2F2F2"/>
+        <w:ind w:left="120"/>
+      </w:pPr>
+      <w:r>
+        <w:rPr>
+          <w:rFonts w:ascii="Consolas" w:eastAsia="Consolas" w:hAnsi="Consolas" w:cs="Consolas"/>
+          <w:color w:val="1F1F1F"/>
+          <w:sz w:val="19"/>
+          <w:szCs w:val="19"/>
+        </w:rPr>
+        <w:t xml:space="preserve">    }</w:t>
+      </w:r>
+    </w:p>
+    <w:p>
+      <w:pPr>
+        <w:pBdr>
+          <w:left w:val="single" w:sz="18" w:space="6" w:color="2E75B6"/>
+        </w:pBdr>
+        <w:shd w:val="clear" w:color="auto" w:fill="F2F2F2"/>
+        <w:ind w:left="120"/>
+      </w:pPr>
+      <w:r>
+        <w:rPr>
+          <w:rFonts w:ascii="Consolas" w:eastAsia="Consolas" w:hAnsi="Consolas" w:cs="Consolas"/>
+          <w:color w:val="1F1F1F"/>
+          <w:sz w:val="19"/>
+          <w:szCs w:val="19"/>
+        </w:rPr>
+        <w:t xml:space="preserve">  }</w:t>
+      </w:r>
+    </w:p>
+    <w:p>
+      <w:pPr>
+        <w:pBdr>
+          <w:left w:val="single" w:sz="18" w:space="6" w:color="2E75B6"/>
+        </w:pBdr>
+        <w:shd w:val="clear" w:color="auto" w:fill="F2F2F2"/>
+        <w:ind w:left="120"/>
+      </w:pPr>
+      <w:r>
+        <w:rPr>
+          <w:rFonts w:ascii="Consolas" w:eastAsia="Consolas" w:hAnsi="Consolas" w:cs="Consolas"/>
+          <w:color w:val="1F1F1F"/>
+          <w:sz w:val="19"/>
+          <w:szCs w:val="19"/>
+        </w:rPr>
+        <w:t xml:space="preserve">}</w:t>
+      </w:r>
+    </w:p>
+    <w:p>
+      <w:pPr>
+        <w:spacing w:after="120" w:line="276" w:lineRule="auto"/>
+      </w:pPr>
+      <w:r>
+        <w:t xml:space="preserve">When a device type overrides </w:t>
+      </w:r>
+      <w:r>
+        <w:rPr>
+          <w:rFonts w:ascii="Consolas" w:eastAsia="Consolas" w:hAnsi="Consolas" w:cs="Consolas"/>
+          <w:color w:val="A31515"/>
+          <w:sz w:val="19"/>
+          <w:szCs w:val="19"/>
+        </w:rPr>
+        <w:t xml:space="preserve">input</w:t>
+      </w:r>
+      <w:r>
+        <w:t xml:space="preserve"> this way, the built-in input autocomplete (which scans the module for common input strings) is replaced by the schema-driven field for those tabs only.</w:t>
+      </w:r>
+    </w:p>
+    <w:p>
       <w:r>
         <w:br w:type="page"/>
       </w:r>
@@ -6957,13 +6346,7 @@
         <w:t>config.json</w:t>
       </w:r>
       <w:r>
-        <w:t>, there are two structural kinds of top-level block</w:t>
-      </w:r>
-      <w:r>
-        <w:t>s</w:t>
-      </w:r>
-      <w:r>
-        <w:t>, and the schema handles them the same way but the app routes them to different tabs.</w:t>
+        <w:t>, there are two structural kinds of top-level blocks, and the schema handles them the same way but the app routes them to different tabs.</w:t>
       </w:r>
     </w:p>
     <w:p>
@@ -9237,7 +8620,6 @@
             <w:pPr>
               <w:spacing w:after="40" w:line="264" w:lineRule="auto"/>
             </w:pPr>
-            <w:proofErr w:type="spellStart"/>
             <w:r>
               <w:rPr>
                 <w:b/>
@@ -9246,28 +8628,7 @@
                 <w:sz w:val="20"/>
                 <w:szCs w:val="20"/>
               </w:rPr>
-              <w:t>z</w:t>
-            </w:r>
-            <w:r>
-              <w:rPr>
-                <w:b/>
-                <w:bCs/>
-                <w:color w:val="7A4E00"/>
-                <w:sz w:val="20"/>
-                <w:szCs w:val="20"/>
-              </w:rPr>
-              <w:t>Why</w:t>
-            </w:r>
-            <w:proofErr w:type="spellEnd"/>
-            <w:r>
-              <w:rPr>
-                <w:b/>
-                <w:bCs/>
-                <w:color w:val="7A4E00"/>
-                <w:sz w:val="20"/>
-                <w:szCs w:val="20"/>
-              </w:rPr>
-              <w:t xml:space="preserve"> the code says \r but the file says \\r</w:t>
+              <w:t xml:space="preserve">zWhy the code says \r but the file says \\r</w:t>
             </w:r>
           </w:p>
           <w:p>
@@ -9308,7 +8669,6 @@
         <w:pStyle w:val="Heading3"/>
         <w:spacing w:before="180" w:after="80"/>
       </w:pPr>
-      <w:proofErr w:type="spellStart"/>
       <w:r>
         <w:rPr>
           <w:b/>
@@ -9317,18 +8677,7 @@
           <w:sz w:val="22"/>
           <w:szCs w:val="22"/>
         </w:rPr>
-        <w:t>companion_keys</w:t>
-      </w:r>
-      <w:proofErr w:type="spellEnd"/>
-      <w:r>
-        <w:rPr>
-          <w:b/>
-          <w:bCs/>
-          <w:color w:val="1A1A1A"/>
-          <w:sz w:val="22"/>
-          <w:szCs w:val="22"/>
-        </w:rPr>
-        <w:t xml:space="preserve"> — auto-create matching partner keys</w:t>
+        <w:t xml:space="preserve">companion_keys — auto-create matching partner keys</w:t>
       </w:r>
     </w:p>
     <w:p>
@@ -10279,6 +9628,9 @@
       <w:r>
         <w:t>).</w:t>
       </w:r>
+      <w:r>
+        <w:t xml:space="preserve"> The dialog also asks for your preferred accent color — the Classic theme (the default) is built around it, and it can be changed any time under App Config &gt; Theme Style.</w:t>
+      </w:r>
     </w:p>
     <w:p>
       <w:pPr>
@@ -10457,6 +9809,67 @@
       </w:r>
       <w:r>
         <w:t xml:space="preserve"> in App Config. The field now appears wherever the key exists — System tab or device tabs — with no rebuild.</w:t>
+      </w:r>
+    </w:p>
+    <w:p>
+      <w:pPr>
+        <w:pStyle w:val="ListParagraph"/>
+        <w:numPr>
+          <w:ilvl w:val="0"/>
+          <w:numId w:val="7"/>
+        </w:numPr>
+        <w:spacing w:after="70" w:line="268" w:lineRule="auto"/>
+      </w:pPr>
+      <w:r>
+        <w:t xml:space="preserve">For a property that only one device type should have, put the entry under </w:t>
+      </w:r>
+      <w:r>
+        <w:rPr>
+          <w:rFonts w:ascii="Consolas" w:eastAsia="Consolas" w:hAnsi="Consolas" w:cs="Consolas"/>
+          <w:color w:val="A31515"/>
+          <w:sz w:val="19"/>
+          <w:szCs w:val="19"/>
+        </w:rPr>
+        <w:t xml:space="preserve">device_fields</w:t>
+      </w:r>
+      <w:r>
+        <w:t xml:space="preserve"> with the device pattern (e.g. </w:t>
+      </w:r>
+      <w:r>
+        <w:rPr>
+          <w:rFonts w:ascii="Consolas" w:eastAsia="Consolas" w:hAnsi="Consolas" w:cs="Consolas"/>
+          <w:color w:val="A31515"/>
+          <w:sz w:val="19"/>
+          <w:szCs w:val="19"/>
+        </w:rPr>
+        <w:t xml:space="preserve">"PROJECTORDEVICE_*"</w:t>
+      </w:r>
+      <w:r>
+        <w:t xml:space="preserve">) instead of </w:t>
+      </w:r>
+      <w:r>
+        <w:rPr>
+          <w:rFonts w:ascii="Consolas" w:eastAsia="Consolas" w:hAnsi="Consolas" w:cs="Consolas"/>
+          <w:color w:val="A31515"/>
+          <w:sz w:val="19"/>
+          <w:szCs w:val="19"/>
+        </w:rPr>
+        <w:t xml:space="preserve">fields</w:t>
+      </w:r>
+      <w:r>
+        <w:t xml:space="preserve">, and set </w:t>
+      </w:r>
+      <w:r>
+        <w:rPr>
+          <w:rFonts w:ascii="Consolas" w:eastAsia="Consolas" w:hAnsi="Consolas" w:cs="Consolas"/>
+          <w:color w:val="A31515"/>
+          <w:sz w:val="19"/>
+          <w:szCs w:val="19"/>
+        </w:rPr>
+        <w:t xml:space="preserve">addIfMissing: true</w:t>
+      </w:r>
+      <w:r>
+        <w:t xml:space="preserve"> so it appears on those tabs right after Reload Schema.</w:t>
       </w:r>
     </w:p>
     <w:p>
@@ -10586,6 +9999,65 @@
                 <w:szCs w:val="19"/>
               </w:rPr>
               <w:t>Change a field’s label, help text, or info description</w:t>
+            </w:r>
+          </w:p>
+        </w:tc>
+        <w:tc>
+          <w:tcPr>
+            <w:tcW w:w="4260" w:type="dxa"/>
+            <w:shd w:val="clear" w:color="auto" w:fill="FFFFFF"/>
+            <w:tcMar>
+              <w:top w:w="60" w:type="dxa"/>
+              <w:left w:w="100" w:type="dxa"/>
+              <w:bottom w:w="60" w:type="dxa"/>
+              <w:right w:w="100" w:type="dxa"/>
+            </w:tcMar>
+          </w:tcPr>
+          <w:p>
+            <w:pPr>
+              <w:spacing w:line="252" w:lineRule="auto"/>
+            </w:pPr>
+            <w:r>
+              <w:rPr>
+                <w:rFonts w:ascii="Consolas" w:eastAsia="Consolas" w:hAnsi="Consolas" w:cs="Consolas"/>
+                <w:sz w:val="19"/>
+                <w:szCs w:val="19"/>
+              </w:rPr>
+              <w:t>ui_schema.json</w:t>
+            </w:r>
+          </w:p>
+        </w:tc>
+      </w:tr>
+      <w:tr>
+        <w:tblPrEx>
+          <w:tblCellMar>
+            <w:top w:w="0" w:type="dxa"/>
+            <w:bottom w:w="0" w:type="dxa"/>
+          </w:tblCellMar>
+        </w:tblPrEx>
+        <w:tc>
+          <w:tcPr>
+            <w:tcW w:w="5100" w:type="dxa"/>
+            <w:shd w:val="clear" w:color="auto" w:fill="FFFFFF"/>
+            <w:tcMar>
+              <w:top w:w="60" w:type="dxa"/>
+              <w:left w:w="100" w:type="dxa"/>
+              <w:bottom w:w="60" w:type="dxa"/>
+              <w:right w:w="100" w:type="dxa"/>
+            </w:tcMar>
+          </w:tcPr>
+          <w:p>
+            <w:pPr>
+              <w:spacing w:line="252" w:lineRule="auto"/>
+            </w:pPr>
+            <w:r>
+              <w:rPr>
+                <w:b/>
+                <w:bCs/>
+                <w:sz w:val="19"/>
+                <w:szCs w:val="19"/>
+              </w:rPr>
+              <w:t>Add a device-type-only field, or options read from the Python module (device_fields / module_states)</w:t>
             </w:r>
           </w:p>
         </w:tc>

</xml_diff>

<commit_message>
Add text size option
</commit_message>
<xml_diff>
--- a/Room_Config_Builder_Guide.docx
+++ b/Room_Config_Builder_Guide.docx
@@ -1528,7 +1528,7 @@
                 <w:sz w:val="19"/>
                 <w:szCs w:val="19"/>
               </w:rPr>
-              <w:t>Application paths (modules folder, buildings.json, processors.json, template config, ui_schema.json, key_map.json), the Theme Style, and the active deployment target. Reload buttons for the schema and key map live here.</w:t>
+              <w:t>Application paths (modules folder, buildings.json, processors.json, template config, ui_schema.json, key_map.json), the Theme Style and Text Size, and the active deployment target. Reload buttons for the schema and key map live here.</w:t>
             </w:r>
           </w:p>
         </w:tc>
@@ -1546,7 +1546,7 @@
         <w:t xml:space="preserve">Theme Style. </w:t>
       </w:r>
       <w:r>
-        <w:t xml:space="preserve">The App Config tab includes a Theme Style dropdown with two styles, each themed around an accent color picked from the swatch grid shown beneath the dropdown: Classic — the default — is a standard Material look, and Auris is a sci-fi HUD look with its own swatch set (amber, teal, magenta, and more). The sun/moon button on the toolbar still toggles dark and light within whichever style is selected, and every choice is saved and restored on the next launch.</w:t>
+        <w:t xml:space="preserve">The App Config tab includes a Theme Style dropdown with two styles, each themed around an accent color picked from the swatch grid shown beneath the dropdown: Classic — the default — is a standard Material look, and Auris is a sci-fi HUD look with its own swatch set (amber, teal, magenta, and more). The sun/moon button on the toolbar still toggles dark and light within whichever style is selected, and every choice is saved and restored on the next launch. A Text Size dropdown below the theme settings scales all text in the app (Small 85% up to Huge 150%).</w:t>
       </w:r>
     </w:p>
     <w:p>

</xml_diff>

<commit_message>
Remove second color for Auris and change the defaults for devices on load
</commit_message>
<xml_diff>
--- a/Room_Config_Builder_Guide.docx
+++ b/Room_Config_Builder_Guide.docx
@@ -661,6 +661,37 @@
               <w:tab/>
               <w:fldChar w:fldCharType="begin"/>
               <w:instrText xml:space="preserve"> PAGEREF _Toc234507999 \h </w:instrText>
+              <w:fldChar w:fldCharType="separate"/>
+              <w:t>1</w:t>
+              <w:fldChar w:fldCharType="end"/>
+            </w:r>
+          </w:hyperlink>
+        </w:p>
+        <w:p>
+          <w:pPr>
+            <w:pStyle w:val="TOC2"/>
+            <w:tabs>
+              <w:tab w:val="right" w:leader="dot" w:pos="9350"/>
+            </w:tabs>
+            <w:rPr>
+              <w:noProof/>
+            </w:rPr>
+          </w:pPr>
+          <w:hyperlink w:anchor="_Toc234508000" w:history="1">
+            <w:r>
+              <w:rPr>
+                <w:rStyle w:val="Hyperlink"/>
+                <w:noProof/>
+              </w:rPr>
+              <w:t>3.10 Device defaults (device_defaults)</w:t>
+            </w:r>
+            <w:r>
+              <w:rPr>
+                <w:noProof/>
+              </w:rPr>
+              <w:tab/>
+              <w:fldChar w:fldCharType="begin"/>
+              <w:instrText xml:space="preserve"> PAGEREF _Toc234508000 \h </w:instrText>
               <w:fldChar w:fldCharType="separate"/>
               <w:t>1</w:t>
               <w:fldChar w:fldCharType="end"/>
@@ -6310,6 +6341,175 @@
       </w:r>
       <w:r>
         <w:t xml:space="preserve"> this way, the built-in input autocomplete (which scans the module for common input strings) is replaced by the schema-driven field for those tabs only.</w:t>
+      </w:r>
+    </w:p>
+    <w:p>
+      <w:pPr>
+        <w:pStyle w:val="Heading2"/>
+        <w:spacing w:before="240" w:after="100"/>
+      </w:pPr>
+      <w:bookmarkStart w:id="901" w:name="_Toc234508000"/>
+      <w:r>
+        <w:t>3.10 Device defaults (device_defaults)</w:t>
+      </w:r>
+      <w:bookmarkEnd w:id="901"/>
+    </w:p>
+    <w:p>
+      <w:pPr>
+        <w:spacing w:after="120" w:line="276" w:lineRule="auto"/>
+      </w:pPr>
+      <w:r>
+        <w:t xml:space="preserve">Next to </w:t>
+      </w:r>
+      <w:r>
+        <w:rPr>
+          <w:rFonts w:ascii="Consolas" w:eastAsia="Consolas" w:hAnsi="Consolas" w:cs="Consolas"/>
+          <w:color w:val="A31515"/>
+          <w:sz w:val="19"/>
+          <w:szCs w:val="19"/>
+        </w:rPr>
+        <w:t xml:space="preserve">"device_fields"</w:t>
+      </w:r>
+      <w:r>
+        <w:t xml:space="preserve">, a top-level </w:t>
+      </w:r>
+      <w:r>
+        <w:rPr>
+          <w:rFonts w:ascii="Consolas" w:eastAsia="Consolas" w:hAnsi="Consolas" w:cs="Consolas"/>
+          <w:color w:val="A31515"/>
+          <w:sz w:val="19"/>
+          <w:szCs w:val="19"/>
+        </w:rPr>
+        <w:t xml:space="preserve">"device_defaults"</w:t>
+      </w:r>
+      <w:r>
+        <w:t xml:space="preserve"> object maps section patterns to property/value pairs that are merged into every newly created device block of that type when the Setup Wizard counts change. Existing/template values are never overwritten — only missing keys are added — and exact section names (e.g. </w:t>
+      </w:r>
+      <w:r>
+        <w:rPr>
+          <w:rFonts w:ascii="Consolas" w:eastAsia="Consolas" w:hAnsi="Consolas" w:cs="Consolas"/>
+          <w:color w:val="A31515"/>
+          <w:sz w:val="19"/>
+          <w:szCs w:val="19"/>
+        </w:rPr>
+        <w:t xml:space="preserve">"SWITCHERDEVICE_1"</w:t>
+      </w:r>
+      <w:r>
+        <w:t xml:space="preserve">) override wildcard patterns per property. The shipped schema gives projectors </w:t>
+      </w:r>
+      <w:r>
+        <w:rPr>
+          <w:rFonts w:ascii="Consolas" w:eastAsia="Consolas" w:hAnsi="Consolas" w:cs="Consolas"/>
+          <w:color w:val="A31515"/>
+          <w:sz w:val="19"/>
+          <w:szCs w:val="19"/>
+        </w:rPr>
+        <w:t xml:space="preserve">input</w:t>
+      </w:r>
+      <w:r>
+        <w:t xml:space="preserve"> and </w:t>
+      </w:r>
+      <w:r>
+        <w:rPr>
+          <w:rFonts w:ascii="Consolas" w:eastAsia="Consolas" w:hAnsi="Consolas" w:cs="Consolas"/>
+          <w:color w:val="A31515"/>
+          <w:sz w:val="19"/>
+          <w:szCs w:val="19"/>
+        </w:rPr>
+        <w:t xml:space="preserve">relay_host</w:t>
+      </w:r>
+      <w:r>
+        <w:t xml:space="preserve">, DSPs their eleven audio group numbers, and switcher 1 its audio groups. Edit the values and press Reload Schema — no recompile.</w:t>
+      </w:r>
+    </w:p>
+    <w:p>
+      <w:pPr>
+        <w:pBdr>
+          <w:left w:val="single" w:sz="18" w:space="6" w:color="2E75B6"/>
+        </w:pBdr>
+        <w:shd w:val="clear" w:color="auto" w:fill="F2F2F2"/>
+        <w:ind w:left="120"/>
+      </w:pPr>
+      <w:r>
+        <w:rPr>
+          <w:rFonts w:ascii="Consolas" w:eastAsia="Consolas" w:hAnsi="Consolas" w:cs="Consolas"/>
+          <w:color w:val="1F1F1F"/>
+          <w:sz w:val="19"/>
+          <w:szCs w:val="19"/>
+        </w:rPr>
+        <w:t xml:space="preserve">"device_defaults": {</w:t>
+      </w:r>
+    </w:p>
+    <w:p>
+      <w:pPr>
+        <w:pBdr>
+          <w:left w:val="single" w:sz="18" w:space="6" w:color="2E75B6"/>
+        </w:pBdr>
+        <w:shd w:val="clear" w:color="auto" w:fill="F2F2F2"/>
+        <w:ind w:left="120"/>
+      </w:pPr>
+      <w:r>
+        <w:rPr>
+          <w:rFonts w:ascii="Consolas" w:eastAsia="Consolas" w:hAnsi="Consolas" w:cs="Consolas"/>
+          <w:color w:val="1F1F1F"/>
+          <w:sz w:val="19"/>
+          <w:szCs w:val="19"/>
+        </w:rPr>
+        <w:t xml:space="preserve">  "PROJECTORDEVICE_*": { "input": "", "relay_host": "processor1" },</w:t>
+      </w:r>
+    </w:p>
+    <w:p>
+      <w:pPr>
+        <w:pBdr>
+          <w:left w:val="single" w:sz="18" w:space="6" w:color="2E75B6"/>
+        </w:pBdr>
+        <w:shd w:val="clear" w:color="auto" w:fill="F2F2F2"/>
+        <w:ind w:left="120"/>
+      </w:pPr>
+      <w:r>
+        <w:rPr>
+          <w:rFonts w:ascii="Consolas" w:eastAsia="Consolas" w:hAnsi="Consolas" w:cs="Consolas"/>
+          <w:color w:val="1F1F1F"/>
+          <w:sz w:val="19"/>
+          <w:szCs w:val="19"/>
+        </w:rPr>
+        <w:t xml:space="preserve">  "DSPDEVICE_*": { "group_prog_gain": "1", "group_prog_mute": "5", "...": "..." },</w:t>
+      </w:r>
+    </w:p>
+    <w:p>
+      <w:pPr>
+        <w:pBdr>
+          <w:left w:val="single" w:sz="18" w:space="6" w:color="2E75B6"/>
+        </w:pBdr>
+        <w:shd w:val="clear" w:color="auto" w:fill="F2F2F2"/>
+        <w:ind w:left="120"/>
+      </w:pPr>
+      <w:r>
+        <w:rPr>
+          <w:rFonts w:ascii="Consolas" w:eastAsia="Consolas" w:hAnsi="Consolas" w:cs="Consolas"/>
+          <w:color w:val="1F1F1F"/>
+          <w:sz w:val="19"/>
+          <w:szCs w:val="19"/>
+        </w:rPr>
+        <w:t xml:space="preserve">  "SWITCHERDEVICE_1": { "group_mic_gain": "10", "group_prog_gain": "1", "...": "..." }</w:t>
+      </w:r>
+    </w:p>
+    <w:p>
+      <w:pPr>
+        <w:pBdr>
+          <w:left w:val="single" w:sz="18" w:space="6" w:color="2E75B6"/>
+        </w:pBdr>
+        <w:shd w:val="clear" w:color="auto" w:fill="F2F2F2"/>
+        <w:ind w:left="120"/>
+      </w:pPr>
+      <w:r>
+        <w:rPr>
+          <w:rFonts w:ascii="Consolas" w:eastAsia="Consolas" w:hAnsi="Consolas" w:cs="Consolas"/>
+          <w:color w:val="1F1F1F"/>
+          <w:sz w:val="19"/>
+          <w:szCs w:val="19"/>
+        </w:rPr>
+        <w:t xml:space="preserve">}</w:t>
       </w:r>
     </w:p>
     <w:p>

</xml_diff>

<commit_message>
Add toggle to set to default values for files
</commit_message>
<xml_diff>
--- a/Room_Config_Builder_Guide.docx
+++ b/Room_Config_Builder_Guide.docx
@@ -2762,6 +2762,38 @@
           <w:b/>
           <w:bCs/>
         </w:rPr>
+        <w:t xml:space="preserve">Device defaults fill</w:t>
+      </w:r>
+      <w:r>
+        <w:t xml:space="preserve"> — when enabled in App Config (on by default), device blocks missing their type’s </w:t>
+      </w:r>
+      <w:r>
+        <w:rPr>
+          <w:rFonts w:ascii="Consolas" w:eastAsia="Consolas" w:hAnsi="Consolas" w:cs="Consolas"/>
+          <w:color w:val="A31515"/>
+          <w:sz w:val="19"/>
+          <w:szCs w:val="19"/>
+        </w:rPr>
+        <w:t xml:space="preserve">device_defaults</w:t>
+      </w:r>
+      <w:r>
+        <w:t xml:space="preserve"> baseline properties (e.g. a DSP without its audio group numbers) get them added, one DEFAULTS entry per addition.</w:t>
+      </w:r>
+    </w:p>
+    <w:p>
+      <w:pPr>
+        <w:pStyle w:val="ListParagraph"/>
+        <w:numPr>
+          <w:ilvl w:val="0"/>
+          <w:numId w:val="3"/>
+        </w:numPr>
+        <w:spacing w:after="70" w:line="268" w:lineRule="auto"/>
+      </w:pPr>
+      <w:r>
+        <w:rPr>
+          <w:b/>
+          <w:bCs/>
+        </w:rPr>
         <w:t>Auto room name</w:t>
       </w:r>
       <w:r>
@@ -6419,7 +6451,7 @@
         <w:t xml:space="preserve">relay_host</w:t>
       </w:r>
       <w:r>
-        <w:t xml:space="preserve">, DSPs their eleven audio group numbers, and switcher 1 its audio groups. Edit the values and press Reload Schema — no recompile.</w:t>
+        <w:t xml:space="preserve">, DSPs their eleven audio group numbers, and switcher 1 its audio groups. Edit the values and press Reload Schema — no recompile. The same defaults can also be filled into loaded configs: the "Fill missing device defaults when loading" switch in App Config (on by default) adds them during the load pipeline, reported in the acknowledgement dialog.</w:t>
       </w:r>
     </w:p>
     <w:p>

</xml_diff>

<commit_message>
Add devices to the ui schema so everything can be set through the JSON
</commit_message>
<xml_diff>
--- a/Room_Config_Builder_Guide.docx
+++ b/Room_Config_Builder_Guide.docx
@@ -1268,6 +1268,37 @@
               <w:rPr>
                 <w:noProof/>
               </w:rPr>
+              <w:fldChar w:fldCharType="end"/>
+            </w:r>
+          </w:hyperlink>
+        </w:p>
+        <w:p>
+          <w:pPr>
+            <w:pStyle w:val="TOC2"/>
+            <w:tabs>
+              <w:tab w:val="right" w:leader="dot" w:pos="9350"/>
+            </w:tabs>
+            <w:rPr>
+              <w:noProof/>
+            </w:rPr>
+          </w:pPr>
+          <w:hyperlink w:anchor="_Toc234508001" w:history="1">
+            <w:r>
+              <w:rPr>
+                <w:rStyle w:val="Hyperlink"/>
+                <w:noProof/>
+              </w:rPr>
+              <w:t>3.11 Device types (device_types)</w:t>
+            </w:r>
+            <w:r>
+              <w:rPr>
+                <w:noProof/>
+              </w:rPr>
+              <w:tab/>
+              <w:fldChar w:fldCharType="begin"/>
+              <w:instrText xml:space="preserve"> PAGEREF _Toc234508001 \h </w:instrText>
+              <w:fldChar w:fldCharType="separate"/>
+              <w:t>1</w:t>
               <w:fldChar w:fldCharType="end"/>
             </w:r>
           </w:hyperlink>
@@ -7247,6 +7278,187 @@
           <w:szCs w:val="19"/>
         </w:rPr>
         <w:t>}</w:t>
+      </w:r>
+    </w:p>
+    <w:p>
+      <w:pPr>
+        <w:pStyle w:val="Heading2"/>
+        <w:spacing w:before="240" w:after="100"/>
+      </w:pPr>
+      <w:bookmarkStart w:id="902" w:name="_Toc234508001"/>
+      <w:r>
+        <w:t>3.11 Device types (device_types)</w:t>
+      </w:r>
+      <w:bookmarkEnd w:id="902"/>
+    </w:p>
+    <w:p>
+      <w:pPr>
+        <w:spacing w:after="120" w:line="276" w:lineRule="auto"/>
+      </w:pPr>
+      <w:r>
+        <w:t xml:space="preserve">The device families the Setup Wizard manages come from the top-level </w:t>
+      </w:r>
+      <w:r>
+        <w:rPr>
+          <w:rFonts w:ascii="Consolas" w:eastAsia="Consolas" w:hAnsi="Consolas" w:cs="Consolas"/>
+          <w:color w:val="A31515"/>
+          <w:sz w:val="19"/>
+          <w:szCs w:val="19"/>
+        </w:rPr>
+        <w:t xml:space="preserve">"device_types"</w:t>
+      </w:r>
+      <w:r>
+        <w:t xml:space="preserve"> object: each </w:t>
+      </w:r>
+      <w:r>
+        <w:rPr>
+          <w:rFonts w:ascii="Consolas" w:eastAsia="Consolas" w:hAnsi="Consolas" w:cs="Consolas"/>
+          <w:color w:val="A31515"/>
+          <w:sz w:val="19"/>
+          <w:szCs w:val="19"/>
+        </w:rPr>
+        <w:t xml:space="preserve">SYSTEM_SETUP</w:t>
+      </w:r>
+      <w:r>
+        <w:t xml:space="preserve"> </w:t>
+      </w:r>
+      <w:r>
+        <w:rPr>
+          <w:rFonts w:ascii="Consolas" w:eastAsia="Consolas" w:hAnsi="Consolas" w:cs="Consolas"/>
+          <w:color w:val="A31515"/>
+          <w:sz w:val="19"/>
+          <w:szCs w:val="19"/>
+        </w:rPr>
+        <w:t xml:space="preserve">dev_</w:t>
+      </w:r>
+      <w:r>
+        <w:t xml:space="preserve"> count key mapped to its section prefix (required) and wizard label. This list REPLACES the built-in one, so keep every family you want listed; its order is the wizard’s display order. An added family automatically gets a wizard count dropdown, device tabs, export pruning, count audits, and a "0" default injected on load. Pair it with </w:t>
+      </w:r>
+      <w:r>
+        <w:rPr>
+          <w:rFonts w:ascii="Consolas" w:eastAsia="Consolas" w:hAnsi="Consolas" w:cs="Consolas"/>
+          <w:color w:val="A31515"/>
+          <w:sz w:val="19"/>
+          <w:szCs w:val="19"/>
+        </w:rPr>
+        <w:t xml:space="preserve">fields</w:t>
+      </w:r>
+      <w:r>
+        <w:t xml:space="preserve"> / </w:t>
+      </w:r>
+      <w:r>
+        <w:rPr>
+          <w:rFonts w:ascii="Consolas" w:eastAsia="Consolas" w:hAnsi="Consolas" w:cs="Consolas"/>
+          <w:color w:val="A31515"/>
+          <w:sz w:val="19"/>
+          <w:szCs w:val="19"/>
+        </w:rPr>
+        <w:t xml:space="preserve">device_fields</w:t>
+      </w:r>
+      <w:r>
+        <w:t xml:space="preserve"> entries for its properties and </w:t>
+      </w:r>
+      <w:r>
+        <w:rPr>
+          <w:rFonts w:ascii="Consolas" w:eastAsia="Consolas" w:hAnsi="Consolas" w:cs="Consolas"/>
+          <w:color w:val="A31515"/>
+          <w:sz w:val="19"/>
+          <w:szCs w:val="19"/>
+        </w:rPr>
+        <w:t xml:space="preserve">device_defaults</w:t>
+      </w:r>
+      <w:r>
+        <w:t xml:space="preserve"> for its baseline values.</w:t>
+      </w:r>
+    </w:p>
+    <w:p>
+      <w:pPr>
+        <w:pBdr>
+          <w:left w:val="single" w:sz="18" w:space="6" w:color="2E75B6"/>
+        </w:pBdr>
+        <w:shd w:val="clear" w:color="auto" w:fill="F2F2F2"/>
+        <w:ind w:left="120"/>
+      </w:pPr>
+      <w:r>
+        <w:rPr>
+          <w:rFonts w:ascii="Consolas" w:eastAsia="Consolas" w:hAnsi="Consolas" w:cs="Consolas"/>
+          <w:color w:val="1F1F1F"/>
+          <w:sz w:val="19"/>
+          <w:szCs w:val="19"/>
+        </w:rPr>
+        <w:t xml:space="preserve">"device_types": {</w:t>
+      </w:r>
+    </w:p>
+    <w:p>
+      <w:pPr>
+        <w:pBdr>
+          <w:left w:val="single" w:sz="18" w:space="6" w:color="2E75B6"/>
+        </w:pBdr>
+        <w:shd w:val="clear" w:color="auto" w:fill="F2F2F2"/>
+        <w:ind w:left="120"/>
+      </w:pPr>
+      <w:r>
+        <w:rPr>
+          <w:rFonts w:ascii="Consolas" w:eastAsia="Consolas" w:hAnsi="Consolas" w:cs="Consolas"/>
+          <w:color w:val="1F1F1F"/>
+          <w:sz w:val="19"/>
+          <w:szCs w:val="19"/>
+        </w:rPr>
+        <w:t xml:space="preserve">  "dev_projectors": { "prefix": "PROJECTORDEVICE_", "label": "Projectors / Displays" },</w:t>
+      </w:r>
+    </w:p>
+    <w:p>
+      <w:pPr>
+        <w:pBdr>
+          <w:left w:val="single" w:sz="18" w:space="6" w:color="2E75B6"/>
+        </w:pBdr>
+        <w:shd w:val="clear" w:color="auto" w:fill="F2F2F2"/>
+        <w:ind w:left="120"/>
+      </w:pPr>
+      <w:r>
+        <w:rPr>
+          <w:rFonts w:ascii="Consolas" w:eastAsia="Consolas" w:hAnsi="Consolas" w:cs="Consolas"/>
+          <w:color w:val="1F1F1F"/>
+          <w:sz w:val="19"/>
+          <w:szCs w:val="19"/>
+        </w:rPr>
+        <w:t xml:space="preserve">  "dev_lifts":      { "prefix": "LIFTDEVICE_",      "label": "Projector Lifts" },</w:t>
+      </w:r>
+    </w:p>
+    <w:p>
+      <w:pPr>
+        <w:pBdr>
+          <w:left w:val="single" w:sz="18" w:space="6" w:color="2E75B6"/>
+        </w:pBdr>
+        <w:shd w:val="clear" w:color="auto" w:fill="F2F2F2"/>
+        <w:ind w:left="120"/>
+      </w:pPr>
+      <w:r>
+        <w:rPr>
+          <w:rFonts w:ascii="Consolas" w:eastAsia="Consolas" w:hAnsi="Consolas" w:cs="Consolas"/>
+          <w:color w:val="1F1F1F"/>
+          <w:sz w:val="19"/>
+          <w:szCs w:val="19"/>
+        </w:rPr>
+        <w:t xml:space="preserve">  "...": {}</w:t>
+      </w:r>
+    </w:p>
+    <w:p>
+      <w:pPr>
+        <w:pBdr>
+          <w:left w:val="single" w:sz="18" w:space="6" w:color="2E75B6"/>
+        </w:pBdr>
+        <w:shd w:val="clear" w:color="auto" w:fill="F2F2F2"/>
+        <w:ind w:left="120"/>
+      </w:pPr>
+      <w:r>
+        <w:rPr>
+          <w:rFonts w:ascii="Consolas" w:eastAsia="Consolas" w:hAnsi="Consolas" w:cs="Consolas"/>
+          <w:color w:val="1F1F1F"/>
+          <w:sz w:val="19"/>
+          <w:szCs w:val="19"/>
+        </w:rPr>
+        <w:t xml:space="preserve">}</w:t>
       </w:r>
     </w:p>
     <w:p>

</xml_diff>

<commit_message>
Update to remove the last of the hard coded items. Add connection settings to menu.
</commit_message>
<xml_diff>
--- a/Room_Config_Builder_Guide.docx
+++ b/Room_Config_Builder_Guide.docx
@@ -2458,7 +2458,7 @@
                 <w:sz w:val="19"/>
                 <w:szCs w:val="19"/>
               </w:rPr>
-              <w:t>Application paths (modules folder, buildings.json, processors.json, template config, ui_schema.json, key_map.json), the Theme Style and Text Size, and the active deployment target. Reload buttons for the schema and key map live here.</w:t>
+              <w:t>Application paths (modules folder, buildings.json, processors.json, template config, ui_schema.json, key_map.json), the Theme Style and Text Size, the processor connection settings (SFTP username, port, and remote config path — Extron defaults), and the active deployment target. Reload buttons for the schema and key map live here.</w:t>
             </w:r>
           </w:p>
         </w:tc>
@@ -3817,6 +3817,21 @@
         <w:spacing w:after="120" w:line="276" w:lineRule="auto"/>
       </w:pPr>
       <w:r>
+        <w:rPr>
+          <w:b/>
+          <w:bCs/>
+        </w:rPr>
+        <w:t xml:space="preserve">These values are schema-editable: </w:t>
+      </w:r>
+      <w:r>
+        <w:t xml:space="preserve">the SYSTEM_SETUP defaults come from the top-level "system_defaults" object in ui_schema.json (defining it replaces the built-in set), and the dev_ hardware counts are always injected as "0" for every family listed in "device_types".</w:t>
+      </w:r>
+    </w:p>
+    <w:p>
+      <w:pPr>
+        <w:spacing w:after="120" w:line="276" w:lineRule="auto"/>
+      </w:pPr>
+      <w:r>
         <w:t xml:space="preserve">These are hard-coded safety defaults in the migration step (independent of the schema) so the current template can always function. They are only added when </w:t>
       </w:r>
       <w:r>
@@ -7368,7 +7383,7 @@
         <w:t xml:space="preserve">device_defaults</w:t>
       </w:r>
       <w:r>
-        <w:t xml:space="preserve"> for its baseline values.</w:t>
+        <w:t xml:space="preserve"> for its baseline values. Each family also supports optional "max" (the highest count the wizard offers, default 8), "keepAlivePreference" (keep-alive command names tried in order when a new device’s module is parsed), and "template" (the full block used for new devices when the config has no &lt;PREFIX&gt;1 block to copy).</w:t>
       </w:r>
     </w:p>
     <w:p>

</xml_diff>

<commit_message>
Update to add search, change save location for files, add new file button
</commit_message>
<xml_diff>
--- a/Room_Config_Builder_Guide.docx
+++ b/Room_Config_Builder_Guide.docx
@@ -103,6 +103,7 @@
         <w:alias w:val="Contents"/>
         <w:id w:val="-793900112"/>
       </w:sdtPr>
+      <w:sdtEndPr/>
       <w:sdtContent>
         <w:p>
           <w:pPr>
@@ -111,7 +112,13 @@
               <w:tab w:val="right" w:leader="dot" w:pos="9350"/>
             </w:tabs>
             <w:rPr>
+              <w:rFonts w:asciiTheme="minorHAnsi" w:eastAsiaTheme="minorEastAsia" w:hAnsiTheme="minorHAnsi" w:cstheme="minorBidi"/>
               <w:noProof/>
+              <w:color w:val="auto"/>
+              <w:kern w:val="2"/>
+              <w:sz w:val="24"/>
+              <w:szCs w:val="24"/>
+              <w14:ligatures w14:val="standardContextual"/>
             </w:rPr>
           </w:pPr>
           <w:r>
@@ -123,7 +130,7 @@
           <w:r>
             <w:fldChar w:fldCharType="separate"/>
           </w:r>
-          <w:hyperlink w:anchor="_Toc234507103" w:history="1">
+          <w:hyperlink w:anchor="_Toc234829059" w:history="1">
             <w:r>
               <w:rPr>
                 <w:rStyle w:val="Hyperlink"/>
@@ -147,7 +154,7 @@
               <w:rPr>
                 <w:noProof/>
               </w:rPr>
-              <w:instrText xml:space="preserve"> PAGEREF _Toc234507103 \h </w:instrText>
+              <w:instrText xml:space="preserve"> PAGEREF _Toc234829059 \h </w:instrText>
             </w:r>
             <w:r>
               <w:rPr>
@@ -164,7 +171,7 @@
               <w:rPr>
                 <w:noProof/>
               </w:rPr>
-              <w:t>1</w:t>
+              <w:t>3</w:t>
             </w:r>
             <w:r>
               <w:rPr>
@@ -181,10 +188,16 @@
               <w:tab w:val="right" w:leader="dot" w:pos="9350"/>
             </w:tabs>
             <w:rPr>
+              <w:rFonts w:asciiTheme="minorHAnsi" w:eastAsiaTheme="minorEastAsia" w:hAnsiTheme="minorHAnsi" w:cstheme="minorBidi"/>
               <w:noProof/>
+              <w:color w:val="auto"/>
+              <w:kern w:val="2"/>
+              <w:sz w:val="24"/>
+              <w:szCs w:val="24"/>
+              <w14:ligatures w14:val="standardContextual"/>
             </w:rPr>
           </w:pPr>
-          <w:hyperlink w:anchor="_Toc234507104" w:history="1">
+          <w:hyperlink w:anchor="_Toc234829060" w:history="1">
             <w:r>
               <w:rPr>
                 <w:rStyle w:val="Hyperlink"/>
@@ -208,7 +221,7 @@
               <w:rPr>
                 <w:noProof/>
               </w:rPr>
-              <w:instrText xml:space="preserve"> PAGEREF _Toc234507104 \h </w:instrText>
+              <w:instrText xml:space="preserve"> PAGEREF _Toc234829060 \h </w:instrText>
             </w:r>
             <w:r>
               <w:rPr>
@@ -225,7 +238,7 @@
               <w:rPr>
                 <w:noProof/>
               </w:rPr>
-              <w:t>1</w:t>
+              <w:t>3</w:t>
             </w:r>
             <w:r>
               <w:rPr>
@@ -242,10 +255,16 @@
               <w:tab w:val="right" w:leader="dot" w:pos="9350"/>
             </w:tabs>
             <w:rPr>
+              <w:rFonts w:asciiTheme="minorHAnsi" w:eastAsiaTheme="minorEastAsia" w:hAnsiTheme="minorHAnsi" w:cstheme="minorBidi"/>
               <w:noProof/>
+              <w:color w:val="auto"/>
+              <w:kern w:val="2"/>
+              <w:sz w:val="24"/>
+              <w:szCs w:val="24"/>
+              <w14:ligatures w14:val="standardContextual"/>
             </w:rPr>
           </w:pPr>
-          <w:hyperlink w:anchor="_Toc234507105" w:history="1">
+          <w:hyperlink w:anchor="_Toc234829061" w:history="1">
             <w:r>
               <w:rPr>
                 <w:rStyle w:val="Hyperlink"/>
@@ -269,7 +288,7 @@
               <w:rPr>
                 <w:noProof/>
               </w:rPr>
-              <w:instrText xml:space="preserve"> PAGEREF _Toc234507105 \h </w:instrText>
+              <w:instrText xml:space="preserve"> PAGEREF _Toc234829061 \h </w:instrText>
             </w:r>
             <w:r>
               <w:rPr>
@@ -286,7 +305,7 @@
               <w:rPr>
                 <w:noProof/>
               </w:rPr>
-              <w:t>1</w:t>
+              <w:t>3</w:t>
             </w:r>
             <w:r>
               <w:rPr>
@@ -303,10 +322,16 @@
               <w:tab w:val="right" w:leader="dot" w:pos="9350"/>
             </w:tabs>
             <w:rPr>
+              <w:rFonts w:asciiTheme="minorHAnsi" w:eastAsiaTheme="minorEastAsia" w:hAnsiTheme="minorHAnsi" w:cstheme="minorBidi"/>
               <w:noProof/>
+              <w:color w:val="auto"/>
+              <w:kern w:val="2"/>
+              <w:sz w:val="24"/>
+              <w:szCs w:val="24"/>
+              <w14:ligatures w14:val="standardContextual"/>
             </w:rPr>
           </w:pPr>
-          <w:hyperlink w:anchor="_Toc234507106" w:history="1">
+          <w:hyperlink w:anchor="_Toc234829062" w:history="1">
             <w:r>
               <w:rPr>
                 <w:rStyle w:val="Hyperlink"/>
@@ -330,7 +355,7 @@
               <w:rPr>
                 <w:noProof/>
               </w:rPr>
-              <w:instrText xml:space="preserve"> PAGEREF _Toc234507106 \h </w:instrText>
+              <w:instrText xml:space="preserve"> PAGEREF _Toc234829062 \h </w:instrText>
             </w:r>
             <w:r>
               <w:rPr>
@@ -347,7 +372,7 @@
               <w:rPr>
                 <w:noProof/>
               </w:rPr>
-              <w:t>1</w:t>
+              <w:t>6</w:t>
             </w:r>
             <w:r>
               <w:rPr>
@@ -364,10 +389,16 @@
               <w:tab w:val="right" w:leader="dot" w:pos="9350"/>
             </w:tabs>
             <w:rPr>
+              <w:rFonts w:asciiTheme="minorHAnsi" w:eastAsiaTheme="minorEastAsia" w:hAnsiTheme="minorHAnsi" w:cstheme="minorBidi"/>
               <w:noProof/>
+              <w:color w:val="auto"/>
+              <w:kern w:val="2"/>
+              <w:sz w:val="24"/>
+              <w:szCs w:val="24"/>
+              <w14:ligatures w14:val="standardContextual"/>
             </w:rPr>
           </w:pPr>
-          <w:hyperlink w:anchor="_Toc234507107" w:history="1">
+          <w:hyperlink w:anchor="_Toc234829063" w:history="1">
             <w:r>
               <w:rPr>
                 <w:rStyle w:val="Hyperlink"/>
@@ -391,7 +422,7 @@
               <w:rPr>
                 <w:noProof/>
               </w:rPr>
-              <w:instrText xml:space="preserve"> PAGEREF _Toc234507107 \h </w:instrText>
+              <w:instrText xml:space="preserve"> PAGEREF _Toc234829063 \h </w:instrText>
             </w:r>
             <w:r>
               <w:rPr>
@@ -408,7 +439,7 @@
               <w:rPr>
                 <w:noProof/>
               </w:rPr>
-              <w:t>1</w:t>
+              <w:t>6</w:t>
             </w:r>
             <w:r>
               <w:rPr>
@@ -425,10 +456,16 @@
               <w:tab w:val="right" w:leader="dot" w:pos="9350"/>
             </w:tabs>
             <w:rPr>
+              <w:rFonts w:asciiTheme="minorHAnsi" w:eastAsiaTheme="minorEastAsia" w:hAnsiTheme="minorHAnsi" w:cstheme="minorBidi"/>
               <w:noProof/>
+              <w:color w:val="auto"/>
+              <w:kern w:val="2"/>
+              <w:sz w:val="24"/>
+              <w:szCs w:val="24"/>
+              <w14:ligatures w14:val="standardContextual"/>
             </w:rPr>
           </w:pPr>
-          <w:hyperlink w:anchor="_Toc234507108" w:history="1">
+          <w:hyperlink w:anchor="_Toc234829064" w:history="1">
             <w:r>
               <w:rPr>
                 <w:rStyle w:val="Hyperlink"/>
@@ -452,7 +489,7 @@
               <w:rPr>
                 <w:noProof/>
               </w:rPr>
-              <w:instrText xml:space="preserve"> PAGEREF _Toc234507108 \h </w:instrText>
+              <w:instrText xml:space="preserve"> PAGEREF _Toc234829064 \h </w:instrText>
             </w:r>
             <w:r>
               <w:rPr>
@@ -469,7 +506,7 @@
               <w:rPr>
                 <w:noProof/>
               </w:rPr>
-              <w:t>1</w:t>
+              <w:t>6</w:t>
             </w:r>
             <w:r>
               <w:rPr>
@@ -486,10 +523,16 @@
               <w:tab w:val="right" w:leader="dot" w:pos="9350"/>
             </w:tabs>
             <w:rPr>
+              <w:rFonts w:asciiTheme="minorHAnsi" w:eastAsiaTheme="minorEastAsia" w:hAnsiTheme="minorHAnsi" w:cstheme="minorBidi"/>
               <w:noProof/>
+              <w:color w:val="auto"/>
+              <w:kern w:val="2"/>
+              <w:sz w:val="24"/>
+              <w:szCs w:val="24"/>
+              <w14:ligatures w14:val="standardContextual"/>
             </w:rPr>
           </w:pPr>
-          <w:hyperlink w:anchor="_Toc234507109" w:history="1">
+          <w:hyperlink w:anchor="_Toc234829065" w:history="1">
             <w:r>
               <w:rPr>
                 <w:rStyle w:val="Hyperlink"/>
@@ -513,7 +556,7 @@
               <w:rPr>
                 <w:noProof/>
               </w:rPr>
-              <w:instrText xml:space="preserve"> PAGEREF _Toc234507109 \h </w:instrText>
+              <w:instrText xml:space="preserve"> PAGEREF _Toc234829065 \h </w:instrText>
             </w:r>
             <w:r>
               <w:rPr>
@@ -530,7 +573,7 @@
               <w:rPr>
                 <w:noProof/>
               </w:rPr>
-              <w:t>1</w:t>
+              <w:t>7</w:t>
             </w:r>
             <w:r>
               <w:rPr>
@@ -547,10 +590,16 @@
               <w:tab w:val="right" w:leader="dot" w:pos="9350"/>
             </w:tabs>
             <w:rPr>
+              <w:rFonts w:asciiTheme="minorHAnsi" w:eastAsiaTheme="minorEastAsia" w:hAnsiTheme="minorHAnsi" w:cstheme="minorBidi"/>
               <w:noProof/>
+              <w:color w:val="auto"/>
+              <w:kern w:val="2"/>
+              <w:sz w:val="24"/>
+              <w:szCs w:val="24"/>
+              <w14:ligatures w14:val="standardContextual"/>
             </w:rPr>
           </w:pPr>
-          <w:hyperlink w:anchor="_Toc234507110" w:history="1">
+          <w:hyperlink w:anchor="_Toc234829066" w:history="1">
             <w:r>
               <w:rPr>
                 <w:rStyle w:val="Hyperlink"/>
@@ -574,7 +623,7 @@
               <w:rPr>
                 <w:noProof/>
               </w:rPr>
-              <w:instrText xml:space="preserve"> PAGEREF _Toc234507110 \h </w:instrText>
+              <w:instrText xml:space="preserve"> PAGEREF _Toc234829066 \h </w:instrText>
             </w:r>
             <w:r>
               <w:rPr>
@@ -591,7 +640,7 @@
               <w:rPr>
                 <w:noProof/>
               </w:rPr>
-              <w:t>1</w:t>
+              <w:t>7</w:t>
             </w:r>
             <w:r>
               <w:rPr>
@@ -608,10 +657,16 @@
               <w:tab w:val="right" w:leader="dot" w:pos="9350"/>
             </w:tabs>
             <w:rPr>
+              <w:rFonts w:asciiTheme="minorHAnsi" w:eastAsiaTheme="minorEastAsia" w:hAnsiTheme="minorHAnsi" w:cstheme="minorBidi"/>
               <w:noProof/>
+              <w:color w:val="auto"/>
+              <w:kern w:val="2"/>
+              <w:sz w:val="24"/>
+              <w:szCs w:val="24"/>
+              <w14:ligatures w14:val="standardContextual"/>
             </w:rPr>
           </w:pPr>
-          <w:hyperlink w:anchor="_Toc234507111" w:history="1">
+          <w:hyperlink w:anchor="_Toc234829067" w:history="1">
             <w:r>
               <w:rPr>
                 <w:rStyle w:val="Hyperlink"/>
@@ -635,7 +690,7 @@
               <w:rPr>
                 <w:noProof/>
               </w:rPr>
-              <w:instrText xml:space="preserve"> PAGEREF _Toc234507111 \h </w:instrText>
+              <w:instrText xml:space="preserve"> PAGEREF _Toc234829067 \h </w:instrText>
             </w:r>
             <w:r>
               <w:rPr>
@@ -652,7 +707,7 @@
               <w:rPr>
                 <w:noProof/>
               </w:rPr>
-              <w:t>1</w:t>
+              <w:t>8</w:t>
             </w:r>
             <w:r>
               <w:rPr>
@@ -669,10 +724,16 @@
               <w:tab w:val="right" w:leader="dot" w:pos="9350"/>
             </w:tabs>
             <w:rPr>
+              <w:rFonts w:asciiTheme="minorHAnsi" w:eastAsiaTheme="minorEastAsia" w:hAnsiTheme="minorHAnsi" w:cstheme="minorBidi"/>
               <w:noProof/>
+              <w:color w:val="auto"/>
+              <w:kern w:val="2"/>
+              <w:sz w:val="24"/>
+              <w:szCs w:val="24"/>
+              <w14:ligatures w14:val="standardContextual"/>
             </w:rPr>
           </w:pPr>
-          <w:hyperlink w:anchor="_Toc234507112" w:history="1">
+          <w:hyperlink w:anchor="_Toc234829068" w:history="1">
             <w:r>
               <w:rPr>
                 <w:rStyle w:val="Hyperlink"/>
@@ -696,7 +757,7 @@
               <w:rPr>
                 <w:noProof/>
               </w:rPr>
-              <w:instrText xml:space="preserve"> PAGEREF _Toc234507112 \h </w:instrText>
+              <w:instrText xml:space="preserve"> PAGEREF _Toc234829068 \h </w:instrText>
             </w:r>
             <w:r>
               <w:rPr>
@@ -713,7 +774,7 @@
               <w:rPr>
                 <w:noProof/>
               </w:rPr>
-              <w:t>1</w:t>
+              <w:t>8</w:t>
             </w:r>
             <w:r>
               <w:rPr>
@@ -730,10 +791,16 @@
               <w:tab w:val="right" w:leader="dot" w:pos="9350"/>
             </w:tabs>
             <w:rPr>
+              <w:rFonts w:asciiTheme="minorHAnsi" w:eastAsiaTheme="minorEastAsia" w:hAnsiTheme="minorHAnsi" w:cstheme="minorBidi"/>
               <w:noProof/>
+              <w:color w:val="auto"/>
+              <w:kern w:val="2"/>
+              <w:sz w:val="24"/>
+              <w:szCs w:val="24"/>
+              <w14:ligatures w14:val="standardContextual"/>
             </w:rPr>
           </w:pPr>
-          <w:hyperlink w:anchor="_Toc234507113" w:history="1">
+          <w:hyperlink w:anchor="_Toc234829069" w:history="1">
             <w:r>
               <w:rPr>
                 <w:rStyle w:val="Hyperlink"/>
@@ -757,7 +824,7 @@
               <w:rPr>
                 <w:noProof/>
               </w:rPr>
-              <w:instrText xml:space="preserve"> PAGEREF _Toc234507113 \h </w:instrText>
+              <w:instrText xml:space="preserve"> PAGEREF _Toc234829069 \h </w:instrText>
             </w:r>
             <w:r>
               <w:rPr>
@@ -774,7 +841,7 @@
               <w:rPr>
                 <w:noProof/>
               </w:rPr>
-              <w:t>1</w:t>
+              <w:t>8</w:t>
             </w:r>
             <w:r>
               <w:rPr>
@@ -791,10 +858,16 @@
               <w:tab w:val="right" w:leader="dot" w:pos="9350"/>
             </w:tabs>
             <w:rPr>
+              <w:rFonts w:asciiTheme="minorHAnsi" w:eastAsiaTheme="minorEastAsia" w:hAnsiTheme="minorHAnsi" w:cstheme="minorBidi"/>
               <w:noProof/>
+              <w:color w:val="auto"/>
+              <w:kern w:val="2"/>
+              <w:sz w:val="24"/>
+              <w:szCs w:val="24"/>
+              <w14:ligatures w14:val="standardContextual"/>
             </w:rPr>
           </w:pPr>
-          <w:hyperlink w:anchor="_Toc234507114" w:history="1">
+          <w:hyperlink w:anchor="_Toc234829070" w:history="1">
             <w:r>
               <w:rPr>
                 <w:rStyle w:val="Hyperlink"/>
@@ -818,7 +891,7 @@
               <w:rPr>
                 <w:noProof/>
               </w:rPr>
-              <w:instrText xml:space="preserve"> PAGEREF _Toc234507114 \h </w:instrText>
+              <w:instrText xml:space="preserve"> PAGEREF _Toc234829070 \h </w:instrText>
             </w:r>
             <w:r>
               <w:rPr>
@@ -835,7 +908,7 @@
               <w:rPr>
                 <w:noProof/>
               </w:rPr>
-              <w:t>1</w:t>
+              <w:t>8</w:t>
             </w:r>
             <w:r>
               <w:rPr>
@@ -852,10 +925,16 @@
               <w:tab w:val="right" w:leader="dot" w:pos="9350"/>
             </w:tabs>
             <w:rPr>
+              <w:rFonts w:asciiTheme="minorHAnsi" w:eastAsiaTheme="minorEastAsia" w:hAnsiTheme="minorHAnsi" w:cstheme="minorBidi"/>
               <w:noProof/>
+              <w:color w:val="auto"/>
+              <w:kern w:val="2"/>
+              <w:sz w:val="24"/>
+              <w:szCs w:val="24"/>
+              <w14:ligatures w14:val="standardContextual"/>
             </w:rPr>
           </w:pPr>
-          <w:hyperlink w:anchor="_Toc234507115" w:history="1">
+          <w:hyperlink w:anchor="_Toc234829071" w:history="1">
             <w:r>
               <w:rPr>
                 <w:rStyle w:val="Hyperlink"/>
@@ -879,7 +958,7 @@
               <w:rPr>
                 <w:noProof/>
               </w:rPr>
-              <w:instrText xml:space="preserve"> PAGEREF _Toc234507115 \h </w:instrText>
+              <w:instrText xml:space="preserve"> PAGEREF _Toc234829071 \h </w:instrText>
             </w:r>
             <w:r>
               <w:rPr>
@@ -896,7 +975,7 @@
               <w:rPr>
                 <w:noProof/>
               </w:rPr>
-              <w:t>1</w:t>
+              <w:t>9</w:t>
             </w:r>
             <w:r>
               <w:rPr>
@@ -913,10 +992,16 @@
               <w:tab w:val="right" w:leader="dot" w:pos="9350"/>
             </w:tabs>
             <w:rPr>
+              <w:rFonts w:asciiTheme="minorHAnsi" w:eastAsiaTheme="minorEastAsia" w:hAnsiTheme="minorHAnsi" w:cstheme="minorBidi"/>
               <w:noProof/>
+              <w:color w:val="auto"/>
+              <w:kern w:val="2"/>
+              <w:sz w:val="24"/>
+              <w:szCs w:val="24"/>
+              <w14:ligatures w14:val="standardContextual"/>
             </w:rPr>
           </w:pPr>
-          <w:hyperlink w:anchor="_Toc234507116" w:history="1">
+          <w:hyperlink w:anchor="_Toc234829072" w:history="1">
             <w:r>
               <w:rPr>
                 <w:rStyle w:val="Hyperlink"/>
@@ -940,7 +1025,7 @@
               <w:rPr>
                 <w:noProof/>
               </w:rPr>
-              <w:instrText xml:space="preserve"> PAGEREF _Toc234507116 \h </w:instrText>
+              <w:instrText xml:space="preserve"> PAGEREF _Toc234829072 \h </w:instrText>
             </w:r>
             <w:r>
               <w:rPr>
@@ -957,7 +1042,7 @@
               <w:rPr>
                 <w:noProof/>
               </w:rPr>
-              <w:t>1</w:t>
+              <w:t>9</w:t>
             </w:r>
             <w:r>
               <w:rPr>
@@ -974,10 +1059,16 @@
               <w:tab w:val="right" w:leader="dot" w:pos="9350"/>
             </w:tabs>
             <w:rPr>
+              <w:rFonts w:asciiTheme="minorHAnsi" w:eastAsiaTheme="minorEastAsia" w:hAnsiTheme="minorHAnsi" w:cstheme="minorBidi"/>
               <w:noProof/>
+              <w:color w:val="auto"/>
+              <w:kern w:val="2"/>
+              <w:sz w:val="24"/>
+              <w:szCs w:val="24"/>
+              <w14:ligatures w14:val="standardContextual"/>
             </w:rPr>
           </w:pPr>
-          <w:hyperlink w:anchor="_Toc234507117" w:history="1">
+          <w:hyperlink w:anchor="_Toc234829073" w:history="1">
             <w:r>
               <w:rPr>
                 <w:rStyle w:val="Hyperlink"/>
@@ -1001,7 +1092,7 @@
               <w:rPr>
                 <w:noProof/>
               </w:rPr>
-              <w:instrText xml:space="preserve"> PAGEREF _Toc234507117 \h </w:instrText>
+              <w:instrText xml:space="preserve"> PAGEREF _Toc234829073 \h </w:instrText>
             </w:r>
             <w:r>
               <w:rPr>
@@ -1018,7 +1109,7 @@
               <w:rPr>
                 <w:noProof/>
               </w:rPr>
-              <w:t>1</w:t>
+              <w:t>10</w:t>
             </w:r>
             <w:r>
               <w:rPr>
@@ -1035,10 +1126,16 @@
               <w:tab w:val="right" w:leader="dot" w:pos="9350"/>
             </w:tabs>
             <w:rPr>
+              <w:rFonts w:asciiTheme="minorHAnsi" w:eastAsiaTheme="minorEastAsia" w:hAnsiTheme="minorHAnsi" w:cstheme="minorBidi"/>
               <w:noProof/>
+              <w:color w:val="auto"/>
+              <w:kern w:val="2"/>
+              <w:sz w:val="24"/>
+              <w:szCs w:val="24"/>
+              <w14:ligatures w14:val="standardContextual"/>
             </w:rPr>
           </w:pPr>
-          <w:hyperlink w:anchor="_Toc234507118" w:history="1">
+          <w:hyperlink w:anchor="_Toc234829074" w:history="1">
             <w:r>
               <w:rPr>
                 <w:rStyle w:val="Hyperlink"/>
@@ -1062,7 +1159,7 @@
               <w:rPr>
                 <w:noProof/>
               </w:rPr>
-              <w:instrText xml:space="preserve"> PAGEREF _Toc234507118 \h </w:instrText>
+              <w:instrText xml:space="preserve"> PAGEREF _Toc234829074 \h </w:instrText>
             </w:r>
             <w:r>
               <w:rPr>
@@ -1079,7 +1176,7 @@
               <w:rPr>
                 <w:noProof/>
               </w:rPr>
-              <w:t>1</w:t>
+              <w:t>10</w:t>
             </w:r>
             <w:r>
               <w:rPr>
@@ -1096,10 +1193,16 @@
               <w:tab w:val="right" w:leader="dot" w:pos="9350"/>
             </w:tabs>
             <w:rPr>
+              <w:rFonts w:asciiTheme="minorHAnsi" w:eastAsiaTheme="minorEastAsia" w:hAnsiTheme="minorHAnsi" w:cstheme="minorBidi"/>
               <w:noProof/>
+              <w:color w:val="auto"/>
+              <w:kern w:val="2"/>
+              <w:sz w:val="24"/>
+              <w:szCs w:val="24"/>
+              <w14:ligatures w14:val="standardContextual"/>
             </w:rPr>
           </w:pPr>
-          <w:hyperlink w:anchor="_Toc234507119" w:history="1">
+          <w:hyperlink w:anchor="_Toc234829075" w:history="1">
             <w:r>
               <w:rPr>
                 <w:rStyle w:val="Hyperlink"/>
@@ -1123,7 +1226,7 @@
               <w:rPr>
                 <w:noProof/>
               </w:rPr>
-              <w:instrText xml:space="preserve"> PAGEREF _Toc234507119 \h </w:instrText>
+              <w:instrText xml:space="preserve"> PAGEREF _Toc234829075 \h </w:instrText>
             </w:r>
             <w:r>
               <w:rPr>
@@ -1140,7 +1243,7 @@
               <w:rPr>
                 <w:noProof/>
               </w:rPr>
-              <w:t>1</w:t>
+              <w:t>10</w:t>
             </w:r>
             <w:r>
               <w:rPr>
@@ -1157,10 +1260,16 @@
               <w:tab w:val="right" w:leader="dot" w:pos="9350"/>
             </w:tabs>
             <w:rPr>
+              <w:rFonts w:asciiTheme="minorHAnsi" w:eastAsiaTheme="minorEastAsia" w:hAnsiTheme="minorHAnsi" w:cstheme="minorBidi"/>
               <w:noProof/>
+              <w:color w:val="auto"/>
+              <w:kern w:val="2"/>
+              <w:sz w:val="24"/>
+              <w:szCs w:val="24"/>
+              <w14:ligatures w14:val="standardContextual"/>
             </w:rPr>
           </w:pPr>
-          <w:hyperlink w:anchor="_Toc234507999" w:history="1">
+          <w:hyperlink w:anchor="_Toc234829076" w:history="1">
             <w:r>
               <w:rPr>
                 <w:rStyle w:val="Hyperlink"/>
@@ -1184,7 +1293,7 @@
               <w:rPr>
                 <w:noProof/>
               </w:rPr>
-              <w:instrText xml:space="preserve"> PAGEREF _Toc234507999 \h </w:instrText>
+              <w:instrText xml:space="preserve"> PAGEREF _Toc234829076 \h </w:instrText>
             </w:r>
             <w:r>
               <w:rPr>
@@ -1201,7 +1310,7 @@
               <w:rPr>
                 <w:noProof/>
               </w:rPr>
-              <w:t>1</w:t>
+              <w:t>10</w:t>
             </w:r>
             <w:r>
               <w:rPr>
@@ -1218,10 +1327,16 @@
               <w:tab w:val="right" w:leader="dot" w:pos="9350"/>
             </w:tabs>
             <w:rPr>
+              <w:rFonts w:asciiTheme="minorHAnsi" w:eastAsiaTheme="minorEastAsia" w:hAnsiTheme="minorHAnsi" w:cstheme="minorBidi"/>
               <w:noProof/>
+              <w:color w:val="auto"/>
+              <w:kern w:val="2"/>
+              <w:sz w:val="24"/>
+              <w:szCs w:val="24"/>
+              <w14:ligatures w14:val="standardContextual"/>
             </w:rPr>
           </w:pPr>
-          <w:hyperlink w:anchor="_Toc234508000" w:history="1">
+          <w:hyperlink w:anchor="_Toc234829077" w:history="1">
             <w:r>
               <w:rPr>
                 <w:rStyle w:val="Hyperlink"/>
@@ -1245,7 +1360,7 @@
               <w:rPr>
                 <w:noProof/>
               </w:rPr>
-              <w:instrText xml:space="preserve"> PAGEREF _Toc234508000 \h </w:instrText>
+              <w:instrText xml:space="preserve"> PAGEREF _Toc234829077 \h </w:instrText>
             </w:r>
             <w:r>
               <w:rPr>
@@ -1262,7 +1377,7 @@
               <w:rPr>
                 <w:noProof/>
               </w:rPr>
-              <w:t>1</w:t>
+              <w:t>11</w:t>
             </w:r>
             <w:r>
               <w:rPr>
@@ -1279,10 +1394,16 @@
               <w:tab w:val="right" w:leader="dot" w:pos="9350"/>
             </w:tabs>
             <w:rPr>
+              <w:rFonts w:asciiTheme="minorHAnsi" w:eastAsiaTheme="minorEastAsia" w:hAnsiTheme="minorHAnsi" w:cstheme="minorBidi"/>
               <w:noProof/>
+              <w:color w:val="auto"/>
+              <w:kern w:val="2"/>
+              <w:sz w:val="24"/>
+              <w:szCs w:val="24"/>
+              <w14:ligatures w14:val="standardContextual"/>
             </w:rPr>
           </w:pPr>
-          <w:hyperlink w:anchor="_Toc234508001" w:history="1">
+          <w:hyperlink w:anchor="_Toc234829078" w:history="1">
             <w:r>
               <w:rPr>
                 <w:rStyle w:val="Hyperlink"/>
@@ -1295,10 +1416,40 @@
                 <w:noProof/>
               </w:rPr>
               <w:tab/>
+            </w:r>
+            <w:r>
+              <w:rPr>
+                <w:noProof/>
+              </w:rPr>
               <w:fldChar w:fldCharType="begin"/>
-              <w:instrText xml:space="preserve"> PAGEREF _Toc234508001 \h </w:instrText>
+            </w:r>
+            <w:r>
+              <w:rPr>
+                <w:noProof/>
+              </w:rPr>
+              <w:instrText xml:space="preserve"> PAGEREF _Toc234829078 \h </w:instrText>
+            </w:r>
+            <w:r>
+              <w:rPr>
+                <w:noProof/>
+              </w:rPr>
+            </w:r>
+            <w:r>
+              <w:rPr>
+                <w:noProof/>
+              </w:rPr>
               <w:fldChar w:fldCharType="separate"/>
-              <w:t>1</w:t>
+            </w:r>
+            <w:r>
+              <w:rPr>
+                <w:noProof/>
+              </w:rPr>
+              <w:t>11</w:t>
+            </w:r>
+            <w:r>
+              <w:rPr>
+                <w:noProof/>
+              </w:rPr>
               <w:fldChar w:fldCharType="end"/>
             </w:r>
           </w:hyperlink>
@@ -1310,10 +1461,16 @@
               <w:tab w:val="right" w:leader="dot" w:pos="9350"/>
             </w:tabs>
             <w:rPr>
+              <w:rFonts w:asciiTheme="minorHAnsi" w:eastAsiaTheme="minorEastAsia" w:hAnsiTheme="minorHAnsi" w:cstheme="minorBidi"/>
               <w:noProof/>
+              <w:color w:val="auto"/>
+              <w:kern w:val="2"/>
+              <w:sz w:val="24"/>
+              <w:szCs w:val="24"/>
+              <w14:ligatures w14:val="standardContextual"/>
             </w:rPr>
           </w:pPr>
-          <w:hyperlink w:anchor="_Toc234507120" w:history="1">
+          <w:hyperlink w:anchor="_Toc234829079" w:history="1">
             <w:r>
               <w:rPr>
                 <w:rStyle w:val="Hyperlink"/>
@@ -1337,7 +1494,7 @@
               <w:rPr>
                 <w:noProof/>
               </w:rPr>
-              <w:instrText xml:space="preserve"> PAGEREF _Toc234507120 \h </w:instrText>
+              <w:instrText xml:space="preserve"> PAGEREF _Toc234829079 \h </w:instrText>
             </w:r>
             <w:r>
               <w:rPr>
@@ -1354,7 +1511,7 @@
               <w:rPr>
                 <w:noProof/>
               </w:rPr>
-              <w:t>1</w:t>
+              <w:t>12</w:t>
             </w:r>
             <w:r>
               <w:rPr>
@@ -1371,10 +1528,16 @@
               <w:tab w:val="right" w:leader="dot" w:pos="9350"/>
             </w:tabs>
             <w:rPr>
+              <w:rFonts w:asciiTheme="minorHAnsi" w:eastAsiaTheme="minorEastAsia" w:hAnsiTheme="minorHAnsi" w:cstheme="minorBidi"/>
               <w:noProof/>
+              <w:color w:val="auto"/>
+              <w:kern w:val="2"/>
+              <w:sz w:val="24"/>
+              <w:szCs w:val="24"/>
+              <w14:ligatures w14:val="standardContextual"/>
             </w:rPr>
           </w:pPr>
-          <w:hyperlink w:anchor="_Toc234507121" w:history="1">
+          <w:hyperlink w:anchor="_Toc234829080" w:history="1">
             <w:r>
               <w:rPr>
                 <w:rStyle w:val="Hyperlink"/>
@@ -1398,7 +1561,7 @@
               <w:rPr>
                 <w:noProof/>
               </w:rPr>
-              <w:instrText xml:space="preserve"> PAGEREF _Toc234507121 \h </w:instrText>
+              <w:instrText xml:space="preserve"> PAGEREF _Toc234829080 \h </w:instrText>
             </w:r>
             <w:r>
               <w:rPr>
@@ -1415,7 +1578,7 @@
               <w:rPr>
                 <w:noProof/>
               </w:rPr>
-              <w:t>1</w:t>
+              <w:t>12</w:t>
             </w:r>
             <w:r>
               <w:rPr>
@@ -1432,10 +1595,16 @@
               <w:tab w:val="right" w:leader="dot" w:pos="9350"/>
             </w:tabs>
             <w:rPr>
+              <w:rFonts w:asciiTheme="minorHAnsi" w:eastAsiaTheme="minorEastAsia" w:hAnsiTheme="minorHAnsi" w:cstheme="minorBidi"/>
               <w:noProof/>
+              <w:color w:val="auto"/>
+              <w:kern w:val="2"/>
+              <w:sz w:val="24"/>
+              <w:szCs w:val="24"/>
+              <w14:ligatures w14:val="standardContextual"/>
             </w:rPr>
           </w:pPr>
-          <w:hyperlink w:anchor="_Toc234507122" w:history="1">
+          <w:hyperlink w:anchor="_Toc234829081" w:history="1">
             <w:r>
               <w:rPr>
                 <w:rStyle w:val="Hyperlink"/>
@@ -1459,7 +1628,7 @@
               <w:rPr>
                 <w:noProof/>
               </w:rPr>
-              <w:instrText xml:space="preserve"> PAGEREF _Toc234507122 \h </w:instrText>
+              <w:instrText xml:space="preserve"> PAGEREF _Toc234829081 \h </w:instrText>
             </w:r>
             <w:r>
               <w:rPr>
@@ -1476,7 +1645,7 @@
               <w:rPr>
                 <w:noProof/>
               </w:rPr>
-              <w:t>1</w:t>
+              <w:t>12</w:t>
             </w:r>
             <w:r>
               <w:rPr>
@@ -1493,10 +1662,16 @@
               <w:tab w:val="right" w:leader="dot" w:pos="9350"/>
             </w:tabs>
             <w:rPr>
+              <w:rFonts w:asciiTheme="minorHAnsi" w:eastAsiaTheme="minorEastAsia" w:hAnsiTheme="minorHAnsi" w:cstheme="minorBidi"/>
               <w:noProof/>
+              <w:color w:val="auto"/>
+              <w:kern w:val="2"/>
+              <w:sz w:val="24"/>
+              <w:szCs w:val="24"/>
+              <w14:ligatures w14:val="standardContextual"/>
             </w:rPr>
           </w:pPr>
-          <w:hyperlink w:anchor="_Toc234507123" w:history="1">
+          <w:hyperlink w:anchor="_Toc234829082" w:history="1">
             <w:r>
               <w:rPr>
                 <w:rStyle w:val="Hyperlink"/>
@@ -1520,7 +1695,7 @@
               <w:rPr>
                 <w:noProof/>
               </w:rPr>
-              <w:instrText xml:space="preserve"> PAGEREF _Toc234507123 \h </w:instrText>
+              <w:instrText xml:space="preserve"> PAGEREF _Toc234829082 \h </w:instrText>
             </w:r>
             <w:r>
               <w:rPr>
@@ -1537,7 +1712,7 @@
               <w:rPr>
                 <w:noProof/>
               </w:rPr>
-              <w:t>1</w:t>
+              <w:t>12</w:t>
             </w:r>
             <w:r>
               <w:rPr>
@@ -1554,10 +1729,16 @@
               <w:tab w:val="right" w:leader="dot" w:pos="9350"/>
             </w:tabs>
             <w:rPr>
+              <w:rFonts w:asciiTheme="minorHAnsi" w:eastAsiaTheme="minorEastAsia" w:hAnsiTheme="minorHAnsi" w:cstheme="minorBidi"/>
               <w:noProof/>
+              <w:color w:val="auto"/>
+              <w:kern w:val="2"/>
+              <w:sz w:val="24"/>
+              <w:szCs w:val="24"/>
+              <w14:ligatures w14:val="standardContextual"/>
             </w:rPr>
           </w:pPr>
-          <w:hyperlink w:anchor="_Toc234507124" w:history="1">
+          <w:hyperlink w:anchor="_Toc234829083" w:history="1">
             <w:r>
               <w:rPr>
                 <w:rStyle w:val="Hyperlink"/>
@@ -1581,7 +1762,7 @@
               <w:rPr>
                 <w:noProof/>
               </w:rPr>
-              <w:instrText xml:space="preserve"> PAGEREF _Toc234507124 \h </w:instrText>
+              <w:instrText xml:space="preserve"> PAGEREF _Toc234829083 \h </w:instrText>
             </w:r>
             <w:r>
               <w:rPr>
@@ -1598,7 +1779,7 @@
               <w:rPr>
                 <w:noProof/>
               </w:rPr>
-              <w:t>1</w:t>
+              <w:t>13</w:t>
             </w:r>
             <w:r>
               <w:rPr>
@@ -1615,10 +1796,16 @@
               <w:tab w:val="right" w:leader="dot" w:pos="9350"/>
             </w:tabs>
             <w:rPr>
+              <w:rFonts w:asciiTheme="minorHAnsi" w:eastAsiaTheme="minorEastAsia" w:hAnsiTheme="minorHAnsi" w:cstheme="minorBidi"/>
               <w:noProof/>
+              <w:color w:val="auto"/>
+              <w:kern w:val="2"/>
+              <w:sz w:val="24"/>
+              <w:szCs w:val="24"/>
+              <w14:ligatures w14:val="standardContextual"/>
             </w:rPr>
           </w:pPr>
-          <w:hyperlink w:anchor="_Toc234507125" w:history="1">
+          <w:hyperlink w:anchor="_Toc234829084" w:history="1">
             <w:r>
               <w:rPr>
                 <w:rStyle w:val="Hyperlink"/>
@@ -1642,7 +1829,7 @@
               <w:rPr>
                 <w:noProof/>
               </w:rPr>
-              <w:instrText xml:space="preserve"> PAGEREF _Toc234507125 \h </w:instrText>
+              <w:instrText xml:space="preserve"> PAGEREF _Toc234829084 \h </w:instrText>
             </w:r>
             <w:r>
               <w:rPr>
@@ -1659,7 +1846,7 @@
               <w:rPr>
                 <w:noProof/>
               </w:rPr>
-              <w:t>1</w:t>
+              <w:t>13</w:t>
             </w:r>
             <w:r>
               <w:rPr>
@@ -1676,10 +1863,16 @@
               <w:tab w:val="right" w:leader="dot" w:pos="9350"/>
             </w:tabs>
             <w:rPr>
+              <w:rFonts w:asciiTheme="minorHAnsi" w:eastAsiaTheme="minorEastAsia" w:hAnsiTheme="minorHAnsi" w:cstheme="minorBidi"/>
               <w:noProof/>
+              <w:color w:val="auto"/>
+              <w:kern w:val="2"/>
+              <w:sz w:val="24"/>
+              <w:szCs w:val="24"/>
+              <w14:ligatures w14:val="standardContextual"/>
             </w:rPr>
           </w:pPr>
-          <w:hyperlink w:anchor="_Toc234507126" w:history="1">
+          <w:hyperlink w:anchor="_Toc234829085" w:history="1">
             <w:r>
               <w:rPr>
                 <w:rStyle w:val="Hyperlink"/>
@@ -1703,7 +1896,7 @@
               <w:rPr>
                 <w:noProof/>
               </w:rPr>
-              <w:instrText xml:space="preserve"> PAGEREF _Toc234507126 \h </w:instrText>
+              <w:instrText xml:space="preserve"> PAGEREF _Toc234829085 \h </w:instrText>
             </w:r>
             <w:r>
               <w:rPr>
@@ -1720,7 +1913,7 @@
               <w:rPr>
                 <w:noProof/>
               </w:rPr>
-              <w:t>1</w:t>
+              <w:t>13</w:t>
             </w:r>
             <w:r>
               <w:rPr>
@@ -1737,10 +1930,16 @@
               <w:tab w:val="right" w:leader="dot" w:pos="9350"/>
             </w:tabs>
             <w:rPr>
+              <w:rFonts w:asciiTheme="minorHAnsi" w:eastAsiaTheme="minorEastAsia" w:hAnsiTheme="minorHAnsi" w:cstheme="minorBidi"/>
               <w:noProof/>
+              <w:color w:val="auto"/>
+              <w:kern w:val="2"/>
+              <w:sz w:val="24"/>
+              <w:szCs w:val="24"/>
+              <w14:ligatures w14:val="standardContextual"/>
             </w:rPr>
           </w:pPr>
-          <w:hyperlink w:anchor="_Toc234507127" w:history="1">
+          <w:hyperlink w:anchor="_Toc234829086" w:history="1">
             <w:r>
               <w:rPr>
                 <w:rStyle w:val="Hyperlink"/>
@@ -1764,7 +1963,7 @@
               <w:rPr>
                 <w:noProof/>
               </w:rPr>
-              <w:instrText xml:space="preserve"> PAGEREF _Toc234507127 \h </w:instrText>
+              <w:instrText xml:space="preserve"> PAGEREF _Toc234829086 \h </w:instrText>
             </w:r>
             <w:r>
               <w:rPr>
@@ -1781,7 +1980,7 @@
               <w:rPr>
                 <w:noProof/>
               </w:rPr>
-              <w:t>1</w:t>
+              <w:t>17</w:t>
             </w:r>
             <w:r>
               <w:rPr>
@@ -1798,10 +1997,16 @@
               <w:tab w:val="right" w:leader="dot" w:pos="9350"/>
             </w:tabs>
             <w:rPr>
+              <w:rFonts w:asciiTheme="minorHAnsi" w:eastAsiaTheme="minorEastAsia" w:hAnsiTheme="minorHAnsi" w:cstheme="minorBidi"/>
               <w:noProof/>
+              <w:color w:val="auto"/>
+              <w:kern w:val="2"/>
+              <w:sz w:val="24"/>
+              <w:szCs w:val="24"/>
+              <w14:ligatures w14:val="standardContextual"/>
             </w:rPr>
           </w:pPr>
-          <w:hyperlink w:anchor="_Toc234507128" w:history="1">
+          <w:hyperlink w:anchor="_Toc234829087" w:history="1">
             <w:r>
               <w:rPr>
                 <w:rStyle w:val="Hyperlink"/>
@@ -1825,7 +2030,7 @@
               <w:rPr>
                 <w:noProof/>
               </w:rPr>
-              <w:instrText xml:space="preserve"> PAGEREF _Toc234507128 \h </w:instrText>
+              <w:instrText xml:space="preserve"> PAGEREF _Toc234829087 \h </w:instrText>
             </w:r>
             <w:r>
               <w:rPr>
@@ -1842,7 +2047,7 @@
               <w:rPr>
                 <w:noProof/>
               </w:rPr>
-              <w:t>1</w:t>
+              <w:t>17</w:t>
             </w:r>
             <w:r>
               <w:rPr>
@@ -1859,10 +2064,16 @@
               <w:tab w:val="right" w:leader="dot" w:pos="9350"/>
             </w:tabs>
             <w:rPr>
+              <w:rFonts w:asciiTheme="minorHAnsi" w:eastAsiaTheme="minorEastAsia" w:hAnsiTheme="minorHAnsi" w:cstheme="minorBidi"/>
               <w:noProof/>
+              <w:color w:val="auto"/>
+              <w:kern w:val="2"/>
+              <w:sz w:val="24"/>
+              <w:szCs w:val="24"/>
+              <w14:ligatures w14:val="standardContextual"/>
             </w:rPr>
           </w:pPr>
-          <w:hyperlink w:anchor="_Toc234507129" w:history="1">
+          <w:hyperlink w:anchor="_Toc234829088" w:history="1">
             <w:r>
               <w:rPr>
                 <w:rStyle w:val="Hyperlink"/>
@@ -1886,7 +2097,7 @@
               <w:rPr>
                 <w:noProof/>
               </w:rPr>
-              <w:instrText xml:space="preserve"> PAGEREF _Toc234507129 \h </w:instrText>
+              <w:instrText xml:space="preserve"> PAGEREF _Toc234829088 \h </w:instrText>
             </w:r>
             <w:r>
               <w:rPr>
@@ -1903,7 +2114,7 @@
               <w:rPr>
                 <w:noProof/>
               </w:rPr>
-              <w:t>1</w:t>
+              <w:t>17</w:t>
             </w:r>
             <w:r>
               <w:rPr>
@@ -1920,10 +2131,16 @@
               <w:tab w:val="right" w:leader="dot" w:pos="9350"/>
             </w:tabs>
             <w:rPr>
+              <w:rFonts w:asciiTheme="minorHAnsi" w:eastAsiaTheme="minorEastAsia" w:hAnsiTheme="minorHAnsi" w:cstheme="minorBidi"/>
               <w:noProof/>
+              <w:color w:val="auto"/>
+              <w:kern w:val="2"/>
+              <w:sz w:val="24"/>
+              <w:szCs w:val="24"/>
+              <w14:ligatures w14:val="standardContextual"/>
             </w:rPr>
           </w:pPr>
-          <w:hyperlink w:anchor="_Toc234507130" w:history="1">
+          <w:hyperlink w:anchor="_Toc234829089" w:history="1">
             <w:r>
               <w:rPr>
                 <w:rStyle w:val="Hyperlink"/>
@@ -1947,7 +2164,7 @@
               <w:rPr>
                 <w:noProof/>
               </w:rPr>
-              <w:instrText xml:space="preserve"> PAGEREF _Toc234507130 \h </w:instrText>
+              <w:instrText xml:space="preserve"> PAGEREF _Toc234829089 \h </w:instrText>
             </w:r>
             <w:r>
               <w:rPr>
@@ -1964,7 +2181,7 @@
               <w:rPr>
                 <w:noProof/>
               </w:rPr>
-              <w:t>1</w:t>
+              <w:t>17</w:t>
             </w:r>
             <w:r>
               <w:rPr>
@@ -1991,7 +2208,7 @@
         <w:pStyle w:val="Heading1"/>
         <w:spacing w:before="360" w:after="140"/>
       </w:pPr>
-      <w:bookmarkStart w:id="0" w:name="_Toc234507103"/>
+      <w:bookmarkStart w:id="0" w:name="_Toc234829059"/>
       <w:r>
         <w:lastRenderedPageBreak/>
         <w:t>1. What the program is</w:t>
@@ -2107,7 +2324,7 @@
         <w:pStyle w:val="Heading2"/>
         <w:spacing w:before="240" w:after="100"/>
       </w:pPr>
-      <w:bookmarkStart w:id="1" w:name="_Toc234507104"/>
+      <w:bookmarkStart w:id="1" w:name="_Toc234829060"/>
       <w:r>
         <w:t>1.1 The five tabs</w:t>
       </w:r>
@@ -2242,7 +2459,16 @@
                 <w:sz w:val="19"/>
                 <w:szCs w:val="19"/>
               </w:rPr>
-              <w:t>Room identity (building, room number, full room name) and hardware quantities. Setting a device count here generates or removes that device’s blocks and its detail tabs. Picking a building stores its building code in gve_bldg (e.g. "BSS"), and gui_full_room_name is auto-generated from the full building name in Title Case plus the room number. A Hardware Options section below the counts edits dev_ settings that are not device counts (e.g. dev_relay_power, dev_screen_control), rendered from the UI schema.</w:t>
+              <w:t>Room identity (building, room number, full room name) and hardware quantities. Setting a device count here generates or removes that device’s blocks and its detail tabs. Picking a building stores its building code in gve_bldg (e.g. "BSS"), and gui_full_room_name is auto-generated from the full building name in Title Case plus the room number. A Hardware Options section below the counts edits dev_ settings that are not device counts (e.g. dev_relay_power, dev_screen_control), rendered from the UI schema; dev</w:t>
+            </w:r>
+            <w:r>
+              <w:rPr>
+                <w:b/>
+                <w:bCs/>
+                <w:sz w:val="19"/>
+                <w:szCs w:val="19"/>
+              </w:rPr>
+              <w:t>_screen_control is a dropdown offering Relay, Serial, or Serial over Ethernet.</w:t>
             </w:r>
           </w:p>
         </w:tc>
@@ -2458,7 +2684,7 @@
                 <w:sz w:val="19"/>
                 <w:szCs w:val="19"/>
               </w:rPr>
-              <w:t>Application paths (modules folder, buildings.json, processors.json, template config, ui_schema.json, key_map.json), the Theme Style and Text Size, the processor connection settings (SFTP username, port, and remote config path — Extron defaults), and the active deployment target. Reload buttons for the schema and key map live here.</w:t>
+              <w:t>Application paths (modules folder, buildings.json, processors.json, template config, ui_schema.json, key_map.json), the Theme Style and Text Size, the processor connection settings (SFTP username, port, and remote config path — Extron defaults), and the active deployment target. Reload buttons for the schema and key map live here. Every setting on this tab is saved automatically to app_config.json in the app’s root folder (see 1.2).</w:t>
             </w:r>
           </w:p>
         </w:tc>
@@ -2485,7 +2711,10 @@
         <w:t xml:space="preserve">Theme Style. </w:t>
       </w:r>
       <w:r>
-        <w:t>The App Config tab includes a Theme Style dropdown with two styles, each themed around an accent color picked from the swatch grid shown beneath the dropdown: Classic — the default — is a standard Material look, and Auris is a sci-fi HUD look with its own swatch set (amber, teal, magenta, and more). The sun/moon button on the toolbar still toggles dark and light within whichever style is selected, and every choice is saved and restored on the next launch. A Text Size dropdown below the theme settings scales all text in the app (Small 85% up to Huge 150%).</w:t>
+        <w:t>The App Config tab includes a Theme Style dropdown with two styles, each themed around an accent color picked from the swatch grid shown beneath the dropdown: Classic — the default — is a standard Material look, and Auris is a sci-fi HUD look with its own swatch set (amber, teal, magenta, and more). The sun/moon button on the toolbar still toggles dark and light within whichever style is selected, and every choice is saved and restored on the next launch. A Text Size dropdown below the theme settings scales</w:t>
+      </w:r>
+      <w:r>
+        <w:t xml:space="preserve"> all text in the app (Small 85% up to Huge 150%).</w:t>
       </w:r>
     </w:p>
     <w:p>
@@ -2493,7 +2722,7 @@
         <w:pStyle w:val="Heading2"/>
         <w:spacing w:before="240" w:after="100"/>
       </w:pPr>
-      <w:bookmarkStart w:id="2" w:name="_Toc234507105"/>
+      <w:bookmarkStart w:id="2" w:name="_Toc234829061"/>
       <w:r>
         <w:t>1.2 The supporting files you point the app at</w:t>
       </w:r>
@@ -2541,9 +2770,9 @@
       </w:tblPr>
       <w:tblGrid>
         <w:gridCol w:w="25"/>
-        <w:gridCol w:w="2479"/>
-        <w:gridCol w:w="3329"/>
-        <w:gridCol w:w="3527"/>
+        <w:gridCol w:w="2424"/>
+        <w:gridCol w:w="3267"/>
+        <w:gridCol w:w="3644"/>
       </w:tblGrid>
       <w:tr>
         <w:trPr>
@@ -2573,7 +2802,6 @@
                 <w:sz w:val="19"/>
                 <w:szCs w:val="19"/>
               </w:rPr>
-              <w:lastRenderedPageBreak/>
               <w:t>File / path</w:t>
             </w:r>
           </w:p>
@@ -3103,7 +3331,7 @@
                 <w:sz w:val="19"/>
                 <w:szCs w:val="19"/>
               </w:rPr>
-              <w:t>Deployment rooms/targets for the "Active Deployment Target" dropdown (supplies IP for SFTP). Read automatically on startup.</w:t>
+              <w:t>Deployment rooms/targets for the searchable "Active Deployment Target" picker and the room search in the SFTP Upload/Download dialogs (supplies the processor IP); the full building names shown come from buildings.json. Read automatically on startup.</w:t>
             </w:r>
           </w:p>
         </w:tc>
@@ -3226,12 +3454,12 @@
                 <w:sz w:val="20"/>
                 <w:szCs w:val="20"/>
               </w:rPr>
-              <w:t>First launch: the setup dialog</w:t>
-            </w:r>
-          </w:p>
-          <w:p>
-            <w:pPr>
-              <w:spacing w:line="264" w:lineRule="auto"/>
+              <w:t>Where settings are stored: app_config.json</w:t>
+            </w:r>
+          </w:p>
+          <w:p>
+            <w:pPr>
+              <w:spacing w:after="120" w:line="264" w:lineRule="auto"/>
             </w:pPr>
             <w:r>
               <w:rPr>
@@ -3239,7 +3467,51 @@
                 <w:sz w:val="20"/>
                 <w:szCs w:val="20"/>
               </w:rPr>
-              <w:t>The very first time the app runs (no settings saved yet), a one-time setup dialog asks where each of these files is located. Pick the Root Folder first — every file found inside it turns green automatically — then Browse only for files stored elsewhere. Each choice is saved the moment it is picked. Finishing (or skipping) the dialog records the setup as complete, so the check is bypassed on every later launch; existing installs that already have saved paths are never asked. The same dialog can be re-opened any time with the "Run First-Time Setup" button at the top of App Config.</w:t>
+              <w:t>Every application setting — the paths above, the SFTP connection settings, the theme, and the text size — is saved automatically to a plain app_config.json in the app’s root folder (the working directory, or the folder next to the executable). The file is created with working defaults on the very first launch, so the app always starts and runs even when no folder or location has ever been selected. It can be inspected or hand-edited while the app is closed, and it travels with the app. Settings saved by old</w:t>
+            </w:r>
+            <w:r>
+              <w:rPr>
+                <w:color w:val="5A3D00"/>
+                <w:sz w:val="20"/>
+                <w:szCs w:val="20"/>
+              </w:rPr>
+              <w:t>er versions in the hidden OS preference store are imported into the file automatically, once. The exact file in use is shown at the top of the App Config tab.</w:t>
+            </w:r>
+          </w:p>
+          <w:p>
+            <w:pPr>
+              <w:spacing w:after="40" w:line="264" w:lineRule="auto"/>
+            </w:pPr>
+            <w:r>
+              <w:rPr>
+                <w:b/>
+                <w:bCs/>
+                <w:color w:val="7A4E00"/>
+                <w:sz w:val="20"/>
+                <w:szCs w:val="20"/>
+              </w:rPr>
+              <w:t>First launch: the setup dialog</w:t>
+            </w:r>
+          </w:p>
+          <w:p>
+            <w:pPr>
+              <w:spacing w:line="264" w:lineRule="auto"/>
+            </w:pPr>
+            <w:r>
+              <w:rPr>
+                <w:color w:val="5A3D00"/>
+                <w:sz w:val="20"/>
+                <w:szCs w:val="20"/>
+              </w:rPr>
+              <w:t xml:space="preserve">The very first time the app runs (no settings saved yet), a one-time setup dialog asks where each of these files is located. Pick the Root Folder first — every file found inside it turns green automatically — then Browse only for files stored elsewhere. Each choice is saved the moment it is picked. Finishing (or skipping) the dialog records the setup as complete, so the check is bypassed on every later launch; existing installs that already have saved paths are never asked. The same dialog can be re-opened </w:t>
+            </w:r>
+            <w:r>
+              <w:rPr>
+                <w:color w:val="5A3D00"/>
+                <w:sz w:val="20"/>
+                <w:szCs w:val="20"/>
+              </w:rPr>
+              <w:t>any time with the "Run First-Time Setup" button at the top of App Config. Skipping is always safe: app_config.json is created with working defaults either way, so the app never depends on a folder or location being chosen in order to start.</w:t>
             </w:r>
           </w:p>
         </w:tc>
@@ -3296,7 +3568,16 @@
                 <w:sz w:val="20"/>
                 <w:szCs w:val="20"/>
               </w:rPr>
-              <w:t>An explicit path always wins. A blank path falls back to the file name shown above inside the Root Folder; a blank Root Folder falls back to the working directory. ui_schema.json and key_map.json additionally keep their old search (working directory, then next to the executable) when no root-folder copy exists. processors.json and buildings.json are read on boot from wherever they resolve. If a file is missing or invalid, the app logs it and falls back to built-in behavior — a broken or absent file can never take the editor down or block a config from loading.</w:t>
+              <w:t xml:space="preserve">An explicit path always wins. A blank path falls back to the file name shown above inside the Root Folder; a blank Root Folder falls back to the working directory. ui_schema.json and key_map.json additionally keep their </w:t>
+            </w:r>
+            <w:r>
+              <w:rPr>
+                <w:color w:val="5A3D00"/>
+                <w:sz w:val="20"/>
+                <w:szCs w:val="20"/>
+              </w:rPr>
+              <w:lastRenderedPageBreak/>
+              <w:t>old search (working directory, then next to the executable) when no root-folder copy exists. processors.json and buildings.json are read on boot from wherever they resolve. If a file is missing or invalid, the app logs it and falls back to built-in behavior — a broken or absent file can never take the editor down or block a config from loading.</w:t>
             </w:r>
           </w:p>
         </w:tc>
@@ -3304,6 +3585,7 @@
     </w:tbl>
     <w:p>
       <w:r>
+        <w:lastRenderedPageBreak/>
         <w:br w:type="page"/>
       </w:r>
     </w:p>
@@ -3312,7 +3594,7 @@
         <w:pStyle w:val="Heading1"/>
         <w:spacing w:before="360" w:after="140"/>
       </w:pPr>
-      <w:bookmarkStart w:id="3" w:name="_Toc234507106"/>
+      <w:bookmarkStart w:id="3" w:name="_Toc234829062"/>
       <w:r>
         <w:lastRenderedPageBreak/>
         <w:t>2. How a config moves through the program</w:t>
@@ -3324,7 +3606,7 @@
         <w:pStyle w:val="Heading2"/>
         <w:spacing w:before="240" w:after="100"/>
       </w:pPr>
-      <w:bookmarkStart w:id="4" w:name="_Toc234507107"/>
+      <w:bookmarkStart w:id="4" w:name="_Toc234829063"/>
       <w:r>
         <w:t>2.1 Getting a config into memory</w:t>
       </w:r>
@@ -3367,7 +3649,7 @@
         <w:t>dev_</w:t>
       </w:r>
       <w:r>
-        <w:t xml:space="preserve"> count to 0, and prunes all device blocks. This is the only time the template file is actually read into the editor.</w:t>
+        <w:t xml:space="preserve"> count to 0, and prunes all device blocks. This is the only time the template file is actually read into the editor. The New Config toolbar button (also offered on the landing screen) is always available; when a config is already loaded it asks for confirmation before replacing it.</w:t>
       </w:r>
     </w:p>
     <w:p>
@@ -3431,7 +3713,7 @@
         <w:t>/config.json</w:t>
       </w:r>
       <w:r>
-        <w:t xml:space="preserve"> off the processor, asks where to save the working copy, then runs the same load pipeline.</w:t>
+        <w:t xml:space="preserve"> off the processor, asks where to save the working copy, then runs the same load pipeline. The dialog includes a searchable room/building dropdown (rooms from processors.json, building names from buildings.json) that fills the processor IP and drives the backup naming.</w:t>
       </w:r>
     </w:p>
     <w:p>
@@ -3439,7 +3721,7 @@
         <w:pStyle w:val="Heading2"/>
         <w:spacing w:before="240" w:after="100"/>
       </w:pPr>
-      <w:bookmarkStart w:id="5" w:name="_Toc234507108"/>
+      <w:bookmarkStart w:id="5" w:name="_Toc234829064"/>
       <w:r>
         <w:t>2.2 The load pipeline</w:t>
       </w:r>
@@ -3805,9 +4087,8 @@
         <w:pStyle w:val="Heading2"/>
         <w:spacing w:before="240" w:after="100"/>
       </w:pPr>
-      <w:bookmarkStart w:id="6" w:name="_Toc234507109"/>
-      <w:r>
-        <w:lastRenderedPageBreak/>
+      <w:bookmarkStart w:id="6" w:name="_Toc234829065"/>
+      <w:r>
         <w:t>2.3 Baseline SYSTEM_SETUP defaults injected on load</w:t>
       </w:r>
       <w:bookmarkEnd w:id="6"/>
@@ -3824,7 +4105,7 @@
         <w:t xml:space="preserve">These values are schema-editable: </w:t>
       </w:r>
       <w:r>
-        <w:t xml:space="preserve">the SYSTEM_SETUP defaults come from the top-level "system_defaults" object in ui_schema.json (defining it replaces the built-in set), and the dev_ hardware counts are always injected as "0" for every family listed in "device_types".</w:t>
+        <w:t>the SYSTEM_SETUP defaults come from the top-level "system_defaults" object in ui_schema.json (defining it replaces the built-in set), and the dev_ hardware counts are always injected as "0" for every family listed in "device_types".</w:t>
       </w:r>
     </w:p>
     <w:p>
@@ -4052,7 +4333,7 @@
         <w:pStyle w:val="Heading2"/>
         <w:spacing w:before="240" w:after="100"/>
       </w:pPr>
-      <w:bookmarkStart w:id="7" w:name="_Toc234507110"/>
+      <w:bookmarkStart w:id="7" w:name="_Toc234829066"/>
       <w:r>
         <w:t>2.4 Getting a config back out</w:t>
       </w:r>
@@ -4143,7 +4424,7 @@
         <w:t>Whereused.csv</w:t>
       </w:r>
       <w:r>
-        <w:t>.</w:t>
+        <w:t>. The upload dialog has the same searchable room/building dropdown as the download dialog for picking the target processor.</w:t>
       </w:r>
     </w:p>
     <w:p>
@@ -4296,9 +4577,8 @@
         <w:pStyle w:val="Heading1"/>
         <w:spacing w:before="360" w:after="140"/>
       </w:pPr>
-      <w:bookmarkStart w:id="8" w:name="_Toc234507111"/>
-      <w:r>
-        <w:lastRenderedPageBreak/>
+      <w:bookmarkStart w:id="8" w:name="_Toc234829067"/>
+      <w:r>
         <w:t>3. Setting up ui_schema.json</w:t>
       </w:r>
       <w:bookmarkEnd w:id="8"/>
@@ -4340,7 +4620,7 @@
         <w:pStyle w:val="Heading2"/>
         <w:spacing w:before="240" w:after="100"/>
       </w:pPr>
-      <w:bookmarkStart w:id="9" w:name="_Toc234507112"/>
+      <w:bookmarkStart w:id="9" w:name="_Toc234829068"/>
       <w:r>
         <w:t>3.1 File skeleton</w:t>
       </w:r>
@@ -4591,7 +4871,7 @@
         <w:pStyle w:val="Heading2"/>
         <w:spacing w:before="240" w:after="100"/>
       </w:pPr>
-      <w:bookmarkStart w:id="10" w:name="_Toc234507113"/>
+      <w:bookmarkStart w:id="10" w:name="_Toc234829069"/>
       <w:r>
         <w:t>3.2 The properties every field entry supports</w:t>
       </w:r>
@@ -5107,7 +5387,7 @@
         <w:pStyle w:val="Heading2"/>
         <w:spacing w:before="240" w:after="100"/>
       </w:pPr>
-      <w:bookmarkStart w:id="11" w:name="_Toc234507114"/>
+      <w:bookmarkStart w:id="11" w:name="_Toc234829070"/>
       <w:r>
         <w:t>3.3 Field types</w:t>
       </w:r>
@@ -5638,7 +5918,6 @@
                 <w:sz w:val="19"/>
                 <w:szCs w:val="19"/>
               </w:rPr>
-              <w:lastRenderedPageBreak/>
               <w:t>dropdown</w:t>
             </w:r>
           </w:p>
@@ -5939,7 +6218,7 @@
         <w:pStyle w:val="Heading2"/>
         <w:spacing w:before="240" w:after="100"/>
       </w:pPr>
-      <w:bookmarkStart w:id="12" w:name="_Toc234507115"/>
+      <w:bookmarkStart w:id="12" w:name="_Toc234829071"/>
       <w:r>
         <w:t>3.4 Dropdown options: two forms</w:t>
       </w:r>
@@ -6086,7 +6365,7 @@
         <w:pStyle w:val="Heading2"/>
         <w:spacing w:before="240" w:after="100"/>
       </w:pPr>
-      <w:bookmarkStart w:id="13" w:name="_Toc234507116"/>
+      <w:bookmarkStart w:id="13" w:name="_Toc234829072"/>
       <w:r>
         <w:t>3.5 Combo fields (one dropdown that writes several keys)</w:t>
       </w:r>
@@ -6399,9 +6678,8 @@
         <w:pStyle w:val="Heading2"/>
         <w:spacing w:before="240" w:after="100"/>
       </w:pPr>
-      <w:bookmarkStart w:id="14" w:name="_Toc234507117"/>
-      <w:r>
-        <w:lastRenderedPageBreak/>
+      <w:bookmarkStart w:id="14" w:name="_Toc234829073"/>
+      <w:r>
         <w:t>3.6 Wildcards for families of keys</w:t>
       </w:r>
       <w:bookmarkEnd w:id="14"/>
@@ -6583,7 +6861,7 @@
         <w:pStyle w:val="Heading2"/>
         <w:spacing w:before="240" w:after="100"/>
       </w:pPr>
-      <w:bookmarkStart w:id="15" w:name="_Toc234507118"/>
+      <w:bookmarkStart w:id="15" w:name="_Toc234829074"/>
       <w:r>
         <w:t>3.7 Unknown keys and the fallback chain</w:t>
       </w:r>
@@ -6677,7 +6955,7 @@
         <w:pStyle w:val="Heading2"/>
         <w:spacing w:before="240" w:after="100"/>
       </w:pPr>
-      <w:bookmarkStart w:id="16" w:name="_Toc234507119"/>
+      <w:bookmarkStart w:id="16" w:name="_Toc234829075"/>
       <w:r>
         <w:t>3.8 Adding a brand-new key: the template block</w:t>
       </w:r>
@@ -6839,7 +7117,7 @@
         <w:pStyle w:val="Heading2"/>
         <w:spacing w:before="240" w:after="100"/>
       </w:pPr>
-      <w:bookmarkStart w:id="17" w:name="_Toc234507999"/>
+      <w:bookmarkStart w:id="17" w:name="_Toc234829076"/>
       <w:r>
         <w:t>3.9 Device-type fields (device_fields)</w:t>
       </w:r>
@@ -7110,7 +7388,6 @@
         <w:spacing w:after="120" w:line="276" w:lineRule="auto"/>
       </w:pPr>
       <w:r>
-        <w:lastRenderedPageBreak/>
         <w:t xml:space="preserve">When a device type overrides </w:t>
       </w:r>
       <w:r>
@@ -7131,7 +7408,7 @@
         <w:pStyle w:val="Heading2"/>
         <w:spacing w:before="240" w:after="100"/>
       </w:pPr>
-      <w:bookmarkStart w:id="18" w:name="_Toc234508000"/>
+      <w:bookmarkStart w:id="18" w:name="_Toc234829077"/>
       <w:r>
         <w:t>3.10 Device defaults (device_defaults)</w:t>
       </w:r>
@@ -7300,11 +7577,11 @@
         <w:pStyle w:val="Heading2"/>
         <w:spacing w:before="240" w:after="100"/>
       </w:pPr>
-      <w:bookmarkStart w:id="902" w:name="_Toc234508001"/>
+      <w:bookmarkStart w:id="19" w:name="_Toc234829078"/>
       <w:r>
         <w:t>3.11 Device types (device_types)</w:t>
       </w:r>
-      <w:bookmarkEnd w:id="902"/>
+      <w:bookmarkEnd w:id="19"/>
     </w:p>
     <w:p>
       <w:pPr>
@@ -7320,7 +7597,7 @@
           <w:sz w:val="19"/>
           <w:szCs w:val="19"/>
         </w:rPr>
-        <w:t xml:space="preserve">"device_types"</w:t>
+        <w:t>"device_types"</w:t>
       </w:r>
       <w:r>
         <w:t xml:space="preserve"> object: each </w:t>
@@ -7332,7 +7609,7 @@
           <w:sz w:val="19"/>
           <w:szCs w:val="19"/>
         </w:rPr>
-        <w:t xml:space="preserve">SYSTEM_SETUP</w:t>
+        <w:t>SYSTEM_SETUP</w:t>
       </w:r>
       <w:r>
         <w:t xml:space="preserve"> </w:t>
@@ -7344,7 +7621,7 @@
           <w:sz w:val="19"/>
           <w:szCs w:val="19"/>
         </w:rPr>
-        <w:t xml:space="preserve">dev_</w:t>
+        <w:t>dev_</w:t>
       </w:r>
       <w:r>
         <w:t xml:space="preserve"> count key mapped to its section prefix (required) and wizard label. This list REPLACES the built-in one, so keep every family you want listed; its order is the wizard’s display order. An added family automatically gets a wizard count dropdown, device tabs, export pruning, count audits, and a "0" default injected on load. Pair it with </w:t>
@@ -7356,7 +7633,7 @@
           <w:sz w:val="19"/>
           <w:szCs w:val="19"/>
         </w:rPr>
-        <w:t xml:space="preserve">fields</w:t>
+        <w:t>fields</w:t>
       </w:r>
       <w:r>
         <w:t xml:space="preserve"> / </w:t>
@@ -7368,7 +7645,7 @@
           <w:sz w:val="19"/>
           <w:szCs w:val="19"/>
         </w:rPr>
-        <w:t xml:space="preserve">device_fields</w:t>
+        <w:t>device_fields</w:t>
       </w:r>
       <w:r>
         <w:t xml:space="preserve"> entries for its properties and </w:t>
@@ -7380,7 +7657,7 @@
           <w:sz w:val="19"/>
           <w:szCs w:val="19"/>
         </w:rPr>
-        <w:t xml:space="preserve">device_defaults</w:t>
+        <w:t>device_defaults</w:t>
       </w:r>
       <w:r>
         <w:t xml:space="preserve"> for its baseline values. Each family also supports optional "max" (the highest count the wizard offers, default 8), "keepAlivePreference" (keep-alive command names tried in order when a new device’s module is parsed), and "template" (the full block used for new devices when the config has no &lt;PREFIX&gt;1 block to copy).</w:t>
@@ -7401,7 +7678,7 @@
           <w:sz w:val="19"/>
           <w:szCs w:val="19"/>
         </w:rPr>
-        <w:t xml:space="preserve">"device_types": {</w:t>
+        <w:t>"device_types": {</w:t>
       </w:r>
     </w:p>
     <w:p>
@@ -7473,7 +7750,7 @@
           <w:sz w:val="19"/>
           <w:szCs w:val="19"/>
         </w:rPr>
-        <w:t xml:space="preserve">}</w:t>
+        <w:t>}</w:t>
       </w:r>
     </w:p>
     <w:p>
@@ -7486,12 +7763,11 @@
         <w:pStyle w:val="Heading1"/>
         <w:spacing w:before="360" w:after="140"/>
       </w:pPr>
-      <w:bookmarkStart w:id="19" w:name="_Toc234507120"/>
-      <w:r>
-        <w:lastRenderedPageBreak/>
+      <w:bookmarkStart w:id="20" w:name="_Toc234829079"/>
+      <w:r>
         <w:t>4. System setup vs. device setup</w:t>
       </w:r>
-      <w:bookmarkEnd w:id="19"/>
+      <w:bookmarkEnd w:id="20"/>
     </w:p>
     <w:p>
       <w:pPr>
@@ -7518,11 +7794,11 @@
         <w:pStyle w:val="Heading2"/>
         <w:spacing w:before="240" w:after="100"/>
       </w:pPr>
-      <w:bookmarkStart w:id="20" w:name="_Toc234507121"/>
+      <w:bookmarkStart w:id="21" w:name="_Toc234829080"/>
       <w:r>
         <w:t>4.1 How the app decides what is "system" and what is a "device"</w:t>
       </w:r>
-      <w:bookmarkEnd w:id="20"/>
+      <w:bookmarkEnd w:id="21"/>
     </w:p>
     <w:tbl>
       <w:tblPr>
@@ -8088,11 +8364,11 @@
         <w:pStyle w:val="Heading2"/>
         <w:spacing w:before="240" w:after="100"/>
       </w:pPr>
-      <w:bookmarkStart w:id="21" w:name="_Toc234507122"/>
+      <w:bookmarkStart w:id="22" w:name="_Toc234829081"/>
       <w:r>
         <w:t>4.2 Practical consequence for schema authoring</w:t>
       </w:r>
-      <w:bookmarkEnd w:id="21"/>
+      <w:bookmarkEnd w:id="22"/>
     </w:p>
     <w:p>
       <w:pPr>
@@ -8255,11 +8531,11 @@
         <w:pStyle w:val="Heading2"/>
         <w:spacing w:before="240" w:after="100"/>
       </w:pPr>
-      <w:bookmarkStart w:id="22" w:name="_Toc234507123"/>
+      <w:bookmarkStart w:id="23" w:name="_Toc234829082"/>
       <w:r>
         <w:t>4.3 Controlling device count and tabs</w:t>
       </w:r>
-      <w:bookmarkEnd w:id="22"/>
+      <w:bookmarkEnd w:id="23"/>
     </w:p>
     <w:p>
       <w:pPr>
@@ -8422,12 +8698,11 @@
         <w:pStyle w:val="Heading1"/>
         <w:spacing w:before="360" w:after="140"/>
       </w:pPr>
-      <w:bookmarkStart w:id="23" w:name="_Toc234507124"/>
-      <w:r>
-        <w:lastRenderedPageBreak/>
+      <w:bookmarkStart w:id="24" w:name="_Toc234829083"/>
+      <w:r>
         <w:t>5. Setting up key_map.json</w:t>
       </w:r>
-      <w:bookmarkEnd w:id="23"/>
+      <w:bookmarkEnd w:id="24"/>
     </w:p>
     <w:p>
       <w:pPr>
@@ -8486,11 +8761,11 @@
         <w:pStyle w:val="Heading2"/>
         <w:spacing w:before="240" w:after="100"/>
       </w:pPr>
-      <w:bookmarkStart w:id="24" w:name="_Toc234507125"/>
+      <w:bookmarkStart w:id="25" w:name="_Toc234829084"/>
       <w:r>
         <w:t>5.1 Processing order</w:t>
       </w:r>
-      <w:bookmarkEnd w:id="24"/>
+      <w:bookmarkEnd w:id="25"/>
     </w:p>
     <w:p>
       <w:pPr>
@@ -8635,11 +8910,11 @@
         <w:pStyle w:val="Heading2"/>
         <w:spacing w:before="240" w:after="100"/>
       </w:pPr>
-      <w:bookmarkStart w:id="25" w:name="_Toc234507126"/>
+      <w:bookmarkStart w:id="26" w:name="_Toc234829085"/>
       <w:r>
         <w:t>5.2 The rule groups</w:t>
       </w:r>
-      <w:bookmarkEnd w:id="25"/>
+      <w:bookmarkEnd w:id="26"/>
     </w:p>
     <w:p>
       <w:pPr>
@@ -8983,7 +9258,6 @@
           <w:sz w:val="22"/>
           <w:szCs w:val="22"/>
         </w:rPr>
-        <w:lastRenderedPageBreak/>
         <w:t>auto_case_normalization</w:t>
       </w:r>
     </w:p>
@@ -9599,7 +9873,6 @@
           <w:sz w:val="22"/>
           <w:szCs w:val="22"/>
         </w:rPr>
-        <w:lastRenderedPageBreak/>
         <w:t>escape_carriage_returns</w:t>
       </w:r>
     </w:p>
@@ -10274,7 +10547,6 @@
           <w:sz w:val="22"/>
           <w:szCs w:val="22"/>
         </w:rPr>
-        <w:lastRenderedPageBreak/>
         <w:t>defaults — inject missing keys</w:t>
       </w:r>
     </w:p>
@@ -10598,23 +10870,22 @@
         <w:pStyle w:val="Heading1"/>
         <w:spacing w:before="360" w:after="140"/>
       </w:pPr>
-      <w:bookmarkStart w:id="26" w:name="_Toc234507127"/>
-      <w:r>
-        <w:lastRenderedPageBreak/>
+      <w:bookmarkStart w:id="27" w:name="_Toc234829086"/>
+      <w:r>
         <w:t>6. Putting it together: a setup checklist</w:t>
       </w:r>
-      <w:bookmarkEnd w:id="26"/>
+      <w:bookmarkEnd w:id="27"/>
     </w:p>
     <w:p>
       <w:pPr>
         <w:pStyle w:val="Heading2"/>
         <w:spacing w:before="240" w:after="100"/>
       </w:pPr>
-      <w:bookmarkStart w:id="27" w:name="_Toc234507128"/>
+      <w:bookmarkStart w:id="28" w:name="_Toc234829087"/>
       <w:r>
         <w:t>6.1 First-run configuration</w:t>
       </w:r>
-      <w:bookmarkEnd w:id="27"/>
+      <w:bookmarkEnd w:id="28"/>
     </w:p>
     <w:p>
       <w:pPr>
@@ -10775,11 +11046,11 @@
         <w:pStyle w:val="Heading2"/>
         <w:spacing w:before="240" w:after="100"/>
       </w:pPr>
-      <w:bookmarkStart w:id="28" w:name="_Toc234507129"/>
+      <w:bookmarkStart w:id="29" w:name="_Toc234829088"/>
       <w:r>
         <w:t>6.2 Adding support for a new config property</w:t>
       </w:r>
-      <w:bookmarkEnd w:id="28"/>
+      <w:bookmarkEnd w:id="29"/>
     </w:p>
     <w:p>
       <w:pPr>
@@ -10979,11 +11250,11 @@
         <w:pStyle w:val="Heading2"/>
         <w:spacing w:before="240" w:after="100"/>
       </w:pPr>
-      <w:bookmarkStart w:id="29" w:name="_Toc234507130"/>
+      <w:bookmarkStart w:id="30" w:name="_Toc234829089"/>
       <w:r>
         <w:t>6.3 Quick reference: which file does what</w:t>
       </w:r>
-      <w:bookmarkEnd w:id="29"/>
+      <w:bookmarkEnd w:id="30"/>
     </w:p>
     <w:tbl>
       <w:tblPr>
@@ -11618,7 +11889,6 @@
                 <w:sz w:val="19"/>
                 <w:szCs w:val="19"/>
               </w:rPr>
-              <w:lastRenderedPageBreak/>
               <w:t>Fill missing device keys with sane defaults</w:t>
             </w:r>
           </w:p>

</xml_diff>

<commit_message>
Update to fix network on dev screen control
</commit_message>
<xml_diff>
--- a/Room_Config_Builder_Guide.docx
+++ b/Room_Config_Builder_Guide.docx
@@ -130,7 +130,7 @@
           <w:r>
             <w:fldChar w:fldCharType="separate"/>
           </w:r>
-          <w:hyperlink w:anchor="_Toc234829059" w:history="1">
+          <w:hyperlink w:anchor="_Toc234832441" w:history="1">
             <w:r>
               <w:rPr>
                 <w:rStyle w:val="Hyperlink"/>
@@ -154,7 +154,7 @@
               <w:rPr>
                 <w:noProof/>
               </w:rPr>
-              <w:instrText xml:space="preserve"> PAGEREF _Toc234829059 \h </w:instrText>
+              <w:instrText xml:space="preserve"> PAGEREF _Toc234832441 \h </w:instrText>
             </w:r>
             <w:r>
               <w:rPr>
@@ -197,7 +197,7 @@
               <w14:ligatures w14:val="standardContextual"/>
             </w:rPr>
           </w:pPr>
-          <w:hyperlink w:anchor="_Toc234829060" w:history="1">
+          <w:hyperlink w:anchor="_Toc234832442" w:history="1">
             <w:r>
               <w:rPr>
                 <w:rStyle w:val="Hyperlink"/>
@@ -221,7 +221,7 @@
               <w:rPr>
                 <w:noProof/>
               </w:rPr>
-              <w:instrText xml:space="preserve"> PAGEREF _Toc234829060 \h </w:instrText>
+              <w:instrText xml:space="preserve"> PAGEREF _Toc234832442 \h </w:instrText>
             </w:r>
             <w:r>
               <w:rPr>
@@ -264,7 +264,7 @@
               <w14:ligatures w14:val="standardContextual"/>
             </w:rPr>
           </w:pPr>
-          <w:hyperlink w:anchor="_Toc234829061" w:history="1">
+          <w:hyperlink w:anchor="_Toc234832443" w:history="1">
             <w:r>
               <w:rPr>
                 <w:rStyle w:val="Hyperlink"/>
@@ -288,7 +288,7 @@
               <w:rPr>
                 <w:noProof/>
               </w:rPr>
-              <w:instrText xml:space="preserve"> PAGEREF _Toc234829061 \h </w:instrText>
+              <w:instrText xml:space="preserve"> PAGEREF _Toc234832443 \h </w:instrText>
             </w:r>
             <w:r>
               <w:rPr>
@@ -331,7 +331,7 @@
               <w14:ligatures w14:val="standardContextual"/>
             </w:rPr>
           </w:pPr>
-          <w:hyperlink w:anchor="_Toc234829062" w:history="1">
+          <w:hyperlink w:anchor="_Toc234832444" w:history="1">
             <w:r>
               <w:rPr>
                 <w:rStyle w:val="Hyperlink"/>
@@ -355,7 +355,7 @@
               <w:rPr>
                 <w:noProof/>
               </w:rPr>
-              <w:instrText xml:space="preserve"> PAGEREF _Toc234829062 \h </w:instrText>
+              <w:instrText xml:space="preserve"> PAGEREF _Toc234832444 \h </w:instrText>
             </w:r>
             <w:r>
               <w:rPr>
@@ -398,7 +398,7 @@
               <w14:ligatures w14:val="standardContextual"/>
             </w:rPr>
           </w:pPr>
-          <w:hyperlink w:anchor="_Toc234829063" w:history="1">
+          <w:hyperlink w:anchor="_Toc234832445" w:history="1">
             <w:r>
               <w:rPr>
                 <w:rStyle w:val="Hyperlink"/>
@@ -422,7 +422,7 @@
               <w:rPr>
                 <w:noProof/>
               </w:rPr>
-              <w:instrText xml:space="preserve"> PAGEREF _Toc234829063 \h </w:instrText>
+              <w:instrText xml:space="preserve"> PAGEREF _Toc234832445 \h </w:instrText>
             </w:r>
             <w:r>
               <w:rPr>
@@ -465,7 +465,7 @@
               <w14:ligatures w14:val="standardContextual"/>
             </w:rPr>
           </w:pPr>
-          <w:hyperlink w:anchor="_Toc234829064" w:history="1">
+          <w:hyperlink w:anchor="_Toc234832446" w:history="1">
             <w:r>
               <w:rPr>
                 <w:rStyle w:val="Hyperlink"/>
@@ -489,7 +489,7 @@
               <w:rPr>
                 <w:noProof/>
               </w:rPr>
-              <w:instrText xml:space="preserve"> PAGEREF _Toc234829064 \h </w:instrText>
+              <w:instrText xml:space="preserve"> PAGEREF _Toc234832446 \h </w:instrText>
             </w:r>
             <w:r>
               <w:rPr>
@@ -532,7 +532,7 @@
               <w14:ligatures w14:val="standardContextual"/>
             </w:rPr>
           </w:pPr>
-          <w:hyperlink w:anchor="_Toc234829065" w:history="1">
+          <w:hyperlink w:anchor="_Toc234832447" w:history="1">
             <w:r>
               <w:rPr>
                 <w:rStyle w:val="Hyperlink"/>
@@ -556,7 +556,7 @@
               <w:rPr>
                 <w:noProof/>
               </w:rPr>
-              <w:instrText xml:space="preserve"> PAGEREF _Toc234829065 \h </w:instrText>
+              <w:instrText xml:space="preserve"> PAGEREF _Toc234832447 \h </w:instrText>
             </w:r>
             <w:r>
               <w:rPr>
@@ -599,7 +599,7 @@
               <w14:ligatures w14:val="standardContextual"/>
             </w:rPr>
           </w:pPr>
-          <w:hyperlink w:anchor="_Toc234829066" w:history="1">
+          <w:hyperlink w:anchor="_Toc234832448" w:history="1">
             <w:r>
               <w:rPr>
                 <w:rStyle w:val="Hyperlink"/>
@@ -623,7 +623,7 @@
               <w:rPr>
                 <w:noProof/>
               </w:rPr>
-              <w:instrText xml:space="preserve"> PAGEREF _Toc234829066 \h </w:instrText>
+              <w:instrText xml:space="preserve"> PAGEREF _Toc234832448 \h </w:instrText>
             </w:r>
             <w:r>
               <w:rPr>
@@ -666,7 +666,7 @@
               <w14:ligatures w14:val="standardContextual"/>
             </w:rPr>
           </w:pPr>
-          <w:hyperlink w:anchor="_Toc234829067" w:history="1">
+          <w:hyperlink w:anchor="_Toc234832449" w:history="1">
             <w:r>
               <w:rPr>
                 <w:rStyle w:val="Hyperlink"/>
@@ -690,7 +690,7 @@
               <w:rPr>
                 <w:noProof/>
               </w:rPr>
-              <w:instrText xml:space="preserve"> PAGEREF _Toc234829067 \h </w:instrText>
+              <w:instrText xml:space="preserve"> PAGEREF _Toc234832449 \h </w:instrText>
             </w:r>
             <w:r>
               <w:rPr>
@@ -733,7 +733,7 @@
               <w14:ligatures w14:val="standardContextual"/>
             </w:rPr>
           </w:pPr>
-          <w:hyperlink w:anchor="_Toc234829068" w:history="1">
+          <w:hyperlink w:anchor="_Toc234832450" w:history="1">
             <w:r>
               <w:rPr>
                 <w:rStyle w:val="Hyperlink"/>
@@ -757,7 +757,7 @@
               <w:rPr>
                 <w:noProof/>
               </w:rPr>
-              <w:instrText xml:space="preserve"> PAGEREF _Toc234829068 \h </w:instrText>
+              <w:instrText xml:space="preserve"> PAGEREF _Toc234832450 \h </w:instrText>
             </w:r>
             <w:r>
               <w:rPr>
@@ -800,7 +800,7 @@
               <w14:ligatures w14:val="standardContextual"/>
             </w:rPr>
           </w:pPr>
-          <w:hyperlink w:anchor="_Toc234829069" w:history="1">
+          <w:hyperlink w:anchor="_Toc234832451" w:history="1">
             <w:r>
               <w:rPr>
                 <w:rStyle w:val="Hyperlink"/>
@@ -824,7 +824,7 @@
               <w:rPr>
                 <w:noProof/>
               </w:rPr>
-              <w:instrText xml:space="preserve"> PAGEREF _Toc234829069 \h </w:instrText>
+              <w:instrText xml:space="preserve"> PAGEREF _Toc234832451 \h </w:instrText>
             </w:r>
             <w:r>
               <w:rPr>
@@ -867,7 +867,7 @@
               <w14:ligatures w14:val="standardContextual"/>
             </w:rPr>
           </w:pPr>
-          <w:hyperlink w:anchor="_Toc234829070" w:history="1">
+          <w:hyperlink w:anchor="_Toc234832452" w:history="1">
             <w:r>
               <w:rPr>
                 <w:rStyle w:val="Hyperlink"/>
@@ -891,7 +891,7 @@
               <w:rPr>
                 <w:noProof/>
               </w:rPr>
-              <w:instrText xml:space="preserve"> PAGEREF _Toc234829070 \h </w:instrText>
+              <w:instrText xml:space="preserve"> PAGEREF _Toc234832452 \h </w:instrText>
             </w:r>
             <w:r>
               <w:rPr>
@@ -934,7 +934,7 @@
               <w14:ligatures w14:val="standardContextual"/>
             </w:rPr>
           </w:pPr>
-          <w:hyperlink w:anchor="_Toc234829071" w:history="1">
+          <w:hyperlink w:anchor="_Toc234832453" w:history="1">
             <w:r>
               <w:rPr>
                 <w:rStyle w:val="Hyperlink"/>
@@ -958,7 +958,7 @@
               <w:rPr>
                 <w:noProof/>
               </w:rPr>
-              <w:instrText xml:space="preserve"> PAGEREF _Toc234829071 \h </w:instrText>
+              <w:instrText xml:space="preserve"> PAGEREF _Toc234832453 \h </w:instrText>
             </w:r>
             <w:r>
               <w:rPr>
@@ -1001,7 +1001,7 @@
               <w14:ligatures w14:val="standardContextual"/>
             </w:rPr>
           </w:pPr>
-          <w:hyperlink w:anchor="_Toc234829072" w:history="1">
+          <w:hyperlink w:anchor="_Toc234832454" w:history="1">
             <w:r>
               <w:rPr>
                 <w:rStyle w:val="Hyperlink"/>
@@ -1025,7 +1025,7 @@
               <w:rPr>
                 <w:noProof/>
               </w:rPr>
-              <w:instrText xml:space="preserve"> PAGEREF _Toc234829072 \h </w:instrText>
+              <w:instrText xml:space="preserve"> PAGEREF _Toc234832454 \h </w:instrText>
             </w:r>
             <w:r>
               <w:rPr>
@@ -1068,7 +1068,7 @@
               <w14:ligatures w14:val="standardContextual"/>
             </w:rPr>
           </w:pPr>
-          <w:hyperlink w:anchor="_Toc234829073" w:history="1">
+          <w:hyperlink w:anchor="_Toc234832455" w:history="1">
             <w:r>
               <w:rPr>
                 <w:rStyle w:val="Hyperlink"/>
@@ -1092,7 +1092,7 @@
               <w:rPr>
                 <w:noProof/>
               </w:rPr>
-              <w:instrText xml:space="preserve"> PAGEREF _Toc234829073 \h </w:instrText>
+              <w:instrText xml:space="preserve"> PAGEREF _Toc234832455 \h </w:instrText>
             </w:r>
             <w:r>
               <w:rPr>
@@ -1135,7 +1135,7 @@
               <w14:ligatures w14:val="standardContextual"/>
             </w:rPr>
           </w:pPr>
-          <w:hyperlink w:anchor="_Toc234829074" w:history="1">
+          <w:hyperlink w:anchor="_Toc234832456" w:history="1">
             <w:r>
               <w:rPr>
                 <w:rStyle w:val="Hyperlink"/>
@@ -1159,7 +1159,7 @@
               <w:rPr>
                 <w:noProof/>
               </w:rPr>
-              <w:instrText xml:space="preserve"> PAGEREF _Toc234829074 \h </w:instrText>
+              <w:instrText xml:space="preserve"> PAGEREF _Toc234832456 \h </w:instrText>
             </w:r>
             <w:r>
               <w:rPr>
@@ -1202,7 +1202,7 @@
               <w14:ligatures w14:val="standardContextual"/>
             </w:rPr>
           </w:pPr>
-          <w:hyperlink w:anchor="_Toc234829075" w:history="1">
+          <w:hyperlink w:anchor="_Toc234832457" w:history="1">
             <w:r>
               <w:rPr>
                 <w:rStyle w:val="Hyperlink"/>
@@ -1226,7 +1226,7 @@
               <w:rPr>
                 <w:noProof/>
               </w:rPr>
-              <w:instrText xml:space="preserve"> PAGEREF _Toc234829075 \h </w:instrText>
+              <w:instrText xml:space="preserve"> PAGEREF _Toc234832457 \h </w:instrText>
             </w:r>
             <w:r>
               <w:rPr>
@@ -1269,7 +1269,7 @@
               <w14:ligatures w14:val="standardContextual"/>
             </w:rPr>
           </w:pPr>
-          <w:hyperlink w:anchor="_Toc234829076" w:history="1">
+          <w:hyperlink w:anchor="_Toc234832458" w:history="1">
             <w:r>
               <w:rPr>
                 <w:rStyle w:val="Hyperlink"/>
@@ -1293,7 +1293,7 @@
               <w:rPr>
                 <w:noProof/>
               </w:rPr>
-              <w:instrText xml:space="preserve"> PAGEREF _Toc234829076 \h </w:instrText>
+              <w:instrText xml:space="preserve"> PAGEREF _Toc234832458 \h </w:instrText>
             </w:r>
             <w:r>
               <w:rPr>
@@ -1336,7 +1336,7 @@
               <w14:ligatures w14:val="standardContextual"/>
             </w:rPr>
           </w:pPr>
-          <w:hyperlink w:anchor="_Toc234829077" w:history="1">
+          <w:hyperlink w:anchor="_Toc234832459" w:history="1">
             <w:r>
               <w:rPr>
                 <w:rStyle w:val="Hyperlink"/>
@@ -1360,7 +1360,7 @@
               <w:rPr>
                 <w:noProof/>
               </w:rPr>
-              <w:instrText xml:space="preserve"> PAGEREF _Toc234829077 \h </w:instrText>
+              <w:instrText xml:space="preserve"> PAGEREF _Toc234832459 \h </w:instrText>
             </w:r>
             <w:r>
               <w:rPr>
@@ -1403,7 +1403,7 @@
               <w14:ligatures w14:val="standardContextual"/>
             </w:rPr>
           </w:pPr>
-          <w:hyperlink w:anchor="_Toc234829078" w:history="1">
+          <w:hyperlink w:anchor="_Toc234832460" w:history="1">
             <w:r>
               <w:rPr>
                 <w:rStyle w:val="Hyperlink"/>
@@ -1427,7 +1427,7 @@
               <w:rPr>
                 <w:noProof/>
               </w:rPr>
-              <w:instrText xml:space="preserve"> PAGEREF _Toc234829078 \h </w:instrText>
+              <w:instrText xml:space="preserve"> PAGEREF _Toc234832460 \h </w:instrText>
             </w:r>
             <w:r>
               <w:rPr>
@@ -1470,7 +1470,7 @@
               <w14:ligatures w14:val="standardContextual"/>
             </w:rPr>
           </w:pPr>
-          <w:hyperlink w:anchor="_Toc234829079" w:history="1">
+          <w:hyperlink w:anchor="_Toc234832461" w:history="1">
             <w:r>
               <w:rPr>
                 <w:rStyle w:val="Hyperlink"/>
@@ -1494,7 +1494,7 @@
               <w:rPr>
                 <w:noProof/>
               </w:rPr>
-              <w:instrText xml:space="preserve"> PAGEREF _Toc234829079 \h </w:instrText>
+              <w:instrText xml:space="preserve"> PAGEREF _Toc234832461 \h </w:instrText>
             </w:r>
             <w:r>
               <w:rPr>
@@ -1537,7 +1537,7 @@
               <w14:ligatures w14:val="standardContextual"/>
             </w:rPr>
           </w:pPr>
-          <w:hyperlink w:anchor="_Toc234829080" w:history="1">
+          <w:hyperlink w:anchor="_Toc234832462" w:history="1">
             <w:r>
               <w:rPr>
                 <w:rStyle w:val="Hyperlink"/>
@@ -1561,7 +1561,7 @@
               <w:rPr>
                 <w:noProof/>
               </w:rPr>
-              <w:instrText xml:space="preserve"> PAGEREF _Toc234829080 \h </w:instrText>
+              <w:instrText xml:space="preserve"> PAGEREF _Toc234832462 \h </w:instrText>
             </w:r>
             <w:r>
               <w:rPr>
@@ -1604,7 +1604,7 @@
               <w14:ligatures w14:val="standardContextual"/>
             </w:rPr>
           </w:pPr>
-          <w:hyperlink w:anchor="_Toc234829081" w:history="1">
+          <w:hyperlink w:anchor="_Toc234832463" w:history="1">
             <w:r>
               <w:rPr>
                 <w:rStyle w:val="Hyperlink"/>
@@ -1628,7 +1628,7 @@
               <w:rPr>
                 <w:noProof/>
               </w:rPr>
-              <w:instrText xml:space="preserve"> PAGEREF _Toc234829081 \h </w:instrText>
+              <w:instrText xml:space="preserve"> PAGEREF _Toc234832463 \h </w:instrText>
             </w:r>
             <w:r>
               <w:rPr>
@@ -1671,7 +1671,7 @@
               <w14:ligatures w14:val="standardContextual"/>
             </w:rPr>
           </w:pPr>
-          <w:hyperlink w:anchor="_Toc234829082" w:history="1">
+          <w:hyperlink w:anchor="_Toc234832464" w:history="1">
             <w:r>
               <w:rPr>
                 <w:rStyle w:val="Hyperlink"/>
@@ -1695,7 +1695,7 @@
               <w:rPr>
                 <w:noProof/>
               </w:rPr>
-              <w:instrText xml:space="preserve"> PAGEREF _Toc234829082 \h </w:instrText>
+              <w:instrText xml:space="preserve"> PAGEREF _Toc234832464 \h </w:instrText>
             </w:r>
             <w:r>
               <w:rPr>
@@ -1738,7 +1738,7 @@
               <w14:ligatures w14:val="standardContextual"/>
             </w:rPr>
           </w:pPr>
-          <w:hyperlink w:anchor="_Toc234829083" w:history="1">
+          <w:hyperlink w:anchor="_Toc234832465" w:history="1">
             <w:r>
               <w:rPr>
                 <w:rStyle w:val="Hyperlink"/>
@@ -1762,7 +1762,7 @@
               <w:rPr>
                 <w:noProof/>
               </w:rPr>
-              <w:instrText xml:space="preserve"> PAGEREF _Toc234829083 \h </w:instrText>
+              <w:instrText xml:space="preserve"> PAGEREF _Toc234832465 \h </w:instrText>
             </w:r>
             <w:r>
               <w:rPr>
@@ -1805,7 +1805,7 @@
               <w14:ligatures w14:val="standardContextual"/>
             </w:rPr>
           </w:pPr>
-          <w:hyperlink w:anchor="_Toc234829084" w:history="1">
+          <w:hyperlink w:anchor="_Toc234832466" w:history="1">
             <w:r>
               <w:rPr>
                 <w:rStyle w:val="Hyperlink"/>
@@ -1829,7 +1829,7 @@
               <w:rPr>
                 <w:noProof/>
               </w:rPr>
-              <w:instrText xml:space="preserve"> PAGEREF _Toc234829084 \h </w:instrText>
+              <w:instrText xml:space="preserve"> PAGEREF _Toc234832466 \h </w:instrText>
             </w:r>
             <w:r>
               <w:rPr>
@@ -1872,7 +1872,7 @@
               <w14:ligatures w14:val="standardContextual"/>
             </w:rPr>
           </w:pPr>
-          <w:hyperlink w:anchor="_Toc234829085" w:history="1">
+          <w:hyperlink w:anchor="_Toc234832467" w:history="1">
             <w:r>
               <w:rPr>
                 <w:rStyle w:val="Hyperlink"/>
@@ -1896,7 +1896,7 @@
               <w:rPr>
                 <w:noProof/>
               </w:rPr>
-              <w:instrText xml:space="preserve"> PAGEREF _Toc234829085 \h </w:instrText>
+              <w:instrText xml:space="preserve"> PAGEREF _Toc234832467 \h </w:instrText>
             </w:r>
             <w:r>
               <w:rPr>
@@ -1939,7 +1939,7 @@
               <w14:ligatures w14:val="standardContextual"/>
             </w:rPr>
           </w:pPr>
-          <w:hyperlink w:anchor="_Toc234829086" w:history="1">
+          <w:hyperlink w:anchor="_Toc234832468" w:history="1">
             <w:r>
               <w:rPr>
                 <w:rStyle w:val="Hyperlink"/>
@@ -1963,7 +1963,7 @@
               <w:rPr>
                 <w:noProof/>
               </w:rPr>
-              <w:instrText xml:space="preserve"> PAGEREF _Toc234829086 \h </w:instrText>
+              <w:instrText xml:space="preserve"> PAGEREF _Toc234832468 \h </w:instrText>
             </w:r>
             <w:r>
               <w:rPr>
@@ -2006,7 +2006,7 @@
               <w14:ligatures w14:val="standardContextual"/>
             </w:rPr>
           </w:pPr>
-          <w:hyperlink w:anchor="_Toc234829087" w:history="1">
+          <w:hyperlink w:anchor="_Toc234832469" w:history="1">
             <w:r>
               <w:rPr>
                 <w:rStyle w:val="Hyperlink"/>
@@ -2030,7 +2030,7 @@
               <w:rPr>
                 <w:noProof/>
               </w:rPr>
-              <w:instrText xml:space="preserve"> PAGEREF _Toc234829087 \h </w:instrText>
+              <w:instrText xml:space="preserve"> PAGEREF _Toc234832469 \h </w:instrText>
             </w:r>
             <w:r>
               <w:rPr>
@@ -2073,7 +2073,7 @@
               <w14:ligatures w14:val="standardContextual"/>
             </w:rPr>
           </w:pPr>
-          <w:hyperlink w:anchor="_Toc234829088" w:history="1">
+          <w:hyperlink w:anchor="_Toc234832470" w:history="1">
             <w:r>
               <w:rPr>
                 <w:rStyle w:val="Hyperlink"/>
@@ -2097,7 +2097,7 @@
               <w:rPr>
                 <w:noProof/>
               </w:rPr>
-              <w:instrText xml:space="preserve"> PAGEREF _Toc234829088 \h </w:instrText>
+              <w:instrText xml:space="preserve"> PAGEREF _Toc234832470 \h </w:instrText>
             </w:r>
             <w:r>
               <w:rPr>
@@ -2140,7 +2140,7 @@
               <w14:ligatures w14:val="standardContextual"/>
             </w:rPr>
           </w:pPr>
-          <w:hyperlink w:anchor="_Toc234829089" w:history="1">
+          <w:hyperlink w:anchor="_Toc234832471" w:history="1">
             <w:r>
               <w:rPr>
                 <w:rStyle w:val="Hyperlink"/>
@@ -2164,7 +2164,7 @@
               <w:rPr>
                 <w:noProof/>
               </w:rPr>
-              <w:instrText xml:space="preserve"> PAGEREF _Toc234829089 \h </w:instrText>
+              <w:instrText xml:space="preserve"> PAGEREF _Toc234832471 \h </w:instrText>
             </w:r>
             <w:r>
               <w:rPr>
@@ -2208,7 +2208,7 @@
         <w:pStyle w:val="Heading1"/>
         <w:spacing w:before="360" w:after="140"/>
       </w:pPr>
-      <w:bookmarkStart w:id="0" w:name="_Toc234829059"/>
+      <w:bookmarkStart w:id="0" w:name="_Toc234832441"/>
       <w:r>
         <w:lastRenderedPageBreak/>
         <w:t>1. What the program is</w:t>
@@ -2324,7 +2324,7 @@
         <w:pStyle w:val="Heading2"/>
         <w:spacing w:before="240" w:after="100"/>
       </w:pPr>
-      <w:bookmarkStart w:id="1" w:name="_Toc234829060"/>
+      <w:bookmarkStart w:id="1" w:name="_Toc234832442"/>
       <w:r>
         <w:t>1.1 The five tabs</w:t>
       </w:r>
@@ -2459,8 +2459,27 @@
                 <w:sz w:val="19"/>
                 <w:szCs w:val="19"/>
               </w:rPr>
-              <w:t>Room identity (building, room number, full room name) and hardware quantities. Setting a device count here generates or removes that device’s blocks and its detail tabs. Picking a building stores its building code in gve_bldg (e.g. "BSS"), and gui_full_room_name is auto-generated from the full building name in Title Case plus the room number. A Hardware Options section below the counts edits dev_ settings that are not device counts (e.g. dev_relay_power, dev_screen_control), rendered from the UI schema; dev</w:t>
-            </w:r>
+              <w:t>Room identity (building, room number, full room name) and hardware quantities. Setting a device count here generates or removes that device’s blocks and its detail tabs. Picking a building stores its building code in gve_bldg (e.g. "BSS"), and gui_full_room_name is auto-generated from the full building name in Title Case plus the room number. A Hardware Options section below the counts edits dev_ settings that are not device counts (e.g. dev_relay_power, dev_screen_control), rendered from the UI schema; dev_screen_control is a dropdown offering Relay, Serial, Serial over Ethernet, or Network.</w:t>
+            </w:r>
+          </w:p>
+        </w:tc>
+      </w:tr>
+      <w:tr>
+        <w:tc>
+          <w:tcPr>
+            <w:tcW w:w="1900" w:type="dxa"/>
+            <w:shd w:val="clear" w:color="auto" w:fill="EEF3F8"/>
+            <w:tcMar>
+              <w:top w:w="60" w:type="dxa"/>
+              <w:left w:w="100" w:type="dxa"/>
+              <w:bottom w:w="60" w:type="dxa"/>
+              <w:right w:w="100" w:type="dxa"/>
+            </w:tcMar>
+          </w:tcPr>
+          <w:p>
+            <w:pPr>
+              <w:spacing w:line="252" w:lineRule="auto"/>
+            </w:pPr>
             <w:r>
               <w:rPr>
                 <w:b/>
@@ -2468,15 +2487,13 @@
                 <w:sz w:val="19"/>
                 <w:szCs w:val="19"/>
               </w:rPr>
-              <w:t>_screen_control is a dropdown offering Relay, Serial, or Serial over Ethernet.</w:t>
-            </w:r>
-          </w:p>
-        </w:tc>
-      </w:tr>
-      <w:tr>
-        <w:tc>
-          <w:tcPr>
-            <w:tcW w:w="1900" w:type="dxa"/>
+              <w:t>Devices</w:t>
+            </w:r>
+          </w:p>
+        </w:tc>
+        <w:tc>
+          <w:tcPr>
+            <w:tcW w:w="7460" w:type="dxa"/>
             <w:shd w:val="clear" w:color="auto" w:fill="EEF3F8"/>
             <w:tcMar>
               <w:top w:w="60" w:type="dxa"/>
@@ -2496,14 +2513,16 @@
                 <w:sz w:val="19"/>
                 <w:szCs w:val="19"/>
               </w:rPr>
-              <w:t>Devices</w:t>
-            </w:r>
-          </w:p>
-        </w:tc>
-        <w:tc>
-          <w:tcPr>
-            <w:tcW w:w="7460" w:type="dxa"/>
-            <w:shd w:val="clear" w:color="auto" w:fill="EEF3F8"/>
+              <w:t>One sub-tab per active device (Projector 1, Camera 2, …). Every field is rendered from the UI schema. The set of tabs is driven by the dev_ counts in SYSTEM_SETUP.</w:t>
+            </w:r>
+          </w:p>
+        </w:tc>
+      </w:tr>
+      <w:tr>
+        <w:tc>
+          <w:tcPr>
+            <w:tcW w:w="1900" w:type="dxa"/>
+            <w:shd w:val="clear" w:color="auto" w:fill="FFFFFF"/>
             <w:tcMar>
               <w:top w:w="60" w:type="dxa"/>
               <w:left w:w="100" w:type="dxa"/>
@@ -2522,15 +2541,13 @@
                 <w:sz w:val="19"/>
                 <w:szCs w:val="19"/>
               </w:rPr>
-              <w:t>One sub-tab per active device (Projector 1, Camera 2, …). Every field is rendered from the UI schema. The set of tabs is driven by the dev_ counts in SYSTEM_SETUP.</w:t>
-            </w:r>
-          </w:p>
-        </w:tc>
-      </w:tr>
-      <w:tr>
-        <w:tc>
-          <w:tcPr>
-            <w:tcW w:w="1900" w:type="dxa"/>
+              <w:t>System</w:t>
+            </w:r>
+          </w:p>
+        </w:tc>
+        <w:tc>
+          <w:tcPr>
+            <w:tcW w:w="7460" w:type="dxa"/>
             <w:shd w:val="clear" w:color="auto" w:fill="FFFFFF"/>
             <w:tcMar>
               <w:top w:w="60" w:type="dxa"/>
@@ -2550,14 +2567,16 @@
                 <w:sz w:val="19"/>
                 <w:szCs w:val="19"/>
               </w:rPr>
-              <w:t>System</w:t>
-            </w:r>
-          </w:p>
-        </w:tc>
-        <w:tc>
-          <w:tcPr>
-            <w:tcW w:w="7460" w:type="dxa"/>
-            <w:shd w:val="clear" w:color="auto" w:fill="FFFFFF"/>
+              <w:t>Every SYSTEM_SETUP property except the dev_ hardware counts, each rendered from the UI schema.</w:t>
+            </w:r>
+          </w:p>
+        </w:tc>
+      </w:tr>
+      <w:tr>
+        <w:tc>
+          <w:tcPr>
+            <w:tcW w:w="1900" w:type="dxa"/>
+            <w:shd w:val="clear" w:color="auto" w:fill="EEF3F8"/>
             <w:tcMar>
               <w:top w:w="60" w:type="dxa"/>
               <w:left w:w="100" w:type="dxa"/>
@@ -2576,15 +2595,13 @@
                 <w:sz w:val="19"/>
                 <w:szCs w:val="19"/>
               </w:rPr>
-              <w:t>Every SYSTEM_SETUP property except the dev_ hardware counts, each rendered from the UI schema.</w:t>
-            </w:r>
-          </w:p>
-        </w:tc>
-      </w:tr>
-      <w:tr>
-        <w:tc>
-          <w:tcPr>
-            <w:tcW w:w="1900" w:type="dxa"/>
+              <w:t>Raw JSON</w:t>
+            </w:r>
+          </w:p>
+        </w:tc>
+        <w:tc>
+          <w:tcPr>
+            <w:tcW w:w="7460" w:type="dxa"/>
             <w:shd w:val="clear" w:color="auto" w:fill="EEF3F8"/>
             <w:tcMar>
               <w:top w:w="60" w:type="dxa"/>
@@ -2604,14 +2621,16 @@
                 <w:sz w:val="19"/>
                 <w:szCs w:val="19"/>
               </w:rPr>
-              <w:t>Raw JSON</w:t>
-            </w:r>
-          </w:p>
-        </w:tc>
-        <w:tc>
-          <w:tcPr>
-            <w:tcW w:w="7460" w:type="dxa"/>
-            <w:shd w:val="clear" w:color="auto" w:fill="EEF3F8"/>
+              <w:t>A syntax-highlighted text editor of the whole config. Apply Changes parses it back into memory and also writes it to the working file.</w:t>
+            </w:r>
+          </w:p>
+        </w:tc>
+      </w:tr>
+      <w:tr>
+        <w:tc>
+          <w:tcPr>
+            <w:tcW w:w="1900" w:type="dxa"/>
+            <w:shd w:val="clear" w:color="auto" w:fill="FFFFFF"/>
             <w:tcMar>
               <w:top w:w="60" w:type="dxa"/>
               <w:left w:w="100" w:type="dxa"/>
@@ -2630,15 +2649,13 @@
                 <w:sz w:val="19"/>
                 <w:szCs w:val="19"/>
               </w:rPr>
-              <w:t>A syntax-highlighted text editor of the whole config. Apply Changes parses it back into memory and also writes it to the working file.</w:t>
-            </w:r>
-          </w:p>
-        </w:tc>
-      </w:tr>
-      <w:tr>
-        <w:tc>
-          <w:tcPr>
-            <w:tcW w:w="1900" w:type="dxa"/>
+              <w:t>App Config</w:t>
+            </w:r>
+          </w:p>
+        </w:tc>
+        <w:tc>
+          <w:tcPr>
+            <w:tcW w:w="7460" w:type="dxa"/>
             <w:shd w:val="clear" w:color="auto" w:fill="FFFFFF"/>
             <w:tcMar>
               <w:top w:w="60" w:type="dxa"/>
@@ -2658,32 +2675,6 @@
                 <w:sz w:val="19"/>
                 <w:szCs w:val="19"/>
               </w:rPr>
-              <w:t>App Config</w:t>
-            </w:r>
-          </w:p>
-        </w:tc>
-        <w:tc>
-          <w:tcPr>
-            <w:tcW w:w="7460" w:type="dxa"/>
-            <w:shd w:val="clear" w:color="auto" w:fill="FFFFFF"/>
-            <w:tcMar>
-              <w:top w:w="60" w:type="dxa"/>
-              <w:left w:w="100" w:type="dxa"/>
-              <w:bottom w:w="60" w:type="dxa"/>
-              <w:right w:w="100" w:type="dxa"/>
-            </w:tcMar>
-          </w:tcPr>
-          <w:p>
-            <w:pPr>
-              <w:spacing w:line="252" w:lineRule="auto"/>
-            </w:pPr>
-            <w:r>
-              <w:rPr>
-                <w:b/>
-                <w:bCs/>
-                <w:sz w:val="19"/>
-                <w:szCs w:val="19"/>
-              </w:rPr>
               <w:t>Application paths (modules folder, buildings.json, processors.json, template config, ui_schema.json, key_map.json), the Theme Style and Text Size, the processor connection settings (SFTP username, port, and remote config path — Extron defaults), and the active deployment target. Reload buttons for the schema and key map live here. Every setting on this tab is saved automatically to app_config.json in the app’s root folder (see 1.2).</w:t>
             </w:r>
           </w:p>
@@ -2711,10 +2702,7 @@
         <w:t xml:space="preserve">Theme Style. </w:t>
       </w:r>
       <w:r>
-        <w:t>The App Config tab includes a Theme Style dropdown with two styles, each themed around an accent color picked from the swatch grid shown beneath the dropdown: Classic — the default — is a standard Material look, and Auris is a sci-fi HUD look with its own swatch set (amber, teal, magenta, and more). The sun/moon button on the toolbar still toggles dark and light within whichever style is selected, and every choice is saved and restored on the next launch. A Text Size dropdown below the theme settings scales</w:t>
-      </w:r>
-      <w:r>
-        <w:t xml:space="preserve"> all text in the app (Small 85% up to Huge 150%).</w:t>
+        <w:t>The App Config tab includes a Theme Style dropdown with two styles, each themed around an accent color picked from the swatch grid shown beneath the dropdown: Classic — the default — is a standard Material look, and Auris is a sci-fi HUD look with its own swatch set (amber, teal, magenta, and more). The sun/moon button on the toolbar still toggles dark and light within whichever style is selected, and every choice is saved and restored on the next launch. A Text Size dropdown below the theme settings scales all text in the app (Small 85% up to Huge 150%).</w:t>
       </w:r>
     </w:p>
     <w:p>
@@ -2722,7 +2710,7 @@
         <w:pStyle w:val="Heading2"/>
         <w:spacing w:before="240" w:after="100"/>
       </w:pPr>
-      <w:bookmarkStart w:id="2" w:name="_Toc234829061"/>
+      <w:bookmarkStart w:id="2" w:name="_Toc234832443"/>
       <w:r>
         <w:t>1.2 The supporting files you point the app at</w:t>
       </w:r>
@@ -3467,15 +3455,7 @@
                 <w:sz w:val="20"/>
                 <w:szCs w:val="20"/>
               </w:rPr>
-              <w:t>Every application setting — the paths above, the SFTP connection settings, the theme, and the text size — is saved automatically to a plain app_config.json in the app’s root folder (the working directory, or the folder next to the executable). The file is created with working defaults on the very first launch, so the app always starts and runs even when no folder or location has ever been selected. It can be inspected or hand-edited while the app is closed, and it travels with the app. Settings saved by old</w:t>
-            </w:r>
-            <w:r>
-              <w:rPr>
-                <w:color w:val="5A3D00"/>
-                <w:sz w:val="20"/>
-                <w:szCs w:val="20"/>
-              </w:rPr>
-              <w:t>er versions in the hidden OS preference store are imported into the file automatically, once. The exact file in use is shown at the top of the App Config tab.</w:t>
+              <w:t>Every application setting — the paths above, the SFTP connection settings, the theme, and the text size — is saved automatically to a plain app_config.json in the app’s root folder (the working directory, or the folder next to the executable). The file is created with working defaults on the very first launch, so the app always starts and runs even when no folder or location has ever been selected. It can be inspected or hand-edited while the app is closed, and it travels with the app. Settings saved by older versions in the hidden OS preference store are imported into the file automatically, once. The exact file in use is shown at the top of the App Config tab.</w:t>
             </w:r>
           </w:p>
           <w:p>
@@ -3503,15 +3483,7 @@
                 <w:sz w:val="20"/>
                 <w:szCs w:val="20"/>
               </w:rPr>
-              <w:t xml:space="preserve">The very first time the app runs (no settings saved yet), a one-time setup dialog asks where each of these files is located. Pick the Root Folder first — every file found inside it turns green automatically — then Browse only for files stored elsewhere. Each choice is saved the moment it is picked. Finishing (or skipping) the dialog records the setup as complete, so the check is bypassed on every later launch; existing installs that already have saved paths are never asked. The same dialog can be re-opened </w:t>
-            </w:r>
-            <w:r>
-              <w:rPr>
-                <w:color w:val="5A3D00"/>
-                <w:sz w:val="20"/>
-                <w:szCs w:val="20"/>
-              </w:rPr>
-              <w:t>any time with the "Run First-Time Setup" button at the top of App Config. Skipping is always safe: app_config.json is created with working defaults either way, so the app never depends on a folder or location being chosen in order to start.</w:t>
+              <w:t>The very first time the app runs (no settings saved yet), a one-time setup dialog asks where each of these files is located. Pick the Root Folder first — every file found inside it turns green automatically — then Browse only for files stored elsewhere. Each choice is saved the moment it is picked. Finishing (or skipping) the dialog records the setup as complete, so the check is bypassed on every later launch; existing installs that already have saved paths are never asked. The same dialog can be re-opened any time with the "Run First-Time Setup" button at the top of App Config. Skipping is always safe: app_config.json is created with working defaults either way, so the app never depends on a folder or location being chosen in order to start.</w:t>
             </w:r>
           </w:p>
         </w:tc>
@@ -3594,7 +3566,7 @@
         <w:pStyle w:val="Heading1"/>
         <w:spacing w:before="360" w:after="140"/>
       </w:pPr>
-      <w:bookmarkStart w:id="3" w:name="_Toc234829062"/>
+      <w:bookmarkStart w:id="3" w:name="_Toc234832444"/>
       <w:r>
         <w:lastRenderedPageBreak/>
         <w:t>2. How a config moves through the program</w:t>
@@ -3606,7 +3578,7 @@
         <w:pStyle w:val="Heading2"/>
         <w:spacing w:before="240" w:after="100"/>
       </w:pPr>
-      <w:bookmarkStart w:id="4" w:name="_Toc234829063"/>
+      <w:bookmarkStart w:id="4" w:name="_Toc234832445"/>
       <w:r>
         <w:t>2.1 Getting a config into memory</w:t>
       </w:r>
@@ -3721,7 +3693,7 @@
         <w:pStyle w:val="Heading2"/>
         <w:spacing w:before="240" w:after="100"/>
       </w:pPr>
-      <w:bookmarkStart w:id="5" w:name="_Toc234829064"/>
+      <w:bookmarkStart w:id="5" w:name="_Toc234832446"/>
       <w:r>
         <w:t>2.2 The load pipeline</w:t>
       </w:r>
@@ -4087,7 +4059,7 @@
         <w:pStyle w:val="Heading2"/>
         <w:spacing w:before="240" w:after="100"/>
       </w:pPr>
-      <w:bookmarkStart w:id="6" w:name="_Toc234829065"/>
+      <w:bookmarkStart w:id="6" w:name="_Toc234832447"/>
       <w:r>
         <w:t>2.3 Baseline SYSTEM_SETUP defaults injected on load</w:t>
       </w:r>
@@ -4333,7 +4305,7 @@
         <w:pStyle w:val="Heading2"/>
         <w:spacing w:before="240" w:after="100"/>
       </w:pPr>
-      <w:bookmarkStart w:id="7" w:name="_Toc234829066"/>
+      <w:bookmarkStart w:id="7" w:name="_Toc234832448"/>
       <w:r>
         <w:t>2.4 Getting a config back out</w:t>
       </w:r>
@@ -4577,7 +4549,7 @@
         <w:pStyle w:val="Heading1"/>
         <w:spacing w:before="360" w:after="140"/>
       </w:pPr>
-      <w:bookmarkStart w:id="8" w:name="_Toc234829067"/>
+      <w:bookmarkStart w:id="8" w:name="_Toc234832449"/>
       <w:r>
         <w:t>3. Setting up ui_schema.json</w:t>
       </w:r>
@@ -4620,7 +4592,7 @@
         <w:pStyle w:val="Heading2"/>
         <w:spacing w:before="240" w:after="100"/>
       </w:pPr>
-      <w:bookmarkStart w:id="9" w:name="_Toc234829068"/>
+      <w:bookmarkStart w:id="9" w:name="_Toc234832450"/>
       <w:r>
         <w:t>3.1 File skeleton</w:t>
       </w:r>
@@ -4871,7 +4843,7 @@
         <w:pStyle w:val="Heading2"/>
         <w:spacing w:before="240" w:after="100"/>
       </w:pPr>
-      <w:bookmarkStart w:id="10" w:name="_Toc234829069"/>
+      <w:bookmarkStart w:id="10" w:name="_Toc234832451"/>
       <w:r>
         <w:t>3.2 The properties every field entry supports</w:t>
       </w:r>
@@ -5387,7 +5359,7 @@
         <w:pStyle w:val="Heading2"/>
         <w:spacing w:before="240" w:after="100"/>
       </w:pPr>
-      <w:bookmarkStart w:id="11" w:name="_Toc234829070"/>
+      <w:bookmarkStart w:id="11" w:name="_Toc234832452"/>
       <w:r>
         <w:t>3.3 Field types</w:t>
       </w:r>
@@ -6218,7 +6190,7 @@
         <w:pStyle w:val="Heading2"/>
         <w:spacing w:before="240" w:after="100"/>
       </w:pPr>
-      <w:bookmarkStart w:id="12" w:name="_Toc234829071"/>
+      <w:bookmarkStart w:id="12" w:name="_Toc234832453"/>
       <w:r>
         <w:t>3.4 Dropdown options: two forms</w:t>
       </w:r>
@@ -6365,7 +6337,7 @@
         <w:pStyle w:val="Heading2"/>
         <w:spacing w:before="240" w:after="100"/>
       </w:pPr>
-      <w:bookmarkStart w:id="13" w:name="_Toc234829072"/>
+      <w:bookmarkStart w:id="13" w:name="_Toc234832454"/>
       <w:r>
         <w:t>3.5 Combo fields (one dropdown that writes several keys)</w:t>
       </w:r>
@@ -6678,7 +6650,7 @@
         <w:pStyle w:val="Heading2"/>
         <w:spacing w:before="240" w:after="100"/>
       </w:pPr>
-      <w:bookmarkStart w:id="14" w:name="_Toc234829073"/>
+      <w:bookmarkStart w:id="14" w:name="_Toc234832455"/>
       <w:r>
         <w:t>3.6 Wildcards for families of keys</w:t>
       </w:r>
@@ -6861,7 +6833,7 @@
         <w:pStyle w:val="Heading2"/>
         <w:spacing w:before="240" w:after="100"/>
       </w:pPr>
-      <w:bookmarkStart w:id="15" w:name="_Toc234829074"/>
+      <w:bookmarkStart w:id="15" w:name="_Toc234832456"/>
       <w:r>
         <w:t>3.7 Unknown keys and the fallback chain</w:t>
       </w:r>
@@ -6955,7 +6927,7 @@
         <w:pStyle w:val="Heading2"/>
         <w:spacing w:before="240" w:after="100"/>
       </w:pPr>
-      <w:bookmarkStart w:id="16" w:name="_Toc234829075"/>
+      <w:bookmarkStart w:id="16" w:name="_Toc234832457"/>
       <w:r>
         <w:t>3.8 Adding a brand-new key: the template block</w:t>
       </w:r>
@@ -7117,7 +7089,7 @@
         <w:pStyle w:val="Heading2"/>
         <w:spacing w:before="240" w:after="100"/>
       </w:pPr>
-      <w:bookmarkStart w:id="17" w:name="_Toc234829076"/>
+      <w:bookmarkStart w:id="17" w:name="_Toc234832458"/>
       <w:r>
         <w:t>3.9 Device-type fields (device_fields)</w:t>
       </w:r>
@@ -7408,7 +7380,7 @@
         <w:pStyle w:val="Heading2"/>
         <w:spacing w:before="240" w:after="100"/>
       </w:pPr>
-      <w:bookmarkStart w:id="18" w:name="_Toc234829077"/>
+      <w:bookmarkStart w:id="18" w:name="_Toc234832459"/>
       <w:r>
         <w:t>3.10 Device defaults (device_defaults)</w:t>
       </w:r>
@@ -7577,7 +7549,7 @@
         <w:pStyle w:val="Heading2"/>
         <w:spacing w:before="240" w:after="100"/>
       </w:pPr>
-      <w:bookmarkStart w:id="19" w:name="_Toc234829078"/>
+      <w:bookmarkStart w:id="19" w:name="_Toc234832460"/>
       <w:r>
         <w:t>3.11 Device types (device_types)</w:t>
       </w:r>
@@ -7763,7 +7735,7 @@
         <w:pStyle w:val="Heading1"/>
         <w:spacing w:before="360" w:after="140"/>
       </w:pPr>
-      <w:bookmarkStart w:id="20" w:name="_Toc234829079"/>
+      <w:bookmarkStart w:id="20" w:name="_Toc234832461"/>
       <w:r>
         <w:t>4. System setup vs. device setup</w:t>
       </w:r>
@@ -7794,7 +7766,7 @@
         <w:pStyle w:val="Heading2"/>
         <w:spacing w:before="240" w:after="100"/>
       </w:pPr>
-      <w:bookmarkStart w:id="21" w:name="_Toc234829080"/>
+      <w:bookmarkStart w:id="21" w:name="_Toc234832462"/>
       <w:r>
         <w:t>4.1 How the app decides what is "system" and what is a "device"</w:t>
       </w:r>
@@ -8364,7 +8336,7 @@
         <w:pStyle w:val="Heading2"/>
         <w:spacing w:before="240" w:after="100"/>
       </w:pPr>
-      <w:bookmarkStart w:id="22" w:name="_Toc234829081"/>
+      <w:bookmarkStart w:id="22" w:name="_Toc234832463"/>
       <w:r>
         <w:t>4.2 Practical consequence for schema authoring</w:t>
       </w:r>
@@ -8531,7 +8503,7 @@
         <w:pStyle w:val="Heading2"/>
         <w:spacing w:before="240" w:after="100"/>
       </w:pPr>
-      <w:bookmarkStart w:id="23" w:name="_Toc234829082"/>
+      <w:bookmarkStart w:id="23" w:name="_Toc234832464"/>
       <w:r>
         <w:t>4.3 Controlling device count and tabs</w:t>
       </w:r>
@@ -8698,7 +8670,7 @@
         <w:pStyle w:val="Heading1"/>
         <w:spacing w:before="360" w:after="140"/>
       </w:pPr>
-      <w:bookmarkStart w:id="24" w:name="_Toc234829083"/>
+      <w:bookmarkStart w:id="24" w:name="_Toc234832465"/>
       <w:r>
         <w:t>5. Setting up key_map.json</w:t>
       </w:r>
@@ -8761,7 +8733,7 @@
         <w:pStyle w:val="Heading2"/>
         <w:spacing w:before="240" w:after="100"/>
       </w:pPr>
-      <w:bookmarkStart w:id="25" w:name="_Toc234829084"/>
+      <w:bookmarkStart w:id="25" w:name="_Toc234832466"/>
       <w:r>
         <w:t>5.1 Processing order</w:t>
       </w:r>
@@ -8910,7 +8882,7 @@
         <w:pStyle w:val="Heading2"/>
         <w:spacing w:before="240" w:after="100"/>
       </w:pPr>
-      <w:bookmarkStart w:id="26" w:name="_Toc234829085"/>
+      <w:bookmarkStart w:id="26" w:name="_Toc234832467"/>
       <w:r>
         <w:t>5.2 The rule groups</w:t>
       </w:r>
@@ -10870,7 +10842,7 @@
         <w:pStyle w:val="Heading1"/>
         <w:spacing w:before="360" w:after="140"/>
       </w:pPr>
-      <w:bookmarkStart w:id="27" w:name="_Toc234829086"/>
+      <w:bookmarkStart w:id="27" w:name="_Toc234832468"/>
       <w:r>
         <w:t>6. Putting it together: a setup checklist</w:t>
       </w:r>
@@ -10881,7 +10853,7 @@
         <w:pStyle w:val="Heading2"/>
         <w:spacing w:before="240" w:after="100"/>
       </w:pPr>
-      <w:bookmarkStart w:id="28" w:name="_Toc234829087"/>
+      <w:bookmarkStart w:id="28" w:name="_Toc234832469"/>
       <w:r>
         <w:t>6.1 First-run configuration</w:t>
       </w:r>
@@ -11046,7 +11018,7 @@
         <w:pStyle w:val="Heading2"/>
         <w:spacing w:before="240" w:after="100"/>
       </w:pPr>
-      <w:bookmarkStart w:id="29" w:name="_Toc234829088"/>
+      <w:bookmarkStart w:id="29" w:name="_Toc234832470"/>
       <w:r>
         <w:t>6.2 Adding support for a new config property</w:t>
       </w:r>
@@ -11250,7 +11222,7 @@
         <w:pStyle w:val="Heading2"/>
         <w:spacing w:before="240" w:after="100"/>
       </w:pPr>
-      <w:bookmarkStart w:id="30" w:name="_Toc234829089"/>
+      <w:bookmarkStart w:id="30" w:name="_Toc234832471"/>
       <w:r>
         <w:t>6.3 Quick reference: which file does what</w:t>
       </w:r>

</xml_diff>

<commit_message>
Update to clear some old files and update to the cost setup
</commit_message>
<xml_diff>
--- a/Room_Config_Builder_Guide.docx
+++ b/Room_Config_Builder_Guide.docx
@@ -2631,6 +2631,145 @@
       </w:pPr>
       <w:r>
         <w:t>devices with no control module, so a room isn't quoted as finished when part of it can't be driven</w:t>
+      </w:r>
+    </w:p>
+    <w:p>
+      <w:pPr>
+        <w:pStyle w:val="Heading3"/>
+      </w:pPr>
+      <w:r>
+        <w:t>Swapping a unit</w:t>
+      </w:r>
+    </w:p>
+    <w:p>
+      <w:r>
+        <w:t xml:space="preserve">The wrong box usually gets noticed here — the total is what people look at — so the fix is here too. The </w:t>
+      </w:r>
+      <w:r>
+        <w:rPr>
+          <w:b/>
+        </w:rPr>
+        <w:t>replace</w:t>
+      </w:r>
+      <w:r>
+        <w:t xml:space="preserve"> button on the right of an equipment row picks the new product out of the catalog and puts it everywhere the room records the old one:</w:t>
+      </w:r>
+    </w:p>
+    <w:p>
+      <w:pPr>
+        <w:pStyle w:val="ListBullet"/>
+      </w:pPr>
+      <w:r>
+        <w:rPr>
+          <w:b/>
+        </w:rPr>
+        <w:t>the cost line</w:t>
+      </w:r>
+      <w:r>
+        <w:t xml:space="preserve"> reprices off the new catalog entry</w:t>
+      </w:r>
+    </w:p>
+    <w:p>
+      <w:pPr>
+        <w:pStyle w:val="ListBullet"/>
+      </w:pPr>
+      <w:r>
+        <w:rPr>
+          <w:b/>
+        </w:rPr>
+        <w:t>the signal flow</w:t>
+      </w:r>
+      <w:r>
+        <w:t xml:space="preserve"> gets the new product under every box the line counts — connectors, rack height, power and heat — and the runs already drawn move onto the matching connectors</w:t>
+      </w:r>
+    </w:p>
+    <w:p>
+      <w:pPr>
+        <w:pStyle w:val="ListBullet"/>
+      </w:pPr>
+      <w:r>
+        <w:rPr>
+          <w:b/>
+        </w:rPr>
+        <w:t>the cabling schematic and cable schedule</w:t>
+      </w:r>
+      <w:r>
+        <w:t xml:space="preserve"> follow, because they're built from the flow rather than stored</w:t>
+      </w:r>
+    </w:p>
+    <w:p>
+      <w:pPr>
+        <w:pStyle w:val="ListBullet"/>
+      </w:pPr>
+      <w:r>
+        <w:rPr>
+          <w:b/>
+        </w:rPr>
+        <w:t>the control side</w:t>
+      </w:r>
+      <w:r>
+        <w:t xml:space="preserve"> — the config block the box came from — gets the model and the Python module that claims it</w:t>
+      </w:r>
+    </w:p>
+    <w:p>
+      <w:r>
+        <w:t>A line of quantity three swaps all three boxes and all three config blocks. Any price you had typed against the old model is cleared, because a figure negotiated for one product isn't the price of another.</w:t>
+      </w:r>
+    </w:p>
+    <w:p>
+      <w:r>
+        <w:t>It goes through silently when there's nothing to decide. It stops to ask when there is:</w:t>
+      </w:r>
+    </w:p>
+    <w:p>
+      <w:pPr>
+        <w:pStyle w:val="ListBullet"/>
+      </w:pPr>
+      <w:r>
+        <w:rPr>
+          <w:b/>
+        </w:rPr>
+        <w:t>no module claims the new model.</w:t>
+      </w:r>
+      <w:r>
+        <w:t xml:space="preserve"> You can still go ahead — a part often arrives before its driver does — but the config block keeps the module it has now, which no longer matches the model on it, so the warning says so. Set the module by hand on the </w:t>
+      </w:r>
+      <w:r>
+        <w:rPr>
+          <w:b/>
+        </w:rPr>
+        <w:t>Devices</w:t>
+      </w:r>
+      <w:r>
+        <w:t xml:space="preserve"> tab, or rename the model to one a driver claims.</w:t>
+      </w:r>
+    </w:p>
+    <w:p>
+      <w:pPr>
+        <w:pStyle w:val="ListBullet"/>
+      </w:pPr>
+      <w:r>
+        <w:rPr>
+          <w:b/>
+        </w:rPr>
+        <w:t>the module changes and this room's settings disagree with its defaults.</w:t>
+      </w:r>
+      <w:r>
+        <w:t xml:space="preserve"> The same question the Devices tab asks when you pick a model there, with the same two answers: keep the room's settings (the IP address and port are facts about the install) or apply the new module's defaults.</w:t>
+      </w:r>
+    </w:p>
+    <w:p>
+      <w:r>
+        <w:t xml:space="preserve">Cancel means nothing happened — you're asked before the first write. A run the new model has no connector for is removed rather than left pointing at nothing, and the message says how many, so you can draw them again on </w:t>
+      </w:r>
+      <w:r>
+        <w:rPr>
+          <w:b/>
+        </w:rPr>
+        <w:t>Signal Flow</w:t>
+      </w:r>
+      <w:r>
+        <w:t>.</w:t>
       </w:r>
     </w:p>
     <w:p>

</xml_diff>

<commit_message>
Update to show banner on device swap
</commit_message>
<xml_diff>
--- a/Room_Config_Builder_Guide.docx
+++ b/Room_Config_Builder_Guide.docx
@@ -1934,6 +1934,102 @@
         <w:pStyle w:val="Heading1"/>
       </w:pPr>
       <w:r>
+        <w:t>Devices</w:t>
+      </w:r>
+    </w:p>
+    <w:p>
+      <w:r>
+        <w:t xml:space="preserve">Each device gets a sub-tab: its model, how the processor reaches it, and the python module that drives it. </w:t>
+      </w:r>
+      <w:r>
+        <w:rPr>
+          <w:i/>
+        </w:rPr>
+        <w:t>Check Defaults</w:t>
+      </w:r>
+      <w:r>
+        <w:t xml:space="preserve"> tells you what a block is missing; </w:t>
+      </w:r>
+      <w:r>
+        <w:rPr>
+          <w:i/>
+        </w:rPr>
+        <w:t>Check Module Defaults</w:t>
+      </w:r>
+      <w:r>
+        <w:t xml:space="preserve"> tells you where it disagrees with the driver.</w:t>
+      </w:r>
+    </w:p>
+    <w:p>
+      <w:pPr>
+        <w:pStyle w:val="Heading2"/>
+      </w:pPr>
+      <w:r>
+        <w:t>When the model and the driver don't match</w:t>
+      </w:r>
+    </w:p>
+    <w:p>
+      <w:r>
+        <w:t xml:space="preserve">A device block names a product and names the driver that talks to it, and nothing used to keep the two together. Retype the model, or swap the box from the </w:t>
+      </w:r>
+      <w:r>
+        <w:rPr>
+          <w:b/>
+        </w:rPr>
+        <w:t>Cost</w:t>
+      </w:r>
+      <w:r>
+        <w:t xml:space="preserve"> tab, and the module underneath went on naming a driver for the product that used to be there — with every field filled in, so the block read as finished. That's the config nobody re-checks, and it commissions the room as a device the room doesn't contain.</w:t>
+      </w:r>
+    </w:p>
+    <w:p>
+      <w:r>
+        <w:t>A red banner now sits at the top of the device, above the two fields that fix it, in two cases:</w:t>
+      </w:r>
+    </w:p>
+    <w:p>
+      <w:pPr>
+        <w:pStyle w:val="ListBullet"/>
+      </w:pPr>
+      <w:r>
+        <w:rPr>
+          <w:b/>
+        </w:rPr>
+        <w:t>no python module is set</w:t>
+      </w:r>
+      <w:r>
+        <w:t xml:space="preserve"> for a model that has one — nothing can talk to the device, so the room won't commission</w:t>
+      </w:r>
+    </w:p>
+    <w:p>
+      <w:pPr>
+        <w:pStyle w:val="ListBullet"/>
+      </w:pPr>
+      <w:r>
+        <w:rPr>
+          <w:b/>
+        </w:rPr>
+        <w:t>the module is set, says which models it covers, and this isn't one of them</w:t>
+      </w:r>
+      <w:r>
+        <w:t xml:space="preserve"> — the banner names what that driver actually drives</w:t>
+      </w:r>
+    </w:p>
+    <w:p>
+      <w:r>
+        <w:t>Pick a module (or correct the model) and it clears. It's read from the config rather than remembered by the page, so it survives leaving the tab, saving, and reopening the room — and it's what a swap made on the Cost tab leaves behind.</w:t>
+      </w:r>
+    </w:p>
+    <w:p>
+      <w:r>
+        <w:t>It stays quiet where it can't know: a device with no model yet, a driver that never declared which models it covers, and a model the driver does list under a different capitalisation.</w:t>
+      </w:r>
+    </w:p>
+    <w:p>
+      <w:pPr>
+        <w:pStyle w:val="Heading1"/>
+      </w:pPr>
+      <w:r>
         <w:t>The drawings</w:t>
       </w:r>
     </w:p>
@@ -2732,7 +2828,7 @@
         <w:t>no module claims the new model.</w:t>
       </w:r>
       <w:r>
-        <w:t xml:space="preserve"> You can still go ahead — a part often arrives before its driver does — but the config block keeps the module it has now, which no longer matches the model on it, so the warning says so. Set the module by hand on the </w:t>
+        <w:t xml:space="preserve"> You can still go ahead — a part often arrives before its driver does — but the module is cleared off the config block rather than left naming a driver for the old box, and the device shows a red banner on the </w:t>
       </w:r>
       <w:r>
         <w:rPr>
@@ -2741,7 +2837,16 @@
         <w:t>Devices</w:t>
       </w:r>
       <w:r>
-        <w:t xml:space="preserve"> tab, or rename the model to one a driver claims.</w:t>
+        <w:t xml:space="preserve"> tab until somebody picks one. See </w:t>
+      </w:r>
+      <w:r>
+        <w:rPr>
+          <w:i/>
+        </w:rPr>
+        <w:t>When the model and the driver don't match</w:t>
+      </w:r>
+      <w:r>
+        <w:t>.</w:t>
       </w:r>
     </w:p>
     <w:p>

</xml_diff>

<commit_message>
Update to rename model when matching
</commit_message>
<xml_diff>
--- a/Room_Config_Builder_Guide.docx
+++ b/Room_Config_Builder_Guide.docx
@@ -2805,6 +2805,28 @@
       </w:r>
       <w:r>
         <w:t xml:space="preserve"> — the config block the box came from — gets the model and the Python module that claims it</w:t>
+      </w:r>
+    </w:p>
+    <w:p>
+      <w:pPr>
+        <w:pStyle w:val="ListBullet"/>
+      </w:pPr>
+      <w:r>
+        <w:rPr>
+          <w:b/>
+        </w:rPr>
+        <w:t>the name</w:t>
+      </w:r>
+      <w:r>
+        <w:t>, where the name was the product: "Projector 1 - PowerLite L630U" becomes "Projector 1 - PT-MZ682BU8". Only the model part moves — "Projector 1</w:t>
+      </w:r>
+    </w:p>
+    <w:p>
+      <w:pPr>
+        <w:pStyle w:val="ListBullet2"/>
+      </w:pPr>
+      <w:r>
+        <w:t>" is what the room calls that position, and the position hasn't changed — and a name that never mentioned the model is left alone</w:t>
       </w:r>
     </w:p>
     <w:p>

</xml_diff>

<commit_message>
Fix for mapping to device cose
</commit_message>
<xml_diff>
--- a/Room_Config_Builder_Guide.docx
+++ b/Room_Config_Builder_Guide.docx
@@ -1303,7 +1303,16 @@
         <w:t>/config.json</w:t>
       </w:r>
       <w:r>
-        <w:t xml:space="preserve"> over SFTP and asks where to keep the working copy.</w:t>
+        <w:t xml:space="preserve"> over SFTP and asks where to keep the working copy. The New Room dialog asks </w:t>
+      </w:r>
+      <w:r>
+        <w:rPr>
+          <w:b/>
+        </w:rPr>
+        <w:t>Start from the cost estimator</w:t>
+      </w:r>
+      <w:r>
+        <w:t xml:space="preserve"> first, because that's how a room actually starts: pick the devices out of the catalog with quantities and a running total, and they become the boxes on the signal flow, the gear in the racks and the lines on the estimate.</w:t>
       </w:r>
     </w:p>
     <w:p>
@@ -2734,6 +2743,140 @@
         <w:pStyle w:val="Heading3"/>
       </w:pPr>
       <w:r>
+        <w:t>Is it in the room config?</w:t>
+      </w:r>
+    </w:p>
+    <w:p>
+      <w:r>
+        <w:t>The estimate is where a room gets specified — parts picked with quantities and a total — and the control side is usually built weeks later. A line that never becomes a device block is a box that gets ordered, delivered, racked, and then has nothing to drive it.</w:t>
+      </w:r>
+    </w:p>
+    <w:p>
+      <w:r>
+        <w:t>So every equipment row carries a flag:</w:t>
+      </w:r>
+    </w:p>
+    <w:p>
+      <w:pPr>
+        <w:pStyle w:val="ListBullet"/>
+      </w:pPr>
+      <w:r>
+        <w:rPr>
+          <w:b/>
+        </w:rPr>
+        <w:t>orange flag</w:t>
+      </w:r>
+      <w:r>
+        <w:t xml:space="preserve"> — quoted, and the room config has never heard of it. The flag is also the button: </w:t>
+      </w:r>
+      <w:r>
+        <w:rPr>
+          <w:i/>
+        </w:rPr>
+        <w:t>Add to the room config</w:t>
+      </w:r>
+      <w:r>
+        <w:t xml:space="preserve"> creates the device block for its family with this room's defaults and the driver that claims the model. A line typed here becomes boxes on the diagram first (one per unit), because a device has to exist before it can have a block — so the cost line is replaced by the drawn devices it was quoting.</w:t>
+      </w:r>
+    </w:p>
+    <w:p>
+      <w:pPr>
+        <w:pStyle w:val="ListBullet"/>
+      </w:pPr>
+      <w:r>
+        <w:rPr>
+          <w:b/>
+        </w:rPr>
+        <w:t>a tick</w:t>
+      </w:r>
+      <w:r>
+        <w:t xml:space="preserve"> — it's in the config, and the tooltip names the block.</w:t>
+      </w:r>
+    </w:p>
+    <w:p>
+      <w:pPr>
+        <w:pStyle w:val="ListBullet"/>
+      </w:pPr>
+      <w:r>
+        <w:rPr>
+          <w:b/>
+        </w:rPr>
+        <w:t>a box icon</w:t>
+      </w:r>
+      <w:r>
+        <w:t xml:space="preserve"> — marked as a </w:t>
+      </w:r>
+      <w:r>
+        <w:rPr>
+          <w:b/>
+        </w:rPr>
+        <w:t>spare</w:t>
+      </w:r>
+      <w:r>
+        <w:t>: bought for the shelf on purpose, not part of the room's system. It stays on the quote and stops being flagged. Without this, half a quote is permanently flagged and the flag becomes wallpaper.</w:t>
+      </w:r>
+    </w:p>
+    <w:p>
+      <w:r>
+        <w:t>A hand-typed line with no catalog part behind it can't go in — there's nothing to build a device from. Add it to the catalog first with the library button on the same row.</w:t>
+      </w:r>
+    </w:p>
+    <w:p>
+      <w:pPr>
+        <w:pStyle w:val="Heading3"/>
+      </w:pPr>
+      <w:r>
+        <w:t>Base costs for cable</w:t>
+      </w:r>
+    </w:p>
+    <w:p>
+      <w:r>
+        <w:t>Cable is the hole in every early estimate: the runs are counted off the diagram exactly, then priced at nothing, because the catalog ships made-up leads for a handful of types while a real order is "a 25 ft HDMI and a 50 ft HDMI".</w:t>
+      </w:r>
+    </w:p>
+    <w:p>
+      <w:r>
+        <w:t xml:space="preserve">The </w:t>
+      </w:r>
+      <w:r>
+        <w:rPr>
+          <w:b/>
+        </w:rPr>
+        <w:t>price tag</w:t>
+      </w:r>
+      <w:r>
+        <w:t xml:space="preserve"> button on a cabling row puts the shop's typical figure for that type and length on the base-cost card — </w:t>
+      </w:r>
+      <w:r>
+        <w:rPr>
+          <w:rFonts w:ascii="Consolas" w:hAnsi="Consolas"/>
+          <w:sz w:val="20"/>
+        </w:rPr>
+        <w:t>base_costs.json</w:t>
+      </w:r>
+      <w:r>
+        <w:t xml:space="preserve">, the same file the device figures live in, read by every room. Enter it once and every estimate prices that length off it. A price typed on the room still wins, and a line costed this way is marked </w:t>
+      </w:r>
+      <w:r>
+        <w:rPr>
+          <w:i/>
+        </w:rPr>
+        <w:t>Base cost</w:t>
+      </w:r>
+      <w:r>
+        <w:t xml:space="preserve"> and counts towards the estimate being a budget rather than a quote.</w:t>
+      </w:r>
+    </w:p>
+    <w:p>
+      <w:r>
+        <w:t>A figure entered against a type with no length ("Cable: HDMI") covers every length that hasn't got one of its own.</w:t>
+      </w:r>
+    </w:p>
+    <w:p>
+      <w:pPr>
+        <w:pStyle w:val="Heading3"/>
+      </w:pPr>
+      <w:r>
         <w:t>Swapping a unit</w:t>
       </w:r>
     </w:p>
@@ -2836,6 +2979,26 @@
     </w:p>
     <w:p>
       <w:r>
+        <w:rPr>
+          <w:b/>
+        </w:rPr>
+        <w:t>It works in both directions.</w:t>
+      </w:r>
+      <w:r>
+        <w:t xml:space="preserve"> Picking a model on the </w:t>
+      </w:r>
+      <w:r>
+        <w:rPr>
+          <w:b/>
+        </w:rPr>
+        <w:t>Devices</w:t>
+      </w:r>
+      <w:r>
+        <w:t xml:space="preserve"> tab moves the same room: the drawn box becomes that product — connectors and all, where the AV catalog knows the model — the name follows, and the estimate reprices, because the estimate counts the boxes on the diagram.</w:t>
+      </w:r>
+    </w:p>
+    <w:p>
+      <w:r>
         <w:t>It goes through silently when there's nothing to decide. It stops to ask when there is:</w:t>
       </w:r>
     </w:p>
@@ -2910,6 +3073,17 @@
     <w:p>
       <w:r>
         <w:t>The catalog is the department's price list and connector reference: per model, what sockets it has, how many rack units, what it draws, what it costs.</w:t>
+      </w:r>
+    </w:p>
+    <w:p>
+      <w:r>
+        <w:rPr>
+          <w:b/>
+        </w:rPr>
+        <w:t>Searching</w:t>
+      </w:r>
+      <w:r>
+        <w:t xml:space="preserve"> ignores spaces, dashes and case on both sides, so "dtpcross108" finds "DTP CrossPoint 108". Type more than one word and every word has to land somewhere on the entry — the model, the maker, the part number or the category — in any order: "Epson PowerLite" finds the PowerLite projectors, even though no single field holds those two words next to each other. Adding words still narrows the list.</w:t>
       </w:r>
     </w:p>
     <w:p>

</xml_diff>

<commit_message>
Update to cost estimator
</commit_message>
<xml_diff>
--- a/Room_Config_Builder_Guide.docx
+++ b/Room_Config_Builder_Guide.docx
@@ -2743,6 +2743,87 @@
         <w:pStyle w:val="Heading3"/>
       </w:pPr>
       <w:r>
+        <w:t>Spares</w:t>
+      </w:r>
+    </w:p>
+    <w:p>
+      <w:r>
+        <w:t xml:space="preserve">Equipment rows read </w:t>
+      </w:r>
+      <w:r>
+        <w:rPr>
+          <w:b/>
+        </w:rPr>
+        <w:t>Qty · Spares · Total</w:t>
+      </w:r>
+      <w:r>
+        <w:t>, the same three the cabling table has and for the same reason. The drawing says how many the room has; a job often buys one more than that, and the spare is real money no drawing will ever account for.</w:t>
+      </w:r>
+    </w:p>
+    <w:p>
+      <w:r>
+        <w:t xml:space="preserve">Type it in the </w:t>
+      </w:r>
+      <w:r>
+        <w:rPr>
+          <w:b/>
+        </w:rPr>
+        <w:t>Spares</w:t>
+      </w:r>
+      <w:r>
+        <w:t xml:space="preserve"> box on the line itself rather than adding a second line. It's the same product at the same price, and splitting it out is how a quote ends up with two prices for one box — and how the spare gets left behind when somebody swaps the model. The reports print the split ("3 drawn + 1 spare") so the count never reads as a mistake.</w:t>
+      </w:r>
+    </w:p>
+    <w:p>
+      <w:r>
+        <w:t>A line you added on this page already has an editable quantity of its own, so it has no spares box — two boxes meaning the same thing on one row is how a number gets typed into the wrong one.</w:t>
+      </w:r>
+    </w:p>
+    <w:p>
+      <w:pPr>
+        <w:pStyle w:val="Heading3"/>
+      </w:pPr>
+      <w:r>
+        <w:t>Editing a part without leaving the page</w:t>
+      </w:r>
+    </w:p>
+    <w:p>
+      <w:r>
+        <w:t xml:space="preserve">A price rise, a part number somebody finally found, a rack height that was guessed — all of that gets noticed while looking at a quote. The </w:t>
+      </w:r>
+      <w:r>
+        <w:rPr>
+          <w:b/>
+        </w:rPr>
+        <w:t>edit</w:t>
+      </w:r>
+      <w:r>
+        <w:t xml:space="preserve"> button on a row that's priced from the catalog opens that entry, filled in, and saves it back to the catalog file, so the correction reaches every room that quotes the part rather than just this one. A row with no entry behind it still offers </w:t>
+      </w:r>
+      <w:r>
+        <w:rPr>
+          <w:b/>
+        </w:rPr>
+        <w:t>add</w:t>
+      </w:r>
+      <w:r>
+        <w:t xml:space="preserve"> instead. Connectors are left alone — those are edited on the </w:t>
+      </w:r>
+      <w:r>
+        <w:rPr>
+          <w:b/>
+        </w:rPr>
+        <w:t>Catalog</w:t>
+      </w:r>
+      <w:r>
+        <w:t xml:space="preserve"> tab.</w:t>
+      </w:r>
+    </w:p>
+    <w:p>
+      <w:pPr>
+        <w:pStyle w:val="Heading3"/>
+      </w:pPr>
+      <w:r>
         <w:t>Is it in the room config?</w:t>
       </w:r>
     </w:p>
@@ -2845,7 +2926,7 @@
         <w:t>is</w:t>
       </w:r>
       <w:r>
-        <w:t xml:space="preserve"> in the room and on the diagram, and the processor has no business talking to it. The building's network switch, a codec another department manages, an owner-furnished display, a passive splitter. It stays exactly as it was — drawn, selectable, cabled, racked and priced — and drops off every "missing from the config" list: the flag here, the control-side prefill, and the missing-module report. The same checkbox is on the box's own editor on </w:t>
+        <w:t xml:space="preserve"> in the room, and the processor has no business talking to it. Available on a drawn box and on a line quoted here, because an owner-furnished display is usually quoted before anybody draws it. The building's network switch, a codec another department manages, an owner-furnished display, a passive splitter. It stays exactly as it was — drawn, selectable, cabled, racked and priced — and drops off every "missing from the config" list: the flag here, the control-side prefill, and the missing-module report. The same checkbox is on the box's own editor on </w:t>
       </w:r>
       <w:r>
         <w:rPr>

</xml_diff>

<commit_message>
Add module editor and change the view for the life cycle replacement
</commit_message>
<xml_diff>
--- a/Room_Config_Builder_Guide.docx
+++ b/Room_Config_Builder_Guide.docx
@@ -732,7 +732,7 @@
               <w:t>SYSTEM_SETUP</w:t>
             </w:r>
             <w:r>
-              <w:t>: switcher inputs and outputs, panel behaviour, outlet names.</w:t>
+              <w:t>: switcher inputs and outputs, panel behavior, outlet names.</w:t>
             </w:r>
           </w:p>
         </w:tc>
@@ -2196,7 +2196,115 @@
     </w:p>
     <w:p>
       <w:r>
-        <w:t>It stays quiet where it can't know: a device with no model yet, a driver that never declared which models it covers, and a model the driver does list under a different capitalisation.</w:t>
+        <w:t>It stays quiet where it can't know: a device with no model yet, a driver that never declared which models it covers, and a model the driver does list under a different capitalization.</w:t>
+      </w:r>
+    </w:p>
+    <w:p>
+      <w:pPr>
+        <w:pStyle w:val="Heading2"/>
+      </w:pPr>
+      <w:r>
+        <w:t>A driver that lists no models</w:t>
+      </w:r>
+    </w:p>
+    <w:p>
+      <w:r>
+        <w:t xml:space="preserve">"A driver that never declared which models it covers" is worth its own section, because it's the quietest fault in the app. At the top of each python driver is a short block - </w:t>
+      </w:r>
+      <w:r>
+        <w:rPr>
+          <w:rFonts w:ascii="Consolas" w:hAnsi="Consolas"/>
+          <w:sz w:val="20"/>
+        </w:rPr>
+        <w:t>DEVICE_INFO</w:t>
+      </w:r>
+      <w:r>
+        <w:t xml:space="preserve"> - naming the models it drives, the kind of equipment they are, and how the box is reached. That block is where the Model dropdown comes from, what picking a model fills a device in with, and what </w:t>
+      </w:r>
+      <w:r>
+        <w:rPr>
+          <w:i/>
+        </w:rPr>
+        <w:t>Check Module Defaults</w:t>
+      </w:r>
+      <w:r>
+        <w:t xml:space="preserve"> measures a room against.</w:t>
+      </w:r>
+    </w:p>
+    <w:p>
+      <w:r>
+        <w:t>A driver without one still loads and still answers. Its products simply never appear anywhere, which looks exactly like the app not supporting them.</w:t>
+      </w:r>
+    </w:p>
+    <w:p>
+      <w:r>
+        <w:rPr>
+          <w:b/>
+        </w:rPr>
+        <w:t>App Config -&gt; What each driver declares...</w:t>
+      </w:r>
+      <w:r>
+        <w:t xml:space="preserve"> (also on the Devices tab, beside the module box) lists every driver the app has read and marks the ones with no block.</w:t>
+      </w:r>
+    </w:p>
+    <w:p>
+      <w:pPr>
+        <w:pStyle w:val="ListBullet"/>
+      </w:pPr>
+      <w:r>
+        <w:rPr>
+          <w:b/>
+        </w:rPr>
+        <w:t>Read the file</w:t>
+      </w:r>
+      <w:r>
+        <w:t xml:space="preserve"> fills the form in from what the driver actually says about itself: the models out of its own </w:t>
+      </w:r>
+      <w:r>
+        <w:rPr>
+          <w:rFonts w:ascii="Consolas" w:hAnsi="Consolas"/>
+          <w:sz w:val="20"/>
+        </w:rPr>
+        <w:t>self.Models</w:t>
+      </w:r>
+      <w:r>
+        <w:t xml:space="preserve"> dict, and the baud rate, protocol and connection styles out of the wrapper classes at the bottom of it. Anything already typed in is left alone, so it's safe to press on a half-finished block.</w:t>
+      </w:r>
+    </w:p>
+    <w:p>
+      <w:pPr>
+        <w:pStyle w:val="ListBullet"/>
+      </w:pPr>
+      <w:r>
+        <w:rPr>
+          <w:b/>
+        </w:rPr>
+        <w:t>The one thing a driver can never say is its network port.</w:t>
+      </w:r>
+      <w:r>
+        <w:t xml:space="preserve"> Every driver is told which port to use rather than declaring one, so the port is left blank and has to come off the manufacturer's communication sheet. The rest of the blanks are site facts - an address, a COM port, a password - and are left for the room.</w:t>
+      </w:r>
+    </w:p>
+    <w:p>
+      <w:pPr>
+        <w:pStyle w:val="ListBullet"/>
+      </w:pPr>
+      <w:r>
+        <w:t>Panel object names, the keep-alive and the credentials are seeded from what every other driver of that family in the folder already uses, and the keep-alive is checked against the commands this driver actually has.</w:t>
+      </w:r>
+    </w:p>
+    <w:p>
+      <w:pPr>
+        <w:pStyle w:val="ListBullet"/>
+      </w:pPr>
+      <w:r>
+        <w:rPr>
+          <w:b/>
+        </w:rPr>
+        <w:t>Save to the .py</w:t>
+      </w:r>
+      <w:r>
+        <w:t xml:space="preserve"> shows the exact python first. Only that one block in the file is touched, and the whole folder is re-read afterwards, so the Model dropdown is looking at the file as it is now.</w:t>
       </w:r>
     </w:p>
     <w:p>
@@ -2228,7 +2336,7 @@
     </w:p>
     <w:p>
       <w:r>
-        <w:t>It draws itself from the config every time you open it. Network devices go to a Network IDF box and up to the processor; serial devices get a direct line labelled with their COM port; relay-controlled screens get a relay line; the touch panel is drawn as a window with one tab per GUI page. Each kind of connection has its own colour, and the legend under the drawing explains them.</w:t>
+        <w:t>It draws itself from the config every time you open it. Network devices go to a Network IDF box and up to the processor; serial devices get a direct line labeled with their COM port; relay-controlled screens get a relay line; the touch panel is drawn as a window with one tab per GUI page. Each kind of connection has its own color, and the legend under the drawing explains them.</w:t>
       </w:r>
     </w:p>
     <w:p>
@@ -2319,7 +2427,7 @@
         <w:rPr>
           <w:b/>
         </w:rPr>
-        <w:t>colours</w:t>
+        <w:t>colors</w:t>
       </w:r>
       <w:r>
         <w:t xml:space="preserve"> (they have their own </w:t>
@@ -2906,7 +3014,7 @@
         <w:rPr>
           <w:i/>
         </w:rPr>
-        <w:t>"No input on the switcher is labelled 7"</w:t>
+        <w:t>"No input on the switcher is labeled 7"</w:t>
       </w:r>
       <w:r>
         <w:t xml:space="preserve"> - the number doesn't match any connector on that model. Usually the catalog entry needs its connectors correcting.</w:t>
@@ -4279,7 +4387,7 @@
           <w:p>
             <w:r/>
             <w:r>
-              <w:t>Nothing has gone out. No chip on the card - a row of grey "not sent" chips down a fresh list is noise about nothing.</w:t>
+              <w:t>Nothing has gone out. No chip on the card - a row of gray "not sent" chips down a fresh list is noise about nothing.</w:t>
             </w:r>
           </w:p>
         </w:tc>
@@ -4767,7 +4875,7 @@
         <w:t>one line</w:t>
       </w:r>
       <w:r>
-        <w:t>: today, the first order, every order date as a dot, each phase's on-site day, each vendor's quote request in that vendor's own colour, and the delivery deadline.</w:t>
+        <w:t>: today, the first order, every order date as a dot, each phase's on-site day, each vendor's quote request in that vendor's own color, and the delivery deadline.</w:t>
       </w:r>
     </w:p>
     <w:p>
@@ -4875,7 +4983,7 @@
         <w:rPr>
           <w:b/>
         </w:rPr>
-        <w:t>own colour</w:t>
+        <w:t>own color</w:t>
       </w:r>
       <w:r>
         <w:t xml:space="preserve">, the same one wherever its name appears, so one contractor's share of the sheet is visible without reading a cell. A line nobody has been named on reads </w:t>
@@ -4887,7 +4995,7 @@
         <w:t>NOBODY</w:t>
       </w:r>
       <w:r>
-        <w:t xml:space="preserve"> in the error colour - a blank is the exact thing this sheet exists to catch, and the tinted chips around it would otherwise make an empty cell look like one more quiet agreement.</w:t>
+        <w:t xml:space="preserve"> in the error color - a blank is the exact thing this sheet exists to catch, and the tinted chips around it would otherwise make an empty cell look like one more quiet agreement.</w:t>
       </w:r>
     </w:p>
     <w:p>
@@ -4906,7 +5014,7 @@
     </w:p>
     <w:p>
       <w:r>
-        <w:t>The scope headings size themselves to the names they actually carry, so a line called "Conduit, back boxes and pull strings for every floor-mounted connectivity point" is read rather than ellipsised. The sheet zooms and fits like the year grid, and columns are re-ordered by dragging the grip in the heading - the order is content on this document, because it is grouped the way the work is sequenced.</w:t>
+        <w:t>The scope headings size themselves to the names they actually carry, so a line called "Conduit, back boxes and pull strings for every floor-mounted connectivity point" is read rather than ellipsized. The sheet zooms and fits like the year grid, and columns are re-ordered by dragging the grip in the heading - the order is content on this document, because it is grouped the way the work is sequenced.</w:t>
       </w:r>
     </w:p>
     <w:p>
@@ -6388,7 +6496,7 @@
         <w:t>where the thing is</w:t>
       </w:r>
       <w:r>
-        <w:t>, as a path through the app rather than a position on a screen, then what it does and why it works that way. The text is selectable, because half of what help gets used for is pasting a sentence into an email to whoever asked. The keyword chips at the foot of a page are a press each, which is how somebody gets from one feature to its neighbours without knowing what they are called.</w:t>
+        <w:t>, as a path through the app rather than a position on a screen, then what it does and why it works that way. The text is selectable, because half of what help gets used for is pasting a sentence into an email to whoever asked. The keyword chips at the foot of a page are a press each, which is how somebody gets from one feature to its neighbors without knowing what they are called.</w:t>
       </w:r>
     </w:p>
     <w:p>
@@ -6482,7 +6590,7 @@
         <w:pStyle w:val="ListBullet"/>
       </w:pPr>
       <w:r>
-        <w:t>an outlet labelled "Switch" is the matrix, not the USB switcher</w:t>
+        <w:t>an outlet labeled "Switch" is the matrix, not the USB switcher</w:t>
       </w:r>
     </w:p>
     <w:p>
@@ -7681,7 +7789,7 @@
         <w:rPr>
           <w:b/>
         </w:rPr>
-        <w:t>You want the old behaviour back.</w:t>
+        <w:t>You want the old behavior back.</w:t>
       </w:r>
       <w:r>
         <w:t xml:space="preserve"> </w:t>
@@ -8153,7 +8261,7 @@
           <w:p>
             <w:r/>
             <w:r>
-              <w:t>Small grey text under the field.</w:t>
+              <w:t>Small gray text under the field.</w:t>
             </w:r>
           </w:p>
         </w:tc>
@@ -9011,7 +9119,7 @@
         <w:t>fields</w:t>
       </w:r>
       <w:r>
-        <w:t xml:space="preserve"> is the only part it must have; everything else is optional, and a part you leave out keeps the app's built-in behaviour.</w:t>
+        <w:t xml:space="preserve"> is the only part it must have; everything else is optional, and a part you leave out keeps the app's built-in behavior.</w:t>
       </w:r>
     </w:p>
     <w:p>
@@ -9247,7 +9355,7 @@
           <w:rFonts w:ascii="Consolas" w:hAnsi="Consolas"/>
           <w:sz w:val="19"/>
         </w:rPr>
-        <w:t xml:space="preserve">  "helperText": "Small grey hint under the field.",</w:t>
+        <w:t xml:space="preserve">  "helperText": "Small gray hint under the field.",</w:t>
       </w:r>
     </w:p>
     <w:p>
@@ -9451,7 +9559,7 @@
           <w:p>
             <w:r/>
             <w:r>
-              <w:t>Grey hint under the field.</w:t>
+              <w:t>Gray hint under the field.</w:t>
             </w:r>
           </w:p>
         </w:tc>

</xml_diff>

<commit_message>
Update help documentation for the program
</commit_message>
<xml_diff>
--- a/Room_Config_Builder_Guide.docx
+++ b/Room_Config_Builder_Guide.docx
@@ -5731,6 +5731,134 @@
       </w:r>
       <w:r>
         <w:t xml:space="preserve"> year it owes something in rather than only in the first. The sheet zooms and fits, because it is read both for a figure and for its shape.</w:t>
+      </w:r>
+    </w:p>
+    <w:p>
+      <w:pPr>
+        <w:pStyle w:val="Heading2"/>
+      </w:pPr>
+      <w:r>
+        <w:t>The line under the grid, and what to set aside</w:t>
+      </w:r>
+    </w:p>
+    <w:p>
+      <w:r>
+        <w:t xml:space="preserve">The grid says which year and how much. It cannot show a </w:t>
+      </w:r>
+      <w:r>
+        <w:rPr>
+          <w:b/>
+        </w:rPr>
+        <w:t>shape</w:t>
+      </w:r>
+      <w:r>
+        <w:t xml:space="preserve"> - forty rows of cells have to be read across before the one bad year in them is visible - so the same figures are drawn as a line under it, on all three screens: a room, a building and the estate. Hover any point and it names what is in that year.</w:t>
+      </w:r>
+    </w:p>
+    <w:p>
+      <w:r>
+        <w:t xml:space="preserve">The dashed line across it is the other half of the question. A refresh plan is a demand curve, and a demand curve with one bad year in it is the reason phasing exists, so the chart also draws what the </w:t>
+      </w:r>
+      <w:r>
+        <w:rPr>
+          <w:b/>
+        </w:rPr>
+        <w:t>same plan</w:t>
+      </w:r>
+      <w:r>
+        <w:t xml:space="preserve"> would cost every year if the peaks were pushed off and the whole of it spread evenly from today to the end of the plan. The gap between the spike and the flat line is the size of the deferral being argued about.</w:t>
+      </w:r>
+    </w:p>
+    <w:p>
+      <w:r>
+        <w:t xml:space="preserve">That flat figure is printed beside the totals as </w:t>
+      </w:r>
+      <w:r>
+        <w:rPr>
+          <w:b/>
+        </w:rPr>
+        <w:t>to set aside each year</w:t>
+      </w:r>
+      <w:r>
+        <w:t xml:space="preserve">. It is the one number on the sheet somebody writes down: not "what does the refresh cost" but "what should we be saving". It is worked out over the years still </w:t>
+      </w:r>
+      <w:r>
+        <w:rPr>
+          <w:b/>
+        </w:rPr>
+        <w:t>ahead</w:t>
+      </w:r>
+      <w:r>
+        <w:t xml:space="preserve"> - dividing a plan by twenty years when twelve of them are already gone produces a comfortable figure nobody can spend to.</w:t>
+      </w:r>
+    </w:p>
+    <w:p>
+      <w:r>
+        <w:t>Both the line and the figure are on the picture, so a sheet handed to a budget meeting carries the shape and the ask rather than a grid of cells somebody has to add up.</w:t>
+      </w:r>
+    </w:p>
+    <w:p>
+      <w:pPr>
+        <w:pStyle w:val="Heading2"/>
+      </w:pPr>
+      <w:r>
+        <w:t>Modelling a different cycle</w:t>
+      </w:r>
+    </w:p>
+    <w:p>
+      <w:r>
+        <w:t>"What if we did every room at ten years" is the question every capital planning meeting asks, and answering it by editing the life on forty rooms is not a what-if - it is a rewrite with no way back.</w:t>
+      </w:r>
+    </w:p>
+    <w:p>
+      <w:r>
+        <w:t xml:space="preserve">So the plan is </w:t>
+      </w:r>
+      <w:r>
+        <w:rPr>
+          <w:b/>
+        </w:rPr>
+        <w:t>restated</w:t>
+      </w:r>
+      <w:r>
+        <w:t xml:space="preserve"> instead. The </w:t>
+      </w:r>
+      <w:r>
+        <w:rPr>
+          <w:b/>
+        </w:rPr>
+        <w:t>Cycle</w:t>
+      </w:r>
+      <w:r>
+        <w:t xml:space="preserve"> picker on the sheet's own header row rebuilds every grid, chart, picture and spreadsheet as though everything were on the cycle you asked for, whatever life is recorded against it. It offers six common cycles and </w:t>
+      </w:r>
+      <w:r>
+        <w:rPr>
+          <w:b/>
+        </w:rPr>
+        <w:t>Type a year...</w:t>
+      </w:r>
+      <w:r>
+        <w:t>, which takes any number of years up to 60 - a department funding a nine-year rotation asks for nine rather than picking the nearest entry on somebody else's list.</w:t>
+      </w:r>
+    </w:p>
+    <w:p>
+      <w:r>
+        <w:t>One setting, three screens: a room, its building and the estate are the same question at three sizes, so a cycle picked on one is the cycle the others read at.</w:t>
+      </w:r>
+    </w:p>
+    <w:p>
+      <w:r>
+        <w:t xml:space="preserve">Nothing is written anywhere. A note above the sheet says what is being assumed and what it moved, anything exported while it is on says so on its face, and </w:t>
+      </w:r>
+      <w:r>
+        <w:rPr>
+          <w:b/>
+        </w:rPr>
+        <w:t>As recorded</w:t>
+      </w:r>
+      <w:r>
+        <w:t xml:space="preserve"> puts the plan back in one press. One thing is never restated: a position somebody has taken off the refresh cycle stays off it - that is a statement that the bracket is not on the plan at all, not a life figure to be argued with.</w:t>
       </w:r>
     </w:p>
     <w:p>

</xml_diff>

<commit_message>
Add module editor and recent files menu
</commit_message>
<xml_diff>
--- a/Room_Config_Builder_Guide.docx
+++ b/Room_Config_Builder_Guide.docx
@@ -1796,6 +1796,95 @@
       </w:pPr>
       <w:r>
         <w:t>Opening, converting and saving</w:t>
+      </w:r>
+    </w:p>
+    <w:p>
+      <w:pPr>
+        <w:pStyle w:val="Heading2"/>
+      </w:pPr>
+      <w:r>
+        <w:t>Getting back to a file you had open</w:t>
+      </w:r>
+    </w:p>
+    <w:p>
+      <w:r>
+        <w:t xml:space="preserve">The app remembers the last ten rooms, the last ten jobs and the last ten campuses it opened or saved. They are on the </w:t>
+      </w:r>
+      <w:r>
+        <w:rPr>
+          <w:b/>
+        </w:rPr>
+        <w:t>Open Recent</w:t>
+      </w:r>
+      <w:r>
+        <w:t xml:space="preserve"> menu beside Open in the title bar, and on the start screen under the Open button.</w:t>
+      </w:r>
+    </w:p>
+    <w:p>
+      <w:r>
+        <w:t xml:space="preserve">Three lists, not one: a room, a job and a campus all live as </w:t>
+      </w:r>
+      <w:r>
+        <w:rPr>
+          <w:rFonts w:ascii="Consolas" w:hAnsi="Consolas"/>
+          <w:sz w:val="20"/>
+        </w:rPr>
+        <w:t>.json</w:t>
+      </w:r>
+      <w:r>
+        <w:t xml:space="preserve"> files in the same folders, and one mixed list of thirty is a list you have to read rather than glance at. Each kind keeps its own ten, headed and most recent first.</w:t>
+      </w:r>
+    </w:p>
+    <w:p>
+      <w:r>
+        <w:t>Every open counts, not just the ones that went through the file dialog - a room reached from the Project tab lands on the list the same way as one picked by hand. An entry is a pointer, never a copy, so choosing one re-reads the file off disk exactly as Open would.</w:t>
+      </w:r>
+    </w:p>
+    <w:p>
+      <w:r>
+        <w:t xml:space="preserve">Saving counts too, because half the documents here are never opened at all: a room comes out of the wizard, a job out of New Project, an estate out of a list you assembled by hand. Each of those goes on the list the first time it is written, and a </w:t>
+      </w:r>
+      <w:r>
+        <w:rPr>
+          <w:i/>
+        </w:rPr>
+        <w:t>Save As</w:t>
+      </w:r>
+      <w:r>
+        <w:t xml:space="preserve"> moves the entry to the file you are now working from. The one exception is </w:t>
+      </w:r>
+      <w:r>
+        <w:rPr>
+          <w:i/>
+        </w:rPr>
+        <w:t>Save All to a room folder</w:t>
+      </w:r>
+      <w:r>
+        <w:t xml:space="preserve"> - that walks every room of the job on your behalf, and nine rooms swept through in one press would push a week of real work off the list, so the walk is not recorded.</w:t>
+      </w:r>
+    </w:p>
+    <w:p>
+      <w:r>
+        <w:t xml:space="preserve">A file that has been moved, renamed or archived stays on the list, drawn struck through; choosing it offers to drop the line rather than pretending it opened. </w:t>
+      </w:r>
+      <w:r>
+        <w:rPr>
+          <w:i/>
+        </w:rPr>
+        <w:t>Clear the list</w:t>
+      </w:r>
+      <w:r>
+        <w:t xml:space="preserve"> forgets all of them and touches no file. The lists are kept in </w:t>
+      </w:r>
+      <w:r>
+        <w:rPr>
+          <w:rFonts w:ascii="Consolas" w:hAnsi="Consolas"/>
+          <w:sz w:val="20"/>
+        </w:rPr>
+        <w:t>app_config.json</w:t>
+      </w:r>
+      <w:r>
+        <w:t xml:space="preserve"> with the rest of your settings, so they survive an update.</w:t>
       </w:r>
     </w:p>
     <w:p>

</xml_diff>